<commit_message>
feat: motor de atribuição automática, integração de webhooks n8n e documentação v1.2.0
</commit_message>
<xml_diff>
--- a/Documentação/Documentação Ecossistema.docx
+++ b/Documentação/Documentação Ecossistema.docx
@@ -1906,7 +1906,7 @@
           <w:u w:val="single"/>
         </w:rPr>
         <w:pict w14:anchorId="1E767453">
-          <v:rect id="_x0000_i1051" style="width:0;height:1.5pt" o:hralign="center" o:hrstd="t" o:hr="t" fillcolor="#a0a0a0" stroked="f"/>
+          <v:rect id="_x0000_i1027" style="width:0;height:1.5pt" o:hralign="center" o:hrstd="t" o:hr="t" fillcolor="#a0a0a0" stroked="f"/>
         </w:pict>
       </w:r>
     </w:p>
@@ -2664,7 +2664,7 @@
           <w:u w:val="single"/>
         </w:rPr>
         <w:pict w14:anchorId="415945E8">
-          <v:rect id="_x0000_i1052" style="width:0;height:1.5pt" o:hralign="center" o:hrstd="t" o:hr="t" fillcolor="#a0a0a0" stroked="f"/>
+          <v:rect id="_x0000_i1028" style="width:0;height:1.5pt" o:hralign="center" o:hrstd="t" o:hr="t" fillcolor="#a0a0a0" stroked="f"/>
         </w:pict>
       </w:r>
     </w:p>
@@ -2954,7 +2954,7 @@
           <w:u w:val="single"/>
         </w:rPr>
         <w:pict w14:anchorId="18DBA023">
-          <v:rect id="_x0000_i1053" style="width:0;height:1.5pt" o:hralign="center" o:hrstd="t" o:hr="t" fillcolor="#a0a0a0" stroked="f"/>
+          <v:rect id="_x0000_i1029" style="width:0;height:1.5pt" o:hralign="center" o:hrstd="t" o:hr="t" fillcolor="#a0a0a0" stroked="f"/>
         </w:pict>
       </w:r>
     </w:p>
@@ -3251,7 +3251,7 @@
           <w:u w:val="single"/>
         </w:rPr>
         <w:pict w14:anchorId="3C9B23CD">
-          <v:rect id="_x0000_i1054" style="width:0;height:1.5pt" o:hralign="center" o:hrstd="t" o:hr="t" fillcolor="#a0a0a0" stroked="f"/>
+          <v:rect id="_x0000_i1030" style="width:0;height:1.5pt" o:hralign="center" o:hrstd="t" o:hr="t" fillcolor="#a0a0a0" stroked="f"/>
         </w:pict>
       </w:r>
     </w:p>
@@ -3412,7 +3412,778 @@
         <w:t>? O leme está nas suas mãos!</w:t>
       </w:r>
     </w:p>
-    <w:p/>
+    <w:p>
+      <w:pPr>
+        <w:rPr>
+          <w:b/>
+          <w:bCs/>
+        </w:rPr>
+      </w:pPr>
+      <w:r>
+        <w:t>==================================================================</w:t>
+      </w:r>
+      <w:r>
+        <w:br/>
+      </w:r>
+      <w:r>
+        <w:br/>
+      </w:r>
+      <w:r>
+        <w:br/>
+      </w:r>
+      <w:r>
+        <w:br/>
+      </w:r>
+      <w:r>
+        <w:br/>
+      </w:r>
+      <w:r>
+        <w:br/>
+      </w:r>
+      <w:r>
+        <w:br/>
+      </w:r>
+      <w:r>
+        <w:br/>
+      </w:r>
+      <w:r>
+        <w:br/>
+      </w:r>
+      <w:r>
+        <w:rPr>
+          <w:rFonts w:ascii="Segoe UI Emoji" w:hAnsi="Segoe UI Emoji" w:cs="Segoe UI Emoji"/>
+          <w:b/>
+          <w:bCs/>
+        </w:rPr>
+        <w:t>🌌</w:t>
+      </w:r>
+      <w:r>
+        <w:rPr>
+          <w:b/>
+          <w:bCs/>
+        </w:rPr>
+        <w:t xml:space="preserve"> Ecossistema </w:t>
+      </w:r>
+      <w:proofErr w:type="spellStart"/>
+      <w:r>
+        <w:rPr>
+          <w:b/>
+          <w:bCs/>
+        </w:rPr>
+        <w:t>Stellar</w:t>
+      </w:r>
+      <w:proofErr w:type="spellEnd"/>
+      <w:r>
+        <w:rPr>
+          <w:b/>
+          <w:bCs/>
+        </w:rPr>
+        <w:t xml:space="preserve"> - Documentação de Atualizações (v1.2.0)</w:t>
+      </w:r>
+    </w:p>
+    <w:p>
+      <w:pPr>
+        <w:rPr>
+          <w:b/>
+          <w:bCs/>
+        </w:rPr>
+      </w:pPr>
+      <w:r>
+        <w:rPr>
+          <w:rFonts w:ascii="Segoe UI Emoji" w:hAnsi="Segoe UI Emoji" w:cs="Segoe UI Emoji"/>
+          <w:b/>
+          <w:bCs/>
+        </w:rPr>
+        <w:t>🛠️</w:t>
+      </w:r>
+      <w:r>
+        <w:rPr>
+          <w:b/>
+          <w:bCs/>
+        </w:rPr>
+        <w:t xml:space="preserve"> Implementações Recentes</w:t>
+      </w:r>
+    </w:p>
+    <w:p>
+      <w:pPr>
+        <w:rPr>
+          <w:b/>
+          <w:bCs/>
+        </w:rPr>
+      </w:pPr>
+      <w:r>
+        <w:rPr>
+          <w:b/>
+          <w:bCs/>
+        </w:rPr>
+        <w:lastRenderedPageBreak/>
+        <w:t>1. Motor de Atribuição Automática (</w:t>
+      </w:r>
+      <w:proofErr w:type="spellStart"/>
+      <w:r>
+        <w:rPr>
+          <w:b/>
+          <w:bCs/>
+        </w:rPr>
+        <w:t>Workload</w:t>
+      </w:r>
+      <w:proofErr w:type="spellEnd"/>
+      <w:r>
+        <w:rPr>
+          <w:b/>
+          <w:bCs/>
+        </w:rPr>
+        <w:t xml:space="preserve"> Balance)</w:t>
+      </w:r>
+    </w:p>
+    <w:p>
+      <w:r>
+        <w:t xml:space="preserve">Implementamos um algoritmo inteligente para distribuição de chamados, visando a eficiência operacional e a saúde da equipe técnica. </w:t>
+      </w:r>
+    </w:p>
+    <w:p>
+      <w:pPr>
+        <w:numPr>
+          <w:ilvl w:val="0"/>
+          <w:numId w:val="13"/>
+        </w:numPr>
+      </w:pPr>
+      <w:r>
+        <w:rPr>
+          <w:b/>
+          <w:bCs/>
+        </w:rPr>
+        <w:t>Cálculo de Pesos por SLA</w:t>
+      </w:r>
+      <w:r>
+        <w:t xml:space="preserve">: O sistema agora calcula a carga de trabalho baseada na prioridade dos chamados ativos: </w:t>
+      </w:r>
+      <w:r>
+        <w:rPr>
+          <w:b/>
+          <w:bCs/>
+        </w:rPr>
+        <w:t>Urgente (10)</w:t>
+      </w:r>
+      <w:r>
+        <w:t xml:space="preserve">, </w:t>
+      </w:r>
+      <w:r>
+        <w:rPr>
+          <w:b/>
+          <w:bCs/>
+        </w:rPr>
+        <w:t>Alta (7)</w:t>
+      </w:r>
+      <w:r>
+        <w:t xml:space="preserve">, </w:t>
+      </w:r>
+      <w:r>
+        <w:rPr>
+          <w:b/>
+          <w:bCs/>
+        </w:rPr>
+        <w:t>Média (4)</w:t>
+      </w:r>
+      <w:r>
+        <w:t xml:space="preserve"> e </w:t>
+      </w:r>
+      <w:r>
+        <w:rPr>
+          <w:b/>
+          <w:bCs/>
+        </w:rPr>
+        <w:t>Baixa (2)</w:t>
+      </w:r>
+      <w:r>
+        <w:t xml:space="preserve">. </w:t>
+      </w:r>
+    </w:p>
+    <w:p>
+      <w:pPr>
+        <w:numPr>
+          <w:ilvl w:val="0"/>
+          <w:numId w:val="13"/>
+        </w:numPr>
+      </w:pPr>
+      <w:r>
+        <w:rPr>
+          <w:b/>
+          <w:bCs/>
+        </w:rPr>
+        <w:t>Algoritmo de Menor Carga</w:t>
+      </w:r>
+      <w:r>
+        <w:t xml:space="preserve">: O método </w:t>
+      </w:r>
+      <w:proofErr w:type="spellStart"/>
+      <w:r>
+        <w:t>atribuirChamadoAutomaticamente</w:t>
+      </w:r>
+      <w:proofErr w:type="spellEnd"/>
+      <w:r>
+        <w:t xml:space="preserve"> analisa todos os técnicos com perfil ativo (Super Admin ou Técnico), identifica quem possui o menor peso total de chamados e realiza a atribuição no banco de dados automaticamente. </w:t>
+      </w:r>
+    </w:p>
+    <w:p>
+      <w:pPr>
+        <w:numPr>
+          <w:ilvl w:val="0"/>
+          <w:numId w:val="13"/>
+        </w:numPr>
+      </w:pPr>
+      <w:r>
+        <w:rPr>
+          <w:b/>
+          <w:bCs/>
+        </w:rPr>
+        <w:t>Transição de Status</w:t>
+      </w:r>
+      <w:r>
+        <w:t xml:space="preserve">: Ao ser atribuído, o status do chamado é automaticamente alterado de NOVO para EM_ATENDIMENTO. </w:t>
+      </w:r>
+    </w:p>
+    <w:p>
+      <w:pPr>
+        <w:rPr>
+          <w:b/>
+          <w:bCs/>
+        </w:rPr>
+      </w:pPr>
+      <w:r>
+        <w:rPr>
+          <w:b/>
+          <w:bCs/>
+        </w:rPr>
+        <w:t xml:space="preserve">2. Integração com n8n e </w:t>
+      </w:r>
+      <w:proofErr w:type="spellStart"/>
+      <w:r>
+        <w:rPr>
+          <w:b/>
+          <w:bCs/>
+        </w:rPr>
+        <w:t>EvolutionAPI</w:t>
+      </w:r>
+      <w:proofErr w:type="spellEnd"/>
+    </w:p>
+    <w:p>
+      <w:r>
+        <w:t>Damos voz ao sistema através de uma arquitetura baseada em eventos.</w:t>
+      </w:r>
+    </w:p>
+    <w:p>
+      <w:pPr>
+        <w:numPr>
+          <w:ilvl w:val="0"/>
+          <w:numId w:val="14"/>
+        </w:numPr>
+      </w:pPr>
+      <w:proofErr w:type="spellStart"/>
+      <w:r>
+        <w:rPr>
+          <w:b/>
+          <w:bCs/>
+        </w:rPr>
+        <w:t>WebhooksService</w:t>
+      </w:r>
+      <w:proofErr w:type="spellEnd"/>
+      <w:r>
+        <w:t xml:space="preserve">: Criamos um serviço dedicado para disparar eventos do </w:t>
+      </w:r>
+      <w:proofErr w:type="spellStart"/>
+      <w:r>
+        <w:t>backend</w:t>
+      </w:r>
+      <w:proofErr w:type="spellEnd"/>
+      <w:r>
+        <w:t xml:space="preserve"> </w:t>
+      </w:r>
+      <w:proofErr w:type="spellStart"/>
+      <w:r>
+        <w:t>NestJS</w:t>
+      </w:r>
+      <w:proofErr w:type="spellEnd"/>
+      <w:r>
+        <w:t xml:space="preserve"> para o </w:t>
+      </w:r>
+      <w:r>
+        <w:rPr>
+          <w:b/>
+          <w:bCs/>
+        </w:rPr>
+        <w:t>n8n</w:t>
+      </w:r>
+      <w:r>
+        <w:t>.</w:t>
+      </w:r>
+    </w:p>
+    <w:p>
+      <w:pPr>
+        <w:numPr>
+          <w:ilvl w:val="0"/>
+          <w:numId w:val="14"/>
+        </w:numPr>
+      </w:pPr>
+      <w:r>
+        <w:rPr>
+          <w:b/>
+          <w:bCs/>
+        </w:rPr>
+        <w:t>Notificações em Tempo Real</w:t>
+      </w:r>
+      <w:r>
+        <w:t xml:space="preserve">: Configuração de gatilho para o WhatsApp via </w:t>
+      </w:r>
+      <w:proofErr w:type="spellStart"/>
+      <w:r>
+        <w:rPr>
+          <w:b/>
+          <w:bCs/>
+        </w:rPr>
+        <w:t>EvolutionAPI</w:t>
+      </w:r>
+      <w:proofErr w:type="spellEnd"/>
+      <w:r>
+        <w:t xml:space="preserve">. O técnico recebe instantaneamente os dados do chamado, incluindo título, prioridade e nome da empresa cliente. </w:t>
+      </w:r>
+    </w:p>
+    <w:p>
+      <w:pPr>
+        <w:rPr>
+          <w:b/>
+          <w:bCs/>
+        </w:rPr>
+      </w:pPr>
+      <w:r>
+        <w:rPr>
+          <w:b/>
+          <w:bCs/>
+        </w:rPr>
+        <w:t xml:space="preserve">3. Refatoração de Banco de Dados (Prisma </w:t>
+      </w:r>
+      <w:proofErr w:type="spellStart"/>
+      <w:r>
+        <w:rPr>
+          <w:b/>
+          <w:bCs/>
+        </w:rPr>
+        <w:t>Schema</w:t>
+      </w:r>
+      <w:proofErr w:type="spellEnd"/>
+      <w:r>
+        <w:rPr>
+          <w:b/>
+          <w:bCs/>
+        </w:rPr>
+        <w:t>)</w:t>
+      </w:r>
+    </w:p>
+    <w:p>
+      <w:r>
+        <w:t xml:space="preserve">Ajustamos a integridade referencial do sistema para suportar a escala. </w:t>
+      </w:r>
+    </w:p>
+    <w:p>
+      <w:pPr>
+        <w:numPr>
+          <w:ilvl w:val="0"/>
+          <w:numId w:val="15"/>
+        </w:numPr>
+      </w:pPr>
+      <w:r>
+        <w:rPr>
+          <w:b/>
+          <w:bCs/>
+        </w:rPr>
+        <w:t>Mapeamento de Relacionamentos</w:t>
+      </w:r>
+      <w:r>
+        <w:t xml:space="preserve">: Consolidamos as relações entre as tabelas </w:t>
+      </w:r>
+      <w:proofErr w:type="spellStart"/>
+      <w:r>
+        <w:t>usuarios</w:t>
+      </w:r>
+      <w:proofErr w:type="spellEnd"/>
+      <w:r>
+        <w:t xml:space="preserve">, </w:t>
+      </w:r>
+      <w:proofErr w:type="spellStart"/>
+      <w:r>
+        <w:t>perfis_acesso</w:t>
+      </w:r>
+      <w:proofErr w:type="spellEnd"/>
+      <w:r>
+        <w:t xml:space="preserve">, chamados e empresas. </w:t>
+      </w:r>
+    </w:p>
+    <w:p>
+      <w:pPr>
+        <w:numPr>
+          <w:ilvl w:val="0"/>
+          <w:numId w:val="15"/>
+        </w:numPr>
+      </w:pPr>
+      <w:r>
+        <w:rPr>
+          <w:b/>
+          <w:bCs/>
+        </w:rPr>
+        <w:t>Tipagem Forte</w:t>
+      </w:r>
+      <w:r>
+        <w:t xml:space="preserve">: Implementamos tipagem rigorosa para evitar erros de </w:t>
+      </w:r>
+      <w:proofErr w:type="spellStart"/>
+      <w:r>
+        <w:t>runtime</w:t>
+      </w:r>
+      <w:proofErr w:type="spellEnd"/>
+      <w:r>
+        <w:t xml:space="preserve"> durante a manipulação de listas de usuários e objetos técnicos. </w:t>
+      </w:r>
+    </w:p>
+    <w:p>
+      <w:r>
+        <w:pict w14:anchorId="74011B1C">
+          <v:rect id="_x0000_i1043" style="width:0;height:1.5pt" o:hralign="center" o:hrstd="t" o:hr="t" fillcolor="#a0a0a0" stroked="f"/>
+        </w:pict>
+      </w:r>
+    </w:p>
+    <w:p>
+      <w:pPr>
+        <w:rPr>
+          <w:b/>
+          <w:bCs/>
+        </w:rPr>
+      </w:pPr>
+      <w:r>
+        <w:rPr>
+          <w:rFonts w:ascii="Segoe UI Emoji" w:hAnsi="Segoe UI Emoji" w:cs="Segoe UI Emoji"/>
+          <w:b/>
+          <w:bCs/>
+        </w:rPr>
+        <w:t>📈</w:t>
+      </w:r>
+      <w:r>
+        <w:rPr>
+          <w:b/>
+          <w:bCs/>
+        </w:rPr>
+        <w:t xml:space="preserve"> Próximos Passos (</w:t>
+      </w:r>
+      <w:proofErr w:type="spellStart"/>
+      <w:r>
+        <w:rPr>
+          <w:b/>
+          <w:bCs/>
+        </w:rPr>
+        <w:t>Roadmap</w:t>
+      </w:r>
+      <w:proofErr w:type="spellEnd"/>
+      <w:r>
+        <w:rPr>
+          <w:b/>
+          <w:bCs/>
+        </w:rPr>
+        <w:t>)</w:t>
+      </w:r>
+    </w:p>
+    <w:p>
+      <w:pPr>
+        <w:rPr>
+          <w:b/>
+          <w:bCs/>
+        </w:rPr>
+      </w:pPr>
+      <w:r>
+        <w:rPr>
+          <w:rFonts w:ascii="Segoe UI Emoji" w:hAnsi="Segoe UI Emoji" w:cs="Segoe UI Emoji"/>
+          <w:b/>
+          <w:bCs/>
+        </w:rPr>
+        <w:t>🧱</w:t>
+      </w:r>
+      <w:r>
+        <w:rPr>
+          <w:b/>
+          <w:bCs/>
+        </w:rPr>
+        <w:t xml:space="preserve"> Módulo de Relatórios Estratégicos</w:t>
+      </w:r>
+    </w:p>
+    <w:p>
+      <w:pPr>
+        <w:numPr>
+          <w:ilvl w:val="0"/>
+          <w:numId w:val="16"/>
+        </w:numPr>
+      </w:pPr>
+      <w:r>
+        <w:rPr>
+          <w:b/>
+          <w:bCs/>
+        </w:rPr>
+        <w:t>Extração de KPIs</w:t>
+      </w:r>
+      <w:r>
+        <w:t xml:space="preserve">: Desenvolvimento de rotas para consolidação de dados mensais (Tempo total gasto, cumprimento de SLA e volume por categoria). </w:t>
+      </w:r>
+    </w:p>
+    <w:p>
+      <w:pPr>
+        <w:numPr>
+          <w:ilvl w:val="0"/>
+          <w:numId w:val="16"/>
+        </w:numPr>
+      </w:pPr>
+      <w:r>
+        <w:rPr>
+          <w:b/>
+          <w:bCs/>
+        </w:rPr>
+        <w:t xml:space="preserve">PDF </w:t>
+      </w:r>
+      <w:proofErr w:type="spellStart"/>
+      <w:r>
+        <w:rPr>
+          <w:b/>
+          <w:bCs/>
+        </w:rPr>
+        <w:t>Engine</w:t>
+      </w:r>
+      <w:proofErr w:type="spellEnd"/>
+      <w:r>
+        <w:t xml:space="preserve">: Geração automática de relatórios em PDF com a identidade visual da </w:t>
+      </w:r>
+      <w:proofErr w:type="spellStart"/>
+      <w:r>
+        <w:rPr>
+          <w:b/>
+          <w:bCs/>
+        </w:rPr>
+        <w:t>Stellar</w:t>
+      </w:r>
+      <w:proofErr w:type="spellEnd"/>
+      <w:r>
+        <w:rPr>
+          <w:b/>
+          <w:bCs/>
+        </w:rPr>
+        <w:t xml:space="preserve"> </w:t>
+      </w:r>
+      <w:proofErr w:type="spellStart"/>
+      <w:r>
+        <w:rPr>
+          <w:b/>
+          <w:bCs/>
+        </w:rPr>
+        <w:t>Syntec</w:t>
+      </w:r>
+      <w:proofErr w:type="spellEnd"/>
+      <w:r>
+        <w:t xml:space="preserve"> para entrega aos gestores. </w:t>
+      </w:r>
+    </w:p>
+    <w:p>
+      <w:pPr>
+        <w:rPr>
+          <w:b/>
+          <w:bCs/>
+        </w:rPr>
+      </w:pPr>
+      <w:r>
+        <w:rPr>
+          <w:rFonts w:ascii="Segoe UI Emoji" w:hAnsi="Segoe UI Emoji" w:cs="Segoe UI Emoji"/>
+          <w:b/>
+          <w:bCs/>
+        </w:rPr>
+        <w:lastRenderedPageBreak/>
+        <w:t>📊</w:t>
+      </w:r>
+      <w:r>
+        <w:rPr>
+          <w:b/>
+          <w:bCs/>
+        </w:rPr>
+        <w:t xml:space="preserve"> Business </w:t>
+      </w:r>
+      <w:proofErr w:type="spellStart"/>
+      <w:r>
+        <w:rPr>
+          <w:b/>
+          <w:bCs/>
+        </w:rPr>
+        <w:t>Intelligence</w:t>
+      </w:r>
+      <w:proofErr w:type="spellEnd"/>
+      <w:r>
+        <w:rPr>
+          <w:b/>
+          <w:bCs/>
+        </w:rPr>
+        <w:t xml:space="preserve"> (Power BI)</w:t>
+      </w:r>
+    </w:p>
+    <w:p>
+      <w:pPr>
+        <w:numPr>
+          <w:ilvl w:val="0"/>
+          <w:numId w:val="17"/>
+        </w:numPr>
+      </w:pPr>
+      <w:r>
+        <w:rPr>
+          <w:b/>
+          <w:bCs/>
+        </w:rPr>
+        <w:t>Dashboard Interativo</w:t>
+      </w:r>
+      <w:r>
+        <w:t xml:space="preserve">: Integração de dashboards do Power BI diretamente na interface do cliente, permitindo análise dinâmica da saúde da TI. </w:t>
+      </w:r>
+    </w:p>
+    <w:p>
+      <w:pPr>
+        <w:numPr>
+          <w:ilvl w:val="0"/>
+          <w:numId w:val="17"/>
+        </w:numPr>
+      </w:pPr>
+      <w:r>
+        <w:rPr>
+          <w:b/>
+          <w:bCs/>
+        </w:rPr>
+        <w:t>Gatilho de Relatório</w:t>
+      </w:r>
+      <w:r>
+        <w:t>: Botão "</w:t>
+      </w:r>
+      <w:proofErr w:type="spellStart"/>
+      <w:r>
+        <w:t>On-Demand</w:t>
+      </w:r>
+      <w:proofErr w:type="spellEnd"/>
+      <w:r>
+        <w:t>" dentro do dashboard para geração imediata do fechamento mensal.</w:t>
+      </w:r>
+    </w:p>
+    <w:p>
+      <w:pPr>
+        <w:rPr>
+          <w:b/>
+          <w:bCs/>
+        </w:rPr>
+      </w:pPr>
+      <w:r>
+        <w:rPr>
+          <w:rFonts w:ascii="Segoe UI Emoji" w:hAnsi="Segoe UI Emoji" w:cs="Segoe UI Emoji"/>
+          <w:b/>
+          <w:bCs/>
+        </w:rPr>
+        <w:t>🤖</w:t>
+      </w:r>
+      <w:r>
+        <w:rPr>
+          <w:b/>
+          <w:bCs/>
+        </w:rPr>
+        <w:t xml:space="preserve"> Automação Monarca (Relatório Mensal Automático)</w:t>
+      </w:r>
+    </w:p>
+    <w:p>
+      <w:pPr>
+        <w:numPr>
+          <w:ilvl w:val="0"/>
+          <w:numId w:val="18"/>
+        </w:numPr>
+      </w:pPr>
+      <w:proofErr w:type="spellStart"/>
+      <w:r>
+        <w:rPr>
+          <w:b/>
+          <w:bCs/>
+        </w:rPr>
+        <w:t>Cron</w:t>
+      </w:r>
+      <w:proofErr w:type="spellEnd"/>
+      <w:r>
+        <w:rPr>
+          <w:b/>
+          <w:bCs/>
+        </w:rPr>
+        <w:t xml:space="preserve"> Jobs via n8n</w:t>
+      </w:r>
+      <w:r>
+        <w:t xml:space="preserve">: Automação para que, em todo dia 01, o sistema gere e envie os relatórios de performance para o WhatsApp e E-mail de todos os clientes cadastrados. </w:t>
+      </w:r>
+    </w:p>
+    <w:p>
+      <w:r>
+        <w:pict w14:anchorId="6979F8E8">
+          <v:rect id="_x0000_i1044" style="width:0;height:1.5pt" o:hralign="center" o:hrstd="t" o:hr="t" fillcolor="#a0a0a0" stroked="f"/>
+        </w:pict>
+      </w:r>
+    </w:p>
+    <w:p>
+      <w:r>
+        <w:rPr>
+          <w:b/>
+          <w:bCs/>
+        </w:rPr>
+        <w:t>Status do Projeto</w:t>
+      </w:r>
+      <w:r>
+        <w:t xml:space="preserve">: </w:t>
+      </w:r>
+      <w:r>
+        <w:rPr>
+          <w:rFonts w:ascii="Segoe UI Emoji" w:hAnsi="Segoe UI Emoji" w:cs="Segoe UI Emoji"/>
+        </w:rPr>
+        <w:t>🚀</w:t>
+      </w:r>
+      <w:r>
+        <w:t xml:space="preserve"> Operacional &amp; Escalável.</w:t>
+      </w:r>
+    </w:p>
+    <w:p>
+      <w:r>
+        <w:rPr>
+          <w:b/>
+          <w:bCs/>
+        </w:rPr>
+        <w:t xml:space="preserve">Último </w:t>
+      </w:r>
+      <w:proofErr w:type="spellStart"/>
+      <w:r>
+        <w:rPr>
+          <w:b/>
+          <w:bCs/>
+        </w:rPr>
+        <w:t>Commit</w:t>
+      </w:r>
+      <w:proofErr w:type="spellEnd"/>
+      <w:r>
+        <w:t xml:space="preserve">: Implementação do Motor de Atribuição e </w:t>
+      </w:r>
+      <w:proofErr w:type="spellStart"/>
+      <w:r>
+        <w:t>Webhooks</w:t>
+      </w:r>
+      <w:proofErr w:type="spellEnd"/>
+      <w:r>
+        <w:t xml:space="preserve"> de Notificação.</w:t>
+      </w:r>
+    </w:p>
+    <w:p>
+      <w:pPr>
+        <w:rPr>
+          <w:u w:val="single"/>
+        </w:rPr>
+      </w:pPr>
+    </w:p>
     <w:sectPr>
       <w:pgSz w:w="11906" w:h="16838"/>
       <w:pgMar w:top="1417" w:right="1701" w:bottom="1417" w:left="1701" w:header="708" w:footer="708" w:gutter="0"/>
@@ -3837,6 +4608,155 @@
     </w:lvl>
   </w:abstractNum>
   <w:abstractNum w:abstractNumId="3" w15:restartNumberingAfterBreak="0">
+    <w:nsid w:val="1A526397"/>
+    <w:multiLevelType w:val="multilevel"/>
+    <w:tmpl w:val="ACF857F6"/>
+    <w:lvl w:ilvl="0">
+      <w:start w:val="1"/>
+      <w:numFmt w:val="bullet"/>
+      <w:lvlText w:val=""/>
+      <w:lvlJc w:val="left"/>
+      <w:pPr>
+        <w:tabs>
+          <w:tab w:val="num" w:pos="720"/>
+        </w:tabs>
+        <w:ind w:left="720" w:hanging="360"/>
+      </w:pPr>
+      <w:rPr>
+        <w:rFonts w:ascii="Symbol" w:hAnsi="Symbol" w:hint="default"/>
+        <w:sz w:val="20"/>
+      </w:rPr>
+    </w:lvl>
+    <w:lvl w:ilvl="1" w:tentative="1">
+      <w:start w:val="1"/>
+      <w:numFmt w:val="bullet"/>
+      <w:lvlText w:val="o"/>
+      <w:lvlJc w:val="left"/>
+      <w:pPr>
+        <w:tabs>
+          <w:tab w:val="num" w:pos="1440"/>
+        </w:tabs>
+        <w:ind w:left="1440" w:hanging="360"/>
+      </w:pPr>
+      <w:rPr>
+        <w:rFonts w:ascii="Courier New" w:hAnsi="Courier New" w:hint="default"/>
+        <w:sz w:val="20"/>
+      </w:rPr>
+    </w:lvl>
+    <w:lvl w:ilvl="2" w:tentative="1">
+      <w:start w:val="1"/>
+      <w:numFmt w:val="bullet"/>
+      <w:lvlText w:val=""/>
+      <w:lvlJc w:val="left"/>
+      <w:pPr>
+        <w:tabs>
+          <w:tab w:val="num" w:pos="2160"/>
+        </w:tabs>
+        <w:ind w:left="2160" w:hanging="360"/>
+      </w:pPr>
+      <w:rPr>
+        <w:rFonts w:ascii="Wingdings" w:hAnsi="Wingdings" w:hint="default"/>
+        <w:sz w:val="20"/>
+      </w:rPr>
+    </w:lvl>
+    <w:lvl w:ilvl="3" w:tentative="1">
+      <w:start w:val="1"/>
+      <w:numFmt w:val="bullet"/>
+      <w:lvlText w:val=""/>
+      <w:lvlJc w:val="left"/>
+      <w:pPr>
+        <w:tabs>
+          <w:tab w:val="num" w:pos="2880"/>
+        </w:tabs>
+        <w:ind w:left="2880" w:hanging="360"/>
+      </w:pPr>
+      <w:rPr>
+        <w:rFonts w:ascii="Wingdings" w:hAnsi="Wingdings" w:hint="default"/>
+        <w:sz w:val="20"/>
+      </w:rPr>
+    </w:lvl>
+    <w:lvl w:ilvl="4" w:tentative="1">
+      <w:start w:val="1"/>
+      <w:numFmt w:val="bullet"/>
+      <w:lvlText w:val=""/>
+      <w:lvlJc w:val="left"/>
+      <w:pPr>
+        <w:tabs>
+          <w:tab w:val="num" w:pos="3600"/>
+        </w:tabs>
+        <w:ind w:left="3600" w:hanging="360"/>
+      </w:pPr>
+      <w:rPr>
+        <w:rFonts w:ascii="Wingdings" w:hAnsi="Wingdings" w:hint="default"/>
+        <w:sz w:val="20"/>
+      </w:rPr>
+    </w:lvl>
+    <w:lvl w:ilvl="5" w:tentative="1">
+      <w:start w:val="1"/>
+      <w:numFmt w:val="bullet"/>
+      <w:lvlText w:val=""/>
+      <w:lvlJc w:val="left"/>
+      <w:pPr>
+        <w:tabs>
+          <w:tab w:val="num" w:pos="4320"/>
+        </w:tabs>
+        <w:ind w:left="4320" w:hanging="360"/>
+      </w:pPr>
+      <w:rPr>
+        <w:rFonts w:ascii="Wingdings" w:hAnsi="Wingdings" w:hint="default"/>
+        <w:sz w:val="20"/>
+      </w:rPr>
+    </w:lvl>
+    <w:lvl w:ilvl="6" w:tentative="1">
+      <w:start w:val="1"/>
+      <w:numFmt w:val="bullet"/>
+      <w:lvlText w:val=""/>
+      <w:lvlJc w:val="left"/>
+      <w:pPr>
+        <w:tabs>
+          <w:tab w:val="num" w:pos="5040"/>
+        </w:tabs>
+        <w:ind w:left="5040" w:hanging="360"/>
+      </w:pPr>
+      <w:rPr>
+        <w:rFonts w:ascii="Wingdings" w:hAnsi="Wingdings" w:hint="default"/>
+        <w:sz w:val="20"/>
+      </w:rPr>
+    </w:lvl>
+    <w:lvl w:ilvl="7" w:tentative="1">
+      <w:start w:val="1"/>
+      <w:numFmt w:val="bullet"/>
+      <w:lvlText w:val=""/>
+      <w:lvlJc w:val="left"/>
+      <w:pPr>
+        <w:tabs>
+          <w:tab w:val="num" w:pos="5760"/>
+        </w:tabs>
+        <w:ind w:left="5760" w:hanging="360"/>
+      </w:pPr>
+      <w:rPr>
+        <w:rFonts w:ascii="Wingdings" w:hAnsi="Wingdings" w:hint="default"/>
+        <w:sz w:val="20"/>
+      </w:rPr>
+    </w:lvl>
+    <w:lvl w:ilvl="8" w:tentative="1">
+      <w:start w:val="1"/>
+      <w:numFmt w:val="bullet"/>
+      <w:lvlText w:val=""/>
+      <w:lvlJc w:val="left"/>
+      <w:pPr>
+        <w:tabs>
+          <w:tab w:val="num" w:pos="6480"/>
+        </w:tabs>
+        <w:ind w:left="6480" w:hanging="360"/>
+      </w:pPr>
+      <w:rPr>
+        <w:rFonts w:ascii="Wingdings" w:hAnsi="Wingdings" w:hint="default"/>
+        <w:sz w:val="20"/>
+      </w:rPr>
+    </w:lvl>
+  </w:abstractNum>
+  <w:abstractNum w:abstractNumId="4" w15:restartNumberingAfterBreak="0">
     <w:nsid w:val="22DB61D8"/>
     <w:multiLevelType w:val="multilevel"/>
     <w:tmpl w:val="D77AF5CA"/>
@@ -3949,7 +4869,156 @@
       </w:pPr>
     </w:lvl>
   </w:abstractNum>
-  <w:abstractNum w:abstractNumId="4" w15:restartNumberingAfterBreak="0">
+  <w:abstractNum w:abstractNumId="5" w15:restartNumberingAfterBreak="0">
+    <w:nsid w:val="2AD55784"/>
+    <w:multiLevelType w:val="multilevel"/>
+    <w:tmpl w:val="6D64FCC6"/>
+    <w:lvl w:ilvl="0">
+      <w:start w:val="1"/>
+      <w:numFmt w:val="bullet"/>
+      <w:lvlText w:val=""/>
+      <w:lvlJc w:val="left"/>
+      <w:pPr>
+        <w:tabs>
+          <w:tab w:val="num" w:pos="720"/>
+        </w:tabs>
+        <w:ind w:left="720" w:hanging="360"/>
+      </w:pPr>
+      <w:rPr>
+        <w:rFonts w:ascii="Symbol" w:hAnsi="Symbol" w:hint="default"/>
+        <w:sz w:val="20"/>
+      </w:rPr>
+    </w:lvl>
+    <w:lvl w:ilvl="1" w:tentative="1">
+      <w:start w:val="1"/>
+      <w:numFmt w:val="bullet"/>
+      <w:lvlText w:val="o"/>
+      <w:lvlJc w:val="left"/>
+      <w:pPr>
+        <w:tabs>
+          <w:tab w:val="num" w:pos="1440"/>
+        </w:tabs>
+        <w:ind w:left="1440" w:hanging="360"/>
+      </w:pPr>
+      <w:rPr>
+        <w:rFonts w:ascii="Courier New" w:hAnsi="Courier New" w:hint="default"/>
+        <w:sz w:val="20"/>
+      </w:rPr>
+    </w:lvl>
+    <w:lvl w:ilvl="2" w:tentative="1">
+      <w:start w:val="1"/>
+      <w:numFmt w:val="bullet"/>
+      <w:lvlText w:val=""/>
+      <w:lvlJc w:val="left"/>
+      <w:pPr>
+        <w:tabs>
+          <w:tab w:val="num" w:pos="2160"/>
+        </w:tabs>
+        <w:ind w:left="2160" w:hanging="360"/>
+      </w:pPr>
+      <w:rPr>
+        <w:rFonts w:ascii="Wingdings" w:hAnsi="Wingdings" w:hint="default"/>
+        <w:sz w:val="20"/>
+      </w:rPr>
+    </w:lvl>
+    <w:lvl w:ilvl="3" w:tentative="1">
+      <w:start w:val="1"/>
+      <w:numFmt w:val="bullet"/>
+      <w:lvlText w:val=""/>
+      <w:lvlJc w:val="left"/>
+      <w:pPr>
+        <w:tabs>
+          <w:tab w:val="num" w:pos="2880"/>
+        </w:tabs>
+        <w:ind w:left="2880" w:hanging="360"/>
+      </w:pPr>
+      <w:rPr>
+        <w:rFonts w:ascii="Wingdings" w:hAnsi="Wingdings" w:hint="default"/>
+        <w:sz w:val="20"/>
+      </w:rPr>
+    </w:lvl>
+    <w:lvl w:ilvl="4" w:tentative="1">
+      <w:start w:val="1"/>
+      <w:numFmt w:val="bullet"/>
+      <w:lvlText w:val=""/>
+      <w:lvlJc w:val="left"/>
+      <w:pPr>
+        <w:tabs>
+          <w:tab w:val="num" w:pos="3600"/>
+        </w:tabs>
+        <w:ind w:left="3600" w:hanging="360"/>
+      </w:pPr>
+      <w:rPr>
+        <w:rFonts w:ascii="Wingdings" w:hAnsi="Wingdings" w:hint="default"/>
+        <w:sz w:val="20"/>
+      </w:rPr>
+    </w:lvl>
+    <w:lvl w:ilvl="5" w:tentative="1">
+      <w:start w:val="1"/>
+      <w:numFmt w:val="bullet"/>
+      <w:lvlText w:val=""/>
+      <w:lvlJc w:val="left"/>
+      <w:pPr>
+        <w:tabs>
+          <w:tab w:val="num" w:pos="4320"/>
+        </w:tabs>
+        <w:ind w:left="4320" w:hanging="360"/>
+      </w:pPr>
+      <w:rPr>
+        <w:rFonts w:ascii="Wingdings" w:hAnsi="Wingdings" w:hint="default"/>
+        <w:sz w:val="20"/>
+      </w:rPr>
+    </w:lvl>
+    <w:lvl w:ilvl="6" w:tentative="1">
+      <w:start w:val="1"/>
+      <w:numFmt w:val="bullet"/>
+      <w:lvlText w:val=""/>
+      <w:lvlJc w:val="left"/>
+      <w:pPr>
+        <w:tabs>
+          <w:tab w:val="num" w:pos="5040"/>
+        </w:tabs>
+        <w:ind w:left="5040" w:hanging="360"/>
+      </w:pPr>
+      <w:rPr>
+        <w:rFonts w:ascii="Wingdings" w:hAnsi="Wingdings" w:hint="default"/>
+        <w:sz w:val="20"/>
+      </w:rPr>
+    </w:lvl>
+    <w:lvl w:ilvl="7" w:tentative="1">
+      <w:start w:val="1"/>
+      <w:numFmt w:val="bullet"/>
+      <w:lvlText w:val=""/>
+      <w:lvlJc w:val="left"/>
+      <w:pPr>
+        <w:tabs>
+          <w:tab w:val="num" w:pos="5760"/>
+        </w:tabs>
+        <w:ind w:left="5760" w:hanging="360"/>
+      </w:pPr>
+      <w:rPr>
+        <w:rFonts w:ascii="Wingdings" w:hAnsi="Wingdings" w:hint="default"/>
+        <w:sz w:val="20"/>
+      </w:rPr>
+    </w:lvl>
+    <w:lvl w:ilvl="8" w:tentative="1">
+      <w:start w:val="1"/>
+      <w:numFmt w:val="bullet"/>
+      <w:lvlText w:val=""/>
+      <w:lvlJc w:val="left"/>
+      <w:pPr>
+        <w:tabs>
+          <w:tab w:val="num" w:pos="6480"/>
+        </w:tabs>
+        <w:ind w:left="6480" w:hanging="360"/>
+      </w:pPr>
+      <w:rPr>
+        <w:rFonts w:ascii="Wingdings" w:hAnsi="Wingdings" w:hint="default"/>
+        <w:sz w:val="20"/>
+      </w:rPr>
+    </w:lvl>
+  </w:abstractNum>
+  <w:abstractNum w:abstractNumId="6" w15:restartNumberingAfterBreak="0">
     <w:nsid w:val="2B8E2D68"/>
     <w:multiLevelType w:val="multilevel"/>
     <w:tmpl w:val="62DCFC16"/>
@@ -4098,7 +5167,156 @@
       </w:rPr>
     </w:lvl>
   </w:abstractNum>
-  <w:abstractNum w:abstractNumId="5" w15:restartNumberingAfterBreak="0">
+  <w:abstractNum w:abstractNumId="7" w15:restartNumberingAfterBreak="0">
+    <w:nsid w:val="307F3F46"/>
+    <w:multiLevelType w:val="multilevel"/>
+    <w:tmpl w:val="4CD02B92"/>
+    <w:lvl w:ilvl="0">
+      <w:start w:val="1"/>
+      <w:numFmt w:val="bullet"/>
+      <w:lvlText w:val=""/>
+      <w:lvlJc w:val="left"/>
+      <w:pPr>
+        <w:tabs>
+          <w:tab w:val="num" w:pos="720"/>
+        </w:tabs>
+        <w:ind w:left="720" w:hanging="360"/>
+      </w:pPr>
+      <w:rPr>
+        <w:rFonts w:ascii="Symbol" w:hAnsi="Symbol" w:hint="default"/>
+        <w:sz w:val="20"/>
+      </w:rPr>
+    </w:lvl>
+    <w:lvl w:ilvl="1" w:tentative="1">
+      <w:start w:val="1"/>
+      <w:numFmt w:val="bullet"/>
+      <w:lvlText w:val="o"/>
+      <w:lvlJc w:val="left"/>
+      <w:pPr>
+        <w:tabs>
+          <w:tab w:val="num" w:pos="1440"/>
+        </w:tabs>
+        <w:ind w:left="1440" w:hanging="360"/>
+      </w:pPr>
+      <w:rPr>
+        <w:rFonts w:ascii="Courier New" w:hAnsi="Courier New" w:hint="default"/>
+        <w:sz w:val="20"/>
+      </w:rPr>
+    </w:lvl>
+    <w:lvl w:ilvl="2" w:tentative="1">
+      <w:start w:val="1"/>
+      <w:numFmt w:val="bullet"/>
+      <w:lvlText w:val=""/>
+      <w:lvlJc w:val="left"/>
+      <w:pPr>
+        <w:tabs>
+          <w:tab w:val="num" w:pos="2160"/>
+        </w:tabs>
+        <w:ind w:left="2160" w:hanging="360"/>
+      </w:pPr>
+      <w:rPr>
+        <w:rFonts w:ascii="Wingdings" w:hAnsi="Wingdings" w:hint="default"/>
+        <w:sz w:val="20"/>
+      </w:rPr>
+    </w:lvl>
+    <w:lvl w:ilvl="3" w:tentative="1">
+      <w:start w:val="1"/>
+      <w:numFmt w:val="bullet"/>
+      <w:lvlText w:val=""/>
+      <w:lvlJc w:val="left"/>
+      <w:pPr>
+        <w:tabs>
+          <w:tab w:val="num" w:pos="2880"/>
+        </w:tabs>
+        <w:ind w:left="2880" w:hanging="360"/>
+      </w:pPr>
+      <w:rPr>
+        <w:rFonts w:ascii="Wingdings" w:hAnsi="Wingdings" w:hint="default"/>
+        <w:sz w:val="20"/>
+      </w:rPr>
+    </w:lvl>
+    <w:lvl w:ilvl="4" w:tentative="1">
+      <w:start w:val="1"/>
+      <w:numFmt w:val="bullet"/>
+      <w:lvlText w:val=""/>
+      <w:lvlJc w:val="left"/>
+      <w:pPr>
+        <w:tabs>
+          <w:tab w:val="num" w:pos="3600"/>
+        </w:tabs>
+        <w:ind w:left="3600" w:hanging="360"/>
+      </w:pPr>
+      <w:rPr>
+        <w:rFonts w:ascii="Wingdings" w:hAnsi="Wingdings" w:hint="default"/>
+        <w:sz w:val="20"/>
+      </w:rPr>
+    </w:lvl>
+    <w:lvl w:ilvl="5" w:tentative="1">
+      <w:start w:val="1"/>
+      <w:numFmt w:val="bullet"/>
+      <w:lvlText w:val=""/>
+      <w:lvlJc w:val="left"/>
+      <w:pPr>
+        <w:tabs>
+          <w:tab w:val="num" w:pos="4320"/>
+        </w:tabs>
+        <w:ind w:left="4320" w:hanging="360"/>
+      </w:pPr>
+      <w:rPr>
+        <w:rFonts w:ascii="Wingdings" w:hAnsi="Wingdings" w:hint="default"/>
+        <w:sz w:val="20"/>
+      </w:rPr>
+    </w:lvl>
+    <w:lvl w:ilvl="6" w:tentative="1">
+      <w:start w:val="1"/>
+      <w:numFmt w:val="bullet"/>
+      <w:lvlText w:val=""/>
+      <w:lvlJc w:val="left"/>
+      <w:pPr>
+        <w:tabs>
+          <w:tab w:val="num" w:pos="5040"/>
+        </w:tabs>
+        <w:ind w:left="5040" w:hanging="360"/>
+      </w:pPr>
+      <w:rPr>
+        <w:rFonts w:ascii="Wingdings" w:hAnsi="Wingdings" w:hint="default"/>
+        <w:sz w:val="20"/>
+      </w:rPr>
+    </w:lvl>
+    <w:lvl w:ilvl="7" w:tentative="1">
+      <w:start w:val="1"/>
+      <w:numFmt w:val="bullet"/>
+      <w:lvlText w:val=""/>
+      <w:lvlJc w:val="left"/>
+      <w:pPr>
+        <w:tabs>
+          <w:tab w:val="num" w:pos="5760"/>
+        </w:tabs>
+        <w:ind w:left="5760" w:hanging="360"/>
+      </w:pPr>
+      <w:rPr>
+        <w:rFonts w:ascii="Wingdings" w:hAnsi="Wingdings" w:hint="default"/>
+        <w:sz w:val="20"/>
+      </w:rPr>
+    </w:lvl>
+    <w:lvl w:ilvl="8" w:tentative="1">
+      <w:start w:val="1"/>
+      <w:numFmt w:val="bullet"/>
+      <w:lvlText w:val=""/>
+      <w:lvlJc w:val="left"/>
+      <w:pPr>
+        <w:tabs>
+          <w:tab w:val="num" w:pos="6480"/>
+        </w:tabs>
+        <w:ind w:left="6480" w:hanging="360"/>
+      </w:pPr>
+      <w:rPr>
+        <w:rFonts w:ascii="Wingdings" w:hAnsi="Wingdings" w:hint="default"/>
+        <w:sz w:val="20"/>
+      </w:rPr>
+    </w:lvl>
+  </w:abstractNum>
+  <w:abstractNum w:abstractNumId="8" w15:restartNumberingAfterBreak="0">
     <w:nsid w:val="4E1129B4"/>
     <w:multiLevelType w:val="multilevel"/>
     <w:tmpl w:val="25C44C28"/>
@@ -4247,7 +5465,7 @@
       </w:rPr>
     </w:lvl>
   </w:abstractNum>
-  <w:abstractNum w:abstractNumId="6" w15:restartNumberingAfterBreak="0">
+  <w:abstractNum w:abstractNumId="9" w15:restartNumberingAfterBreak="0">
     <w:nsid w:val="4E6C49EC"/>
     <w:multiLevelType w:val="multilevel"/>
     <w:tmpl w:val="6F966304"/>
@@ -4364,7 +5582,7 @@
       </w:pPr>
     </w:lvl>
   </w:abstractNum>
-  <w:abstractNum w:abstractNumId="7" w15:restartNumberingAfterBreak="0">
+  <w:abstractNum w:abstractNumId="10" w15:restartNumberingAfterBreak="0">
     <w:nsid w:val="51764FD9"/>
     <w:multiLevelType w:val="multilevel"/>
     <w:tmpl w:val="08A60508"/>
@@ -4513,7 +5731,305 @@
       </w:rPr>
     </w:lvl>
   </w:abstractNum>
-  <w:abstractNum w:abstractNumId="8" w15:restartNumberingAfterBreak="0">
+  <w:abstractNum w:abstractNumId="11" w15:restartNumberingAfterBreak="0">
+    <w:nsid w:val="52571FED"/>
+    <w:multiLevelType w:val="multilevel"/>
+    <w:tmpl w:val="22BCED12"/>
+    <w:lvl w:ilvl="0">
+      <w:start w:val="1"/>
+      <w:numFmt w:val="bullet"/>
+      <w:lvlText w:val=""/>
+      <w:lvlJc w:val="left"/>
+      <w:pPr>
+        <w:tabs>
+          <w:tab w:val="num" w:pos="720"/>
+        </w:tabs>
+        <w:ind w:left="720" w:hanging="360"/>
+      </w:pPr>
+      <w:rPr>
+        <w:rFonts w:ascii="Symbol" w:hAnsi="Symbol" w:hint="default"/>
+        <w:sz w:val="20"/>
+      </w:rPr>
+    </w:lvl>
+    <w:lvl w:ilvl="1" w:tentative="1">
+      <w:start w:val="1"/>
+      <w:numFmt w:val="bullet"/>
+      <w:lvlText w:val="o"/>
+      <w:lvlJc w:val="left"/>
+      <w:pPr>
+        <w:tabs>
+          <w:tab w:val="num" w:pos="1440"/>
+        </w:tabs>
+        <w:ind w:left="1440" w:hanging="360"/>
+      </w:pPr>
+      <w:rPr>
+        <w:rFonts w:ascii="Courier New" w:hAnsi="Courier New" w:hint="default"/>
+        <w:sz w:val="20"/>
+      </w:rPr>
+    </w:lvl>
+    <w:lvl w:ilvl="2" w:tentative="1">
+      <w:start w:val="1"/>
+      <w:numFmt w:val="bullet"/>
+      <w:lvlText w:val=""/>
+      <w:lvlJc w:val="left"/>
+      <w:pPr>
+        <w:tabs>
+          <w:tab w:val="num" w:pos="2160"/>
+        </w:tabs>
+        <w:ind w:left="2160" w:hanging="360"/>
+      </w:pPr>
+      <w:rPr>
+        <w:rFonts w:ascii="Wingdings" w:hAnsi="Wingdings" w:hint="default"/>
+        <w:sz w:val="20"/>
+      </w:rPr>
+    </w:lvl>
+    <w:lvl w:ilvl="3" w:tentative="1">
+      <w:start w:val="1"/>
+      <w:numFmt w:val="bullet"/>
+      <w:lvlText w:val=""/>
+      <w:lvlJc w:val="left"/>
+      <w:pPr>
+        <w:tabs>
+          <w:tab w:val="num" w:pos="2880"/>
+        </w:tabs>
+        <w:ind w:left="2880" w:hanging="360"/>
+      </w:pPr>
+      <w:rPr>
+        <w:rFonts w:ascii="Wingdings" w:hAnsi="Wingdings" w:hint="default"/>
+        <w:sz w:val="20"/>
+      </w:rPr>
+    </w:lvl>
+    <w:lvl w:ilvl="4" w:tentative="1">
+      <w:start w:val="1"/>
+      <w:numFmt w:val="bullet"/>
+      <w:lvlText w:val=""/>
+      <w:lvlJc w:val="left"/>
+      <w:pPr>
+        <w:tabs>
+          <w:tab w:val="num" w:pos="3600"/>
+        </w:tabs>
+        <w:ind w:left="3600" w:hanging="360"/>
+      </w:pPr>
+      <w:rPr>
+        <w:rFonts w:ascii="Wingdings" w:hAnsi="Wingdings" w:hint="default"/>
+        <w:sz w:val="20"/>
+      </w:rPr>
+    </w:lvl>
+    <w:lvl w:ilvl="5" w:tentative="1">
+      <w:start w:val="1"/>
+      <w:numFmt w:val="bullet"/>
+      <w:lvlText w:val=""/>
+      <w:lvlJc w:val="left"/>
+      <w:pPr>
+        <w:tabs>
+          <w:tab w:val="num" w:pos="4320"/>
+        </w:tabs>
+        <w:ind w:left="4320" w:hanging="360"/>
+      </w:pPr>
+      <w:rPr>
+        <w:rFonts w:ascii="Wingdings" w:hAnsi="Wingdings" w:hint="default"/>
+        <w:sz w:val="20"/>
+      </w:rPr>
+    </w:lvl>
+    <w:lvl w:ilvl="6" w:tentative="1">
+      <w:start w:val="1"/>
+      <w:numFmt w:val="bullet"/>
+      <w:lvlText w:val=""/>
+      <w:lvlJc w:val="left"/>
+      <w:pPr>
+        <w:tabs>
+          <w:tab w:val="num" w:pos="5040"/>
+        </w:tabs>
+        <w:ind w:left="5040" w:hanging="360"/>
+      </w:pPr>
+      <w:rPr>
+        <w:rFonts w:ascii="Wingdings" w:hAnsi="Wingdings" w:hint="default"/>
+        <w:sz w:val="20"/>
+      </w:rPr>
+    </w:lvl>
+    <w:lvl w:ilvl="7" w:tentative="1">
+      <w:start w:val="1"/>
+      <w:numFmt w:val="bullet"/>
+      <w:lvlText w:val=""/>
+      <w:lvlJc w:val="left"/>
+      <w:pPr>
+        <w:tabs>
+          <w:tab w:val="num" w:pos="5760"/>
+        </w:tabs>
+        <w:ind w:left="5760" w:hanging="360"/>
+      </w:pPr>
+      <w:rPr>
+        <w:rFonts w:ascii="Wingdings" w:hAnsi="Wingdings" w:hint="default"/>
+        <w:sz w:val="20"/>
+      </w:rPr>
+    </w:lvl>
+    <w:lvl w:ilvl="8" w:tentative="1">
+      <w:start w:val="1"/>
+      <w:numFmt w:val="bullet"/>
+      <w:lvlText w:val=""/>
+      <w:lvlJc w:val="left"/>
+      <w:pPr>
+        <w:tabs>
+          <w:tab w:val="num" w:pos="6480"/>
+        </w:tabs>
+        <w:ind w:left="6480" w:hanging="360"/>
+      </w:pPr>
+      <w:rPr>
+        <w:rFonts w:ascii="Wingdings" w:hAnsi="Wingdings" w:hint="default"/>
+        <w:sz w:val="20"/>
+      </w:rPr>
+    </w:lvl>
+  </w:abstractNum>
+  <w:abstractNum w:abstractNumId="12" w15:restartNumberingAfterBreak="0">
+    <w:nsid w:val="577D2BDE"/>
+    <w:multiLevelType w:val="multilevel"/>
+    <w:tmpl w:val="1E7AAA5C"/>
+    <w:lvl w:ilvl="0">
+      <w:start w:val="1"/>
+      <w:numFmt w:val="bullet"/>
+      <w:lvlText w:val=""/>
+      <w:lvlJc w:val="left"/>
+      <w:pPr>
+        <w:tabs>
+          <w:tab w:val="num" w:pos="720"/>
+        </w:tabs>
+        <w:ind w:left="720" w:hanging="360"/>
+      </w:pPr>
+      <w:rPr>
+        <w:rFonts w:ascii="Symbol" w:hAnsi="Symbol" w:hint="default"/>
+        <w:sz w:val="20"/>
+      </w:rPr>
+    </w:lvl>
+    <w:lvl w:ilvl="1" w:tentative="1">
+      <w:start w:val="1"/>
+      <w:numFmt w:val="bullet"/>
+      <w:lvlText w:val="o"/>
+      <w:lvlJc w:val="left"/>
+      <w:pPr>
+        <w:tabs>
+          <w:tab w:val="num" w:pos="1440"/>
+        </w:tabs>
+        <w:ind w:left="1440" w:hanging="360"/>
+      </w:pPr>
+      <w:rPr>
+        <w:rFonts w:ascii="Courier New" w:hAnsi="Courier New" w:hint="default"/>
+        <w:sz w:val="20"/>
+      </w:rPr>
+    </w:lvl>
+    <w:lvl w:ilvl="2" w:tentative="1">
+      <w:start w:val="1"/>
+      <w:numFmt w:val="bullet"/>
+      <w:lvlText w:val=""/>
+      <w:lvlJc w:val="left"/>
+      <w:pPr>
+        <w:tabs>
+          <w:tab w:val="num" w:pos="2160"/>
+        </w:tabs>
+        <w:ind w:left="2160" w:hanging="360"/>
+      </w:pPr>
+      <w:rPr>
+        <w:rFonts w:ascii="Wingdings" w:hAnsi="Wingdings" w:hint="default"/>
+        <w:sz w:val="20"/>
+      </w:rPr>
+    </w:lvl>
+    <w:lvl w:ilvl="3" w:tentative="1">
+      <w:start w:val="1"/>
+      <w:numFmt w:val="bullet"/>
+      <w:lvlText w:val=""/>
+      <w:lvlJc w:val="left"/>
+      <w:pPr>
+        <w:tabs>
+          <w:tab w:val="num" w:pos="2880"/>
+        </w:tabs>
+        <w:ind w:left="2880" w:hanging="360"/>
+      </w:pPr>
+      <w:rPr>
+        <w:rFonts w:ascii="Wingdings" w:hAnsi="Wingdings" w:hint="default"/>
+        <w:sz w:val="20"/>
+      </w:rPr>
+    </w:lvl>
+    <w:lvl w:ilvl="4" w:tentative="1">
+      <w:start w:val="1"/>
+      <w:numFmt w:val="bullet"/>
+      <w:lvlText w:val=""/>
+      <w:lvlJc w:val="left"/>
+      <w:pPr>
+        <w:tabs>
+          <w:tab w:val="num" w:pos="3600"/>
+        </w:tabs>
+        <w:ind w:left="3600" w:hanging="360"/>
+      </w:pPr>
+      <w:rPr>
+        <w:rFonts w:ascii="Wingdings" w:hAnsi="Wingdings" w:hint="default"/>
+        <w:sz w:val="20"/>
+      </w:rPr>
+    </w:lvl>
+    <w:lvl w:ilvl="5" w:tentative="1">
+      <w:start w:val="1"/>
+      <w:numFmt w:val="bullet"/>
+      <w:lvlText w:val=""/>
+      <w:lvlJc w:val="left"/>
+      <w:pPr>
+        <w:tabs>
+          <w:tab w:val="num" w:pos="4320"/>
+        </w:tabs>
+        <w:ind w:left="4320" w:hanging="360"/>
+      </w:pPr>
+      <w:rPr>
+        <w:rFonts w:ascii="Wingdings" w:hAnsi="Wingdings" w:hint="default"/>
+        <w:sz w:val="20"/>
+      </w:rPr>
+    </w:lvl>
+    <w:lvl w:ilvl="6" w:tentative="1">
+      <w:start w:val="1"/>
+      <w:numFmt w:val="bullet"/>
+      <w:lvlText w:val=""/>
+      <w:lvlJc w:val="left"/>
+      <w:pPr>
+        <w:tabs>
+          <w:tab w:val="num" w:pos="5040"/>
+        </w:tabs>
+        <w:ind w:left="5040" w:hanging="360"/>
+      </w:pPr>
+      <w:rPr>
+        <w:rFonts w:ascii="Wingdings" w:hAnsi="Wingdings" w:hint="default"/>
+        <w:sz w:val="20"/>
+      </w:rPr>
+    </w:lvl>
+    <w:lvl w:ilvl="7" w:tentative="1">
+      <w:start w:val="1"/>
+      <w:numFmt w:val="bullet"/>
+      <w:lvlText w:val=""/>
+      <w:lvlJc w:val="left"/>
+      <w:pPr>
+        <w:tabs>
+          <w:tab w:val="num" w:pos="5760"/>
+        </w:tabs>
+        <w:ind w:left="5760" w:hanging="360"/>
+      </w:pPr>
+      <w:rPr>
+        <w:rFonts w:ascii="Wingdings" w:hAnsi="Wingdings" w:hint="default"/>
+        <w:sz w:val="20"/>
+      </w:rPr>
+    </w:lvl>
+    <w:lvl w:ilvl="8" w:tentative="1">
+      <w:start w:val="1"/>
+      <w:numFmt w:val="bullet"/>
+      <w:lvlText w:val=""/>
+      <w:lvlJc w:val="left"/>
+      <w:pPr>
+        <w:tabs>
+          <w:tab w:val="num" w:pos="6480"/>
+        </w:tabs>
+        <w:ind w:left="6480" w:hanging="360"/>
+      </w:pPr>
+      <w:rPr>
+        <w:rFonts w:ascii="Wingdings" w:hAnsi="Wingdings" w:hint="default"/>
+        <w:sz w:val="20"/>
+      </w:rPr>
+    </w:lvl>
+  </w:abstractNum>
+  <w:abstractNum w:abstractNumId="13" w15:restartNumberingAfterBreak="0">
     <w:nsid w:val="5ACC7AC4"/>
     <w:multiLevelType w:val="multilevel"/>
     <w:tmpl w:val="EF74BBA4"/>
@@ -4662,7 +6178,156 @@
       </w:rPr>
     </w:lvl>
   </w:abstractNum>
-  <w:abstractNum w:abstractNumId="9" w15:restartNumberingAfterBreak="0">
+  <w:abstractNum w:abstractNumId="14" w15:restartNumberingAfterBreak="0">
+    <w:nsid w:val="5E1C2D7A"/>
+    <w:multiLevelType w:val="multilevel"/>
+    <w:tmpl w:val="B1EC4ECC"/>
+    <w:lvl w:ilvl="0">
+      <w:start w:val="1"/>
+      <w:numFmt w:val="bullet"/>
+      <w:lvlText w:val=""/>
+      <w:lvlJc w:val="left"/>
+      <w:pPr>
+        <w:tabs>
+          <w:tab w:val="num" w:pos="720"/>
+        </w:tabs>
+        <w:ind w:left="720" w:hanging="360"/>
+      </w:pPr>
+      <w:rPr>
+        <w:rFonts w:ascii="Symbol" w:hAnsi="Symbol" w:hint="default"/>
+        <w:sz w:val="20"/>
+      </w:rPr>
+    </w:lvl>
+    <w:lvl w:ilvl="1" w:tentative="1">
+      <w:start w:val="1"/>
+      <w:numFmt w:val="bullet"/>
+      <w:lvlText w:val="o"/>
+      <w:lvlJc w:val="left"/>
+      <w:pPr>
+        <w:tabs>
+          <w:tab w:val="num" w:pos="1440"/>
+        </w:tabs>
+        <w:ind w:left="1440" w:hanging="360"/>
+      </w:pPr>
+      <w:rPr>
+        <w:rFonts w:ascii="Courier New" w:hAnsi="Courier New" w:hint="default"/>
+        <w:sz w:val="20"/>
+      </w:rPr>
+    </w:lvl>
+    <w:lvl w:ilvl="2" w:tentative="1">
+      <w:start w:val="1"/>
+      <w:numFmt w:val="bullet"/>
+      <w:lvlText w:val=""/>
+      <w:lvlJc w:val="left"/>
+      <w:pPr>
+        <w:tabs>
+          <w:tab w:val="num" w:pos="2160"/>
+        </w:tabs>
+        <w:ind w:left="2160" w:hanging="360"/>
+      </w:pPr>
+      <w:rPr>
+        <w:rFonts w:ascii="Wingdings" w:hAnsi="Wingdings" w:hint="default"/>
+        <w:sz w:val="20"/>
+      </w:rPr>
+    </w:lvl>
+    <w:lvl w:ilvl="3" w:tentative="1">
+      <w:start w:val="1"/>
+      <w:numFmt w:val="bullet"/>
+      <w:lvlText w:val=""/>
+      <w:lvlJc w:val="left"/>
+      <w:pPr>
+        <w:tabs>
+          <w:tab w:val="num" w:pos="2880"/>
+        </w:tabs>
+        <w:ind w:left="2880" w:hanging="360"/>
+      </w:pPr>
+      <w:rPr>
+        <w:rFonts w:ascii="Wingdings" w:hAnsi="Wingdings" w:hint="default"/>
+        <w:sz w:val="20"/>
+      </w:rPr>
+    </w:lvl>
+    <w:lvl w:ilvl="4" w:tentative="1">
+      <w:start w:val="1"/>
+      <w:numFmt w:val="bullet"/>
+      <w:lvlText w:val=""/>
+      <w:lvlJc w:val="left"/>
+      <w:pPr>
+        <w:tabs>
+          <w:tab w:val="num" w:pos="3600"/>
+        </w:tabs>
+        <w:ind w:left="3600" w:hanging="360"/>
+      </w:pPr>
+      <w:rPr>
+        <w:rFonts w:ascii="Wingdings" w:hAnsi="Wingdings" w:hint="default"/>
+        <w:sz w:val="20"/>
+      </w:rPr>
+    </w:lvl>
+    <w:lvl w:ilvl="5" w:tentative="1">
+      <w:start w:val="1"/>
+      <w:numFmt w:val="bullet"/>
+      <w:lvlText w:val=""/>
+      <w:lvlJc w:val="left"/>
+      <w:pPr>
+        <w:tabs>
+          <w:tab w:val="num" w:pos="4320"/>
+        </w:tabs>
+        <w:ind w:left="4320" w:hanging="360"/>
+      </w:pPr>
+      <w:rPr>
+        <w:rFonts w:ascii="Wingdings" w:hAnsi="Wingdings" w:hint="default"/>
+        <w:sz w:val="20"/>
+      </w:rPr>
+    </w:lvl>
+    <w:lvl w:ilvl="6" w:tentative="1">
+      <w:start w:val="1"/>
+      <w:numFmt w:val="bullet"/>
+      <w:lvlText w:val=""/>
+      <w:lvlJc w:val="left"/>
+      <w:pPr>
+        <w:tabs>
+          <w:tab w:val="num" w:pos="5040"/>
+        </w:tabs>
+        <w:ind w:left="5040" w:hanging="360"/>
+      </w:pPr>
+      <w:rPr>
+        <w:rFonts w:ascii="Wingdings" w:hAnsi="Wingdings" w:hint="default"/>
+        <w:sz w:val="20"/>
+      </w:rPr>
+    </w:lvl>
+    <w:lvl w:ilvl="7" w:tentative="1">
+      <w:start w:val="1"/>
+      <w:numFmt w:val="bullet"/>
+      <w:lvlText w:val=""/>
+      <w:lvlJc w:val="left"/>
+      <w:pPr>
+        <w:tabs>
+          <w:tab w:val="num" w:pos="5760"/>
+        </w:tabs>
+        <w:ind w:left="5760" w:hanging="360"/>
+      </w:pPr>
+      <w:rPr>
+        <w:rFonts w:ascii="Wingdings" w:hAnsi="Wingdings" w:hint="default"/>
+        <w:sz w:val="20"/>
+      </w:rPr>
+    </w:lvl>
+    <w:lvl w:ilvl="8" w:tentative="1">
+      <w:start w:val="1"/>
+      <w:numFmt w:val="bullet"/>
+      <w:lvlText w:val=""/>
+      <w:lvlJc w:val="left"/>
+      <w:pPr>
+        <w:tabs>
+          <w:tab w:val="num" w:pos="6480"/>
+        </w:tabs>
+        <w:ind w:left="6480" w:hanging="360"/>
+      </w:pPr>
+      <w:rPr>
+        <w:rFonts w:ascii="Wingdings" w:hAnsi="Wingdings" w:hint="default"/>
+        <w:sz w:val="20"/>
+      </w:rPr>
+    </w:lvl>
+  </w:abstractNum>
+  <w:abstractNum w:abstractNumId="15" w15:restartNumberingAfterBreak="0">
     <w:nsid w:val="72086280"/>
     <w:multiLevelType w:val="multilevel"/>
     <w:tmpl w:val="4DBC79AE"/>
@@ -4775,7 +6440,7 @@
       </w:pPr>
     </w:lvl>
   </w:abstractNum>
-  <w:abstractNum w:abstractNumId="10" w15:restartNumberingAfterBreak="0">
+  <w:abstractNum w:abstractNumId="16" w15:restartNumberingAfterBreak="0">
     <w:nsid w:val="799B103C"/>
     <w:multiLevelType w:val="multilevel"/>
     <w:tmpl w:val="23A613A0"/>
@@ -4924,7 +6589,7 @@
       </w:rPr>
     </w:lvl>
   </w:abstractNum>
-  <w:abstractNum w:abstractNumId="11" w15:restartNumberingAfterBreak="0">
+  <w:abstractNum w:abstractNumId="17" w15:restartNumberingAfterBreak="0">
     <w:nsid w:val="7D5B4DED"/>
     <w:multiLevelType w:val="multilevel"/>
     <w:tmpl w:val="758042DA"/>
@@ -5077,37 +6742,55 @@
     <w:abstractNumId w:val="1"/>
   </w:num>
   <w:num w:numId="2" w16cid:durableId="431315551">
-    <w:abstractNumId w:val="11"/>
+    <w:abstractNumId w:val="17"/>
   </w:num>
   <w:num w:numId="3" w16cid:durableId="1261835197">
-    <w:abstractNumId w:val="4"/>
+    <w:abstractNumId w:val="6"/>
   </w:num>
   <w:num w:numId="4" w16cid:durableId="576020663">
-    <w:abstractNumId w:val="10"/>
+    <w:abstractNumId w:val="16"/>
   </w:num>
   <w:num w:numId="5" w16cid:durableId="2081978374">
-    <w:abstractNumId w:val="8"/>
+    <w:abstractNumId w:val="13"/>
   </w:num>
   <w:num w:numId="6" w16cid:durableId="593511808">
-    <w:abstractNumId w:val="7"/>
+    <w:abstractNumId w:val="10"/>
   </w:num>
   <w:num w:numId="7" w16cid:durableId="2110809009">
     <w:abstractNumId w:val="2"/>
   </w:num>
   <w:num w:numId="8" w16cid:durableId="281230396">
-    <w:abstractNumId w:val="6"/>
+    <w:abstractNumId w:val="9"/>
   </w:num>
   <w:num w:numId="9" w16cid:durableId="1997220382">
-    <w:abstractNumId w:val="5"/>
+    <w:abstractNumId w:val="8"/>
   </w:num>
   <w:num w:numId="10" w16cid:durableId="1922173411">
     <w:abstractNumId w:val="0"/>
   </w:num>
   <w:num w:numId="11" w16cid:durableId="1394237143">
-    <w:abstractNumId w:val="9"/>
+    <w:abstractNumId w:val="15"/>
   </w:num>
   <w:num w:numId="12" w16cid:durableId="1896771950">
+    <w:abstractNumId w:val="4"/>
+  </w:num>
+  <w:num w:numId="13" w16cid:durableId="626354605">
+    <w:abstractNumId w:val="14"/>
+  </w:num>
+  <w:num w:numId="14" w16cid:durableId="616450917">
+    <w:abstractNumId w:val="11"/>
+  </w:num>
+  <w:num w:numId="15" w16cid:durableId="177348957">
     <w:abstractNumId w:val="3"/>
+  </w:num>
+  <w:num w:numId="16" w16cid:durableId="2005743081">
+    <w:abstractNumId w:val="7"/>
+  </w:num>
+  <w:num w:numId="17" w16cid:durableId="393165718">
+    <w:abstractNumId w:val="12"/>
+  </w:num>
+  <w:num w:numId="18" w16cid:durableId="1973709430">
+    <w:abstractNumId w:val="5"/>
   </w:num>
 </w:numbering>
 </file>

</xml_diff>

<commit_message>
feat: implement reporting module with SLA charts, UUID security, and API Key protection
</commit_message>
<xml_diff>
--- a/Documentação/Documentação Ecossistema.docx
+++ b/Documentação/Documentação Ecossistema.docx
@@ -3847,7 +3847,7 @@
     <w:p>
       <w:r>
         <w:pict w14:anchorId="74011B1C">
-          <v:rect id="_x0000_i1043" style="width:0;height:1.5pt" o:hralign="center" o:hrstd="t" o:hr="t" fillcolor="#a0a0a0" stroked="f"/>
+          <v:rect id="_x0000_i1031" style="width:0;height:1.5pt" o:hralign="center" o:hrstd="t" o:hr="t" fillcolor="#a0a0a0" stroked="f"/>
         </w:pict>
       </w:r>
     </w:p>
@@ -3991,6 +3991,7 @@
         <w:rPr>
           <w:b/>
           <w:bCs/>
+          <w:lang w:val="en-US"/>
         </w:rPr>
       </w:pPr>
       <w:r>
@@ -4006,24 +4007,9 @@
         <w:rPr>
           <w:b/>
           <w:bCs/>
-        </w:rPr>
-        <w:t xml:space="preserve"> Business </w:t>
-      </w:r>
-      <w:proofErr w:type="spellStart"/>
-      <w:r>
-        <w:rPr>
-          <w:b/>
-          <w:bCs/>
-        </w:rPr>
-        <w:t>Intelligence</w:t>
-      </w:r>
-      <w:proofErr w:type="spellEnd"/>
-      <w:r>
-        <w:rPr>
-          <w:b/>
-          <w:bCs/>
-        </w:rPr>
-        <w:t xml:space="preserve"> (Power BI)</w:t>
+          <w:lang w:val="en-US"/>
+        </w:rPr>
+        <w:t xml:space="preserve"> Business Intelligence (Power BI)</w:t>
       </w:r>
     </w:p>
     <w:p>
@@ -4123,7 +4109,7 @@
     <w:p>
       <w:r>
         <w:pict w14:anchorId="6979F8E8">
-          <v:rect id="_x0000_i1044" style="width:0;height:1.5pt" o:hralign="center" o:hrstd="t" o:hr="t" fillcolor="#a0a0a0" stroked="f"/>
+          <v:rect id="_x0000_i1032" style="width:0;height:1.5pt" o:hralign="center" o:hrstd="t" o:hr="t" fillcolor="#a0a0a0" stroked="f"/>
         </w:pict>
       </w:r>
     </w:p>
@@ -4149,6 +4135,11 @@
       </w:r>
     </w:p>
     <w:p>
+      <w:pPr>
+        <w:pBdr>
+          <w:bottom w:val="double" w:sz="6" w:space="1" w:color="auto"/>
+        </w:pBdr>
+      </w:pPr>
       <w:r>
         <w:rPr>
           <w:b/>
@@ -4175,6 +4166,714 @@
       <w:proofErr w:type="spellEnd"/>
       <w:r>
         <w:t xml:space="preserve"> de Notificação.</w:t>
+      </w:r>
+    </w:p>
+    <w:p>
+      <w:pPr>
+        <w:rPr>
+          <w:u w:val="single"/>
+        </w:rPr>
+      </w:pPr>
+    </w:p>
+    <w:p>
+      <w:pPr>
+        <w:rPr>
+          <w:u w:val="single"/>
+        </w:rPr>
+      </w:pPr>
+    </w:p>
+    <w:p>
+      <w:pPr>
+        <w:rPr>
+          <w:u w:val="single"/>
+        </w:rPr>
+      </w:pPr>
+    </w:p>
+    <w:p>
+      <w:pPr>
+        <w:rPr>
+          <w:u w:val="single"/>
+        </w:rPr>
+      </w:pPr>
+    </w:p>
+    <w:p>
+      <w:pPr>
+        <w:rPr>
+          <w:u w:val="single"/>
+        </w:rPr>
+      </w:pPr>
+    </w:p>
+    <w:p>
+      <w:pPr>
+        <w:rPr>
+          <w:u w:val="single"/>
+        </w:rPr>
+      </w:pPr>
+    </w:p>
+    <w:p>
+      <w:pPr>
+        <w:rPr>
+          <w:u w:val="single"/>
+        </w:rPr>
+      </w:pPr>
+    </w:p>
+    <w:p>
+      <w:pPr>
+        <w:rPr>
+          <w:u w:val="single"/>
+        </w:rPr>
+      </w:pPr>
+    </w:p>
+    <w:p>
+      <w:pPr>
+        <w:rPr>
+          <w:u w:val="single"/>
+        </w:rPr>
+      </w:pPr>
+    </w:p>
+    <w:p>
+      <w:pPr>
+        <w:rPr>
+          <w:u w:val="single"/>
+        </w:rPr>
+      </w:pPr>
+    </w:p>
+    <w:p>
+      <w:pPr>
+        <w:rPr>
+          <w:b/>
+          <w:bCs/>
+          <w:u w:val="single"/>
+        </w:rPr>
+      </w:pPr>
+      <w:r>
+        <w:rPr>
+          <w:rFonts w:ascii="Segoe UI Emoji" w:hAnsi="Segoe UI Emoji" w:cs="Segoe UI Emoji"/>
+          <w:b/>
+          <w:bCs/>
+          <w:u w:val="single"/>
+        </w:rPr>
+        <w:t>📑</w:t>
+      </w:r>
+      <w:r>
+        <w:rPr>
+          <w:b/>
+          <w:bCs/>
+          <w:u w:val="single"/>
+        </w:rPr>
+        <w:t xml:space="preserve"> Documentação Técnica: Módulo de Relatórios </w:t>
+      </w:r>
+      <w:proofErr w:type="spellStart"/>
+      <w:r>
+        <w:rPr>
+          <w:b/>
+          <w:bCs/>
+          <w:u w:val="single"/>
+        </w:rPr>
+        <w:t>Stellar</w:t>
+      </w:r>
+      <w:proofErr w:type="spellEnd"/>
+    </w:p>
+    <w:p>
+      <w:pPr>
+        <w:rPr>
+          <w:u w:val="single"/>
+        </w:rPr>
+      </w:pPr>
+      <w:r>
+        <w:rPr>
+          <w:b/>
+          <w:bCs/>
+          <w:u w:val="single"/>
+        </w:rPr>
+        <w:t>1. Objetivo do Sistema</w:t>
+      </w:r>
+      <w:r>
+        <w:rPr>
+          <w:u w:val="single"/>
+        </w:rPr>
+        <w:t xml:space="preserve"> Automatizar a geração e o envio de relatórios de SLA para clientes (clínicas médicas e escolas de música), utilizando um design </w:t>
+      </w:r>
+      <w:proofErr w:type="spellStart"/>
+      <w:r>
+        <w:rPr>
+          <w:u w:val="single"/>
+        </w:rPr>
+        <w:t>Dark</w:t>
+      </w:r>
+      <w:proofErr w:type="spellEnd"/>
+      <w:r>
+        <w:rPr>
+          <w:u w:val="single"/>
+        </w:rPr>
+        <w:t xml:space="preserve"> Corporate de alto impacto visual.</w:t>
+      </w:r>
+    </w:p>
+    <w:p>
+      <w:pPr>
+        <w:rPr>
+          <w:u w:val="single"/>
+        </w:rPr>
+      </w:pPr>
+      <w:r>
+        <w:rPr>
+          <w:b/>
+          <w:bCs/>
+          <w:u w:val="single"/>
+        </w:rPr>
+        <w:t>2. Arquitetura do Módulo</w:t>
+      </w:r>
+    </w:p>
+    <w:p>
+      <w:pPr>
+        <w:numPr>
+          <w:ilvl w:val="0"/>
+          <w:numId w:val="19"/>
+        </w:numPr>
+        <w:rPr>
+          <w:u w:val="single"/>
+        </w:rPr>
+      </w:pPr>
+      <w:proofErr w:type="spellStart"/>
+      <w:r>
+        <w:rPr>
+          <w:b/>
+          <w:bCs/>
+          <w:u w:val="single"/>
+        </w:rPr>
+        <w:t>Backend</w:t>
+      </w:r>
+      <w:proofErr w:type="spellEnd"/>
+      <w:r>
+        <w:rPr>
+          <w:b/>
+          <w:bCs/>
+          <w:u w:val="single"/>
+        </w:rPr>
+        <w:t xml:space="preserve"> (</w:t>
+      </w:r>
+      <w:proofErr w:type="spellStart"/>
+      <w:r>
+        <w:rPr>
+          <w:b/>
+          <w:bCs/>
+          <w:u w:val="single"/>
+        </w:rPr>
+        <w:t>NestJS</w:t>
+      </w:r>
+      <w:proofErr w:type="spellEnd"/>
+      <w:r>
+        <w:rPr>
+          <w:b/>
+          <w:bCs/>
+          <w:u w:val="single"/>
+        </w:rPr>
+        <w:t>)</w:t>
+      </w:r>
+      <w:r>
+        <w:rPr>
+          <w:u w:val="single"/>
+        </w:rPr>
+        <w:t>: Processa a lógica de negócios e consulta o banco de dados via Prisma.</w:t>
+      </w:r>
+    </w:p>
+    <w:p>
+      <w:pPr>
+        <w:numPr>
+          <w:ilvl w:val="0"/>
+          <w:numId w:val="19"/>
+        </w:numPr>
+        <w:rPr>
+          <w:u w:val="single"/>
+        </w:rPr>
+      </w:pPr>
+      <w:r>
+        <w:rPr>
+          <w:b/>
+          <w:bCs/>
+          <w:u w:val="single"/>
+        </w:rPr>
+        <w:lastRenderedPageBreak/>
+        <w:t>Motor Gráfico (</w:t>
+      </w:r>
+      <w:proofErr w:type="spellStart"/>
+      <w:r>
+        <w:rPr>
+          <w:b/>
+          <w:bCs/>
+          <w:u w:val="single"/>
+        </w:rPr>
+        <w:t>Puppeteer</w:t>
+      </w:r>
+      <w:proofErr w:type="spellEnd"/>
+      <w:r>
+        <w:rPr>
+          <w:b/>
+          <w:bCs/>
+          <w:u w:val="single"/>
+        </w:rPr>
+        <w:t xml:space="preserve"> + </w:t>
+      </w:r>
+      <w:proofErr w:type="spellStart"/>
+      <w:r>
+        <w:rPr>
+          <w:b/>
+          <w:bCs/>
+          <w:u w:val="single"/>
+        </w:rPr>
+        <w:t>Handlebars</w:t>
+      </w:r>
+      <w:proofErr w:type="spellEnd"/>
+      <w:r>
+        <w:rPr>
+          <w:b/>
+          <w:bCs/>
+          <w:u w:val="single"/>
+        </w:rPr>
+        <w:t>)</w:t>
+      </w:r>
+      <w:r>
+        <w:rPr>
+          <w:u w:val="single"/>
+        </w:rPr>
+        <w:t xml:space="preserve">: Transforma dados brutos em </w:t>
+      </w:r>
+      <w:proofErr w:type="spellStart"/>
+      <w:r>
+        <w:rPr>
+          <w:u w:val="single"/>
+        </w:rPr>
+        <w:t>PDFs</w:t>
+      </w:r>
+      <w:proofErr w:type="spellEnd"/>
+      <w:r>
+        <w:rPr>
+          <w:u w:val="single"/>
+        </w:rPr>
+        <w:t xml:space="preserve"> com gráficos dinâmicos (Chart.js) e design Cyber-Neon.</w:t>
+      </w:r>
+    </w:p>
+    <w:p>
+      <w:pPr>
+        <w:numPr>
+          <w:ilvl w:val="0"/>
+          <w:numId w:val="19"/>
+        </w:numPr>
+        <w:rPr>
+          <w:u w:val="single"/>
+        </w:rPr>
+      </w:pPr>
+      <w:r>
+        <w:rPr>
+          <w:b/>
+          <w:bCs/>
+          <w:u w:val="single"/>
+        </w:rPr>
+        <w:t>Segurança (</w:t>
+      </w:r>
+      <w:proofErr w:type="spellStart"/>
+      <w:r>
+        <w:rPr>
+          <w:b/>
+          <w:bCs/>
+          <w:u w:val="single"/>
+        </w:rPr>
+        <w:t>Hardening</w:t>
+      </w:r>
+      <w:proofErr w:type="spellEnd"/>
+      <w:r>
+        <w:rPr>
+          <w:b/>
+          <w:bCs/>
+          <w:u w:val="single"/>
+        </w:rPr>
+        <w:t>)</w:t>
+      </w:r>
+      <w:r>
+        <w:rPr>
+          <w:u w:val="single"/>
+        </w:rPr>
+        <w:t>:</w:t>
+      </w:r>
+    </w:p>
+    <w:p>
+      <w:pPr>
+        <w:numPr>
+          <w:ilvl w:val="1"/>
+          <w:numId w:val="19"/>
+        </w:numPr>
+        <w:rPr>
+          <w:u w:val="single"/>
+        </w:rPr>
+      </w:pPr>
+      <w:r>
+        <w:rPr>
+          <w:b/>
+          <w:bCs/>
+          <w:u w:val="single"/>
+        </w:rPr>
+        <w:t>UUID</w:t>
+      </w:r>
+      <w:r>
+        <w:rPr>
+          <w:u w:val="single"/>
+        </w:rPr>
+        <w:t>: Arquivos gerados com nomes criptográficos únicos.</w:t>
+      </w:r>
+    </w:p>
+    <w:p>
+      <w:pPr>
+        <w:numPr>
+          <w:ilvl w:val="1"/>
+          <w:numId w:val="19"/>
+        </w:numPr>
+        <w:rPr>
+          <w:u w:val="single"/>
+        </w:rPr>
+      </w:pPr>
+      <w:proofErr w:type="spellStart"/>
+      <w:r>
+        <w:rPr>
+          <w:b/>
+          <w:bCs/>
+          <w:u w:val="single"/>
+        </w:rPr>
+        <w:t>ApiKeyGuard</w:t>
+      </w:r>
+      <w:proofErr w:type="spellEnd"/>
+      <w:r>
+        <w:rPr>
+          <w:u w:val="single"/>
+        </w:rPr>
+        <w:t>: Proteção de rotas para garantir que apenas sistemas autorizados (n8n) baixem os arquivos.</w:t>
+      </w:r>
+    </w:p>
+    <w:p>
+      <w:pPr>
+        <w:numPr>
+          <w:ilvl w:val="0"/>
+          <w:numId w:val="19"/>
+        </w:numPr>
+        <w:rPr>
+          <w:u w:val="single"/>
+        </w:rPr>
+      </w:pPr>
+      <w:r>
+        <w:rPr>
+          <w:b/>
+          <w:bCs/>
+          <w:u w:val="single"/>
+        </w:rPr>
+        <w:t>Orquestração (n8n)</w:t>
+      </w:r>
+      <w:r>
+        <w:rPr>
+          <w:u w:val="single"/>
+        </w:rPr>
+        <w:t>: Gerencia o fluxo temporal (</w:t>
+      </w:r>
+      <w:proofErr w:type="spellStart"/>
+      <w:r>
+        <w:rPr>
+          <w:u w:val="single"/>
+        </w:rPr>
+        <w:t>Cron</w:t>
+      </w:r>
+      <w:proofErr w:type="spellEnd"/>
+      <w:r>
+        <w:rPr>
+          <w:u w:val="single"/>
+        </w:rPr>
+        <w:t>), a ponte entre a nuvem (</w:t>
+      </w:r>
+      <w:proofErr w:type="spellStart"/>
+      <w:r>
+        <w:rPr>
+          <w:u w:val="single"/>
+        </w:rPr>
+        <w:t>Hostinger</w:t>
+      </w:r>
+      <w:proofErr w:type="spellEnd"/>
+      <w:r>
+        <w:rPr>
+          <w:u w:val="single"/>
+        </w:rPr>
+        <w:t>) e o local (</w:t>
+      </w:r>
+      <w:proofErr w:type="spellStart"/>
+      <w:r>
+        <w:rPr>
+          <w:u w:val="single"/>
+        </w:rPr>
+        <w:t>ngrok</w:t>
+      </w:r>
+      <w:proofErr w:type="spellEnd"/>
+      <w:r>
+        <w:rPr>
+          <w:u w:val="single"/>
+        </w:rPr>
+        <w:t>), e o tratamento de binários.</w:t>
+      </w:r>
+    </w:p>
+    <w:p>
+      <w:pPr>
+        <w:numPr>
+          <w:ilvl w:val="0"/>
+          <w:numId w:val="19"/>
+        </w:numPr>
+        <w:rPr>
+          <w:u w:val="single"/>
+        </w:rPr>
+      </w:pPr>
+      <w:r>
+        <w:rPr>
+          <w:b/>
+          <w:bCs/>
+          <w:u w:val="single"/>
+        </w:rPr>
+        <w:t>Entrega (</w:t>
+      </w:r>
+      <w:proofErr w:type="spellStart"/>
+      <w:r>
+        <w:rPr>
+          <w:b/>
+          <w:bCs/>
+          <w:u w:val="single"/>
+        </w:rPr>
+        <w:t>EvolutionAPI</w:t>
+      </w:r>
+      <w:proofErr w:type="spellEnd"/>
+      <w:r>
+        <w:rPr>
+          <w:b/>
+          <w:bCs/>
+          <w:u w:val="single"/>
+        </w:rPr>
+        <w:t>)</w:t>
+      </w:r>
+      <w:r>
+        <w:rPr>
+          <w:u w:val="single"/>
+        </w:rPr>
+        <w:t>: Realiza o disparo final via WhatsApp com mensagens personalizadas.</w:t>
+      </w:r>
+    </w:p>
+    <w:p>
+      <w:pPr>
+        <w:rPr>
+          <w:u w:val="single"/>
+        </w:rPr>
+      </w:pPr>
+      <w:r>
+        <w:rPr>
+          <w:b/>
+          <w:bCs/>
+          <w:u w:val="single"/>
+        </w:rPr>
+        <w:t>3. Fluxo de Trabalho (Workflow)</w:t>
+      </w:r>
+    </w:p>
+    <w:p>
+      <w:pPr>
+        <w:numPr>
+          <w:ilvl w:val="0"/>
+          <w:numId w:val="20"/>
+        </w:numPr>
+        <w:rPr>
+          <w:u w:val="single"/>
+        </w:rPr>
+      </w:pPr>
+      <w:r>
+        <w:rPr>
+          <w:b/>
+          <w:bCs/>
+          <w:u w:val="single"/>
+        </w:rPr>
+        <w:t>Gatilho</w:t>
+      </w:r>
+      <w:r>
+        <w:rPr>
+          <w:u w:val="single"/>
+        </w:rPr>
+        <w:t>: Disparo mensal automático.</w:t>
+      </w:r>
+    </w:p>
+    <w:p>
+      <w:pPr>
+        <w:numPr>
+          <w:ilvl w:val="0"/>
+          <w:numId w:val="20"/>
+        </w:numPr>
+        <w:rPr>
+          <w:u w:val="single"/>
+        </w:rPr>
+      </w:pPr>
+      <w:r>
+        <w:rPr>
+          <w:b/>
+          <w:bCs/>
+          <w:u w:val="single"/>
+        </w:rPr>
+        <w:t>Processamento</w:t>
+      </w:r>
+      <w:r>
+        <w:rPr>
+          <w:u w:val="single"/>
+        </w:rPr>
+        <w:t xml:space="preserve">: API </w:t>
+      </w:r>
+      <w:proofErr w:type="spellStart"/>
+      <w:r>
+        <w:rPr>
+          <w:u w:val="single"/>
+        </w:rPr>
+        <w:t>NestJS</w:t>
+      </w:r>
+      <w:proofErr w:type="spellEnd"/>
+      <w:r>
+        <w:rPr>
+          <w:u w:val="single"/>
+        </w:rPr>
+        <w:t xml:space="preserve"> gera o arquivo e retorna o UUID.</w:t>
+      </w:r>
+    </w:p>
+    <w:p>
+      <w:pPr>
+        <w:numPr>
+          <w:ilvl w:val="0"/>
+          <w:numId w:val="20"/>
+        </w:numPr>
+        <w:rPr>
+          <w:u w:val="single"/>
+        </w:rPr>
+      </w:pPr>
+      <w:r>
+        <w:rPr>
+          <w:b/>
+          <w:bCs/>
+          <w:u w:val="single"/>
+        </w:rPr>
+        <w:t>Segurança</w:t>
+      </w:r>
+      <w:r>
+        <w:rPr>
+          <w:u w:val="single"/>
+        </w:rPr>
+        <w:t xml:space="preserve">: n8n </w:t>
+      </w:r>
+      <w:proofErr w:type="gramStart"/>
+      <w:r>
+        <w:rPr>
+          <w:u w:val="single"/>
+        </w:rPr>
+        <w:t>autentica</w:t>
+      </w:r>
+      <w:proofErr w:type="gramEnd"/>
+      <w:r>
+        <w:rPr>
+          <w:u w:val="single"/>
+        </w:rPr>
+        <w:t xml:space="preserve"> com </w:t>
+      </w:r>
+      <w:proofErr w:type="spellStart"/>
+      <w:r>
+        <w:rPr>
+          <w:u w:val="single"/>
+        </w:rPr>
+        <w:t>Bearer</w:t>
+      </w:r>
+      <w:proofErr w:type="spellEnd"/>
+      <w:r>
+        <w:rPr>
+          <w:u w:val="single"/>
+        </w:rPr>
+        <w:t xml:space="preserve"> Token para baixar o PDF.</w:t>
+      </w:r>
+    </w:p>
+    <w:p>
+      <w:pPr>
+        <w:numPr>
+          <w:ilvl w:val="0"/>
+          <w:numId w:val="20"/>
+        </w:numPr>
+        <w:rPr>
+          <w:u w:val="single"/>
+        </w:rPr>
+      </w:pPr>
+      <w:r>
+        <w:rPr>
+          <w:b/>
+          <w:bCs/>
+          <w:u w:val="single"/>
+        </w:rPr>
+        <w:t>Conversão</w:t>
+      </w:r>
+      <w:r>
+        <w:rPr>
+          <w:u w:val="single"/>
+        </w:rPr>
+        <w:t xml:space="preserve">: Nó </w:t>
+      </w:r>
+      <w:proofErr w:type="spellStart"/>
+      <w:r>
+        <w:rPr>
+          <w:u w:val="single"/>
+        </w:rPr>
+        <w:t>Extract</w:t>
+      </w:r>
+      <w:proofErr w:type="spellEnd"/>
+      <w:r>
+        <w:rPr>
+          <w:u w:val="single"/>
+        </w:rPr>
+        <w:t xml:space="preserve"> </w:t>
+      </w:r>
+      <w:proofErr w:type="spellStart"/>
+      <w:proofErr w:type="gramStart"/>
+      <w:r>
+        <w:rPr>
+          <w:u w:val="single"/>
+        </w:rPr>
+        <w:t>from</w:t>
+      </w:r>
+      <w:proofErr w:type="spellEnd"/>
+      <w:r>
+        <w:rPr>
+          <w:u w:val="single"/>
+        </w:rPr>
+        <w:t xml:space="preserve"> File</w:t>
+      </w:r>
+      <w:proofErr w:type="gramEnd"/>
+      <w:r>
+        <w:rPr>
+          <w:u w:val="single"/>
+        </w:rPr>
+        <w:t xml:space="preserve"> converte o binário para Base64.</w:t>
+      </w:r>
+    </w:p>
+    <w:p>
+      <w:pPr>
+        <w:numPr>
+          <w:ilvl w:val="0"/>
+          <w:numId w:val="20"/>
+        </w:numPr>
+        <w:rPr>
+          <w:u w:val="single"/>
+        </w:rPr>
+      </w:pPr>
+      <w:r>
+        <w:rPr>
+          <w:b/>
+          <w:bCs/>
+          <w:u w:val="single"/>
+        </w:rPr>
+        <w:t>Notificação</w:t>
+      </w:r>
+      <w:r>
+        <w:rPr>
+          <w:u w:val="single"/>
+        </w:rPr>
+        <w:t>: Envio imediato para o WhatsApp do gestor.</w:t>
       </w:r>
     </w:p>
     <w:p>
@@ -4608,6 +5307,304 @@
     </w:lvl>
   </w:abstractNum>
   <w:abstractNum w:abstractNumId="3" w15:restartNumberingAfterBreak="0">
+    <w:nsid w:val="0B0D1E84"/>
+    <w:multiLevelType w:val="multilevel"/>
+    <w:tmpl w:val="C366CB9A"/>
+    <w:lvl w:ilvl="0">
+      <w:start w:val="1"/>
+      <w:numFmt w:val="bullet"/>
+      <w:lvlText w:val=""/>
+      <w:lvlJc w:val="left"/>
+      <w:pPr>
+        <w:tabs>
+          <w:tab w:val="num" w:pos="720"/>
+        </w:tabs>
+        <w:ind w:left="720" w:hanging="360"/>
+      </w:pPr>
+      <w:rPr>
+        <w:rFonts w:ascii="Symbol" w:hAnsi="Symbol" w:hint="default"/>
+        <w:sz w:val="20"/>
+      </w:rPr>
+    </w:lvl>
+    <w:lvl w:ilvl="1">
+      <w:start w:val="1"/>
+      <w:numFmt w:val="bullet"/>
+      <w:lvlText w:val="o"/>
+      <w:lvlJc w:val="left"/>
+      <w:pPr>
+        <w:tabs>
+          <w:tab w:val="num" w:pos="1440"/>
+        </w:tabs>
+        <w:ind w:left="1440" w:hanging="360"/>
+      </w:pPr>
+      <w:rPr>
+        <w:rFonts w:ascii="Courier New" w:hAnsi="Courier New" w:hint="default"/>
+        <w:sz w:val="20"/>
+      </w:rPr>
+    </w:lvl>
+    <w:lvl w:ilvl="2" w:tentative="1">
+      <w:start w:val="1"/>
+      <w:numFmt w:val="bullet"/>
+      <w:lvlText w:val=""/>
+      <w:lvlJc w:val="left"/>
+      <w:pPr>
+        <w:tabs>
+          <w:tab w:val="num" w:pos="2160"/>
+        </w:tabs>
+        <w:ind w:left="2160" w:hanging="360"/>
+      </w:pPr>
+      <w:rPr>
+        <w:rFonts w:ascii="Wingdings" w:hAnsi="Wingdings" w:hint="default"/>
+        <w:sz w:val="20"/>
+      </w:rPr>
+    </w:lvl>
+    <w:lvl w:ilvl="3" w:tentative="1">
+      <w:start w:val="1"/>
+      <w:numFmt w:val="bullet"/>
+      <w:lvlText w:val=""/>
+      <w:lvlJc w:val="left"/>
+      <w:pPr>
+        <w:tabs>
+          <w:tab w:val="num" w:pos="2880"/>
+        </w:tabs>
+        <w:ind w:left="2880" w:hanging="360"/>
+      </w:pPr>
+      <w:rPr>
+        <w:rFonts w:ascii="Wingdings" w:hAnsi="Wingdings" w:hint="default"/>
+        <w:sz w:val="20"/>
+      </w:rPr>
+    </w:lvl>
+    <w:lvl w:ilvl="4" w:tentative="1">
+      <w:start w:val="1"/>
+      <w:numFmt w:val="bullet"/>
+      <w:lvlText w:val=""/>
+      <w:lvlJc w:val="left"/>
+      <w:pPr>
+        <w:tabs>
+          <w:tab w:val="num" w:pos="3600"/>
+        </w:tabs>
+        <w:ind w:left="3600" w:hanging="360"/>
+      </w:pPr>
+      <w:rPr>
+        <w:rFonts w:ascii="Wingdings" w:hAnsi="Wingdings" w:hint="default"/>
+        <w:sz w:val="20"/>
+      </w:rPr>
+    </w:lvl>
+    <w:lvl w:ilvl="5" w:tentative="1">
+      <w:start w:val="1"/>
+      <w:numFmt w:val="bullet"/>
+      <w:lvlText w:val=""/>
+      <w:lvlJc w:val="left"/>
+      <w:pPr>
+        <w:tabs>
+          <w:tab w:val="num" w:pos="4320"/>
+        </w:tabs>
+        <w:ind w:left="4320" w:hanging="360"/>
+      </w:pPr>
+      <w:rPr>
+        <w:rFonts w:ascii="Wingdings" w:hAnsi="Wingdings" w:hint="default"/>
+        <w:sz w:val="20"/>
+      </w:rPr>
+    </w:lvl>
+    <w:lvl w:ilvl="6" w:tentative="1">
+      <w:start w:val="1"/>
+      <w:numFmt w:val="bullet"/>
+      <w:lvlText w:val=""/>
+      <w:lvlJc w:val="left"/>
+      <w:pPr>
+        <w:tabs>
+          <w:tab w:val="num" w:pos="5040"/>
+        </w:tabs>
+        <w:ind w:left="5040" w:hanging="360"/>
+      </w:pPr>
+      <w:rPr>
+        <w:rFonts w:ascii="Wingdings" w:hAnsi="Wingdings" w:hint="default"/>
+        <w:sz w:val="20"/>
+      </w:rPr>
+    </w:lvl>
+    <w:lvl w:ilvl="7" w:tentative="1">
+      <w:start w:val="1"/>
+      <w:numFmt w:val="bullet"/>
+      <w:lvlText w:val=""/>
+      <w:lvlJc w:val="left"/>
+      <w:pPr>
+        <w:tabs>
+          <w:tab w:val="num" w:pos="5760"/>
+        </w:tabs>
+        <w:ind w:left="5760" w:hanging="360"/>
+      </w:pPr>
+      <w:rPr>
+        <w:rFonts w:ascii="Wingdings" w:hAnsi="Wingdings" w:hint="default"/>
+        <w:sz w:val="20"/>
+      </w:rPr>
+    </w:lvl>
+    <w:lvl w:ilvl="8" w:tentative="1">
+      <w:start w:val="1"/>
+      <w:numFmt w:val="bullet"/>
+      <w:lvlText w:val=""/>
+      <w:lvlJc w:val="left"/>
+      <w:pPr>
+        <w:tabs>
+          <w:tab w:val="num" w:pos="6480"/>
+        </w:tabs>
+        <w:ind w:left="6480" w:hanging="360"/>
+      </w:pPr>
+      <w:rPr>
+        <w:rFonts w:ascii="Wingdings" w:hAnsi="Wingdings" w:hint="default"/>
+        <w:sz w:val="20"/>
+      </w:rPr>
+    </w:lvl>
+  </w:abstractNum>
+  <w:abstractNum w:abstractNumId="4" w15:restartNumberingAfterBreak="0">
+    <w:nsid w:val="18E24FC3"/>
+    <w:multiLevelType w:val="multilevel"/>
+    <w:tmpl w:val="810888D2"/>
+    <w:lvl w:ilvl="0">
+      <w:start w:val="1"/>
+      <w:numFmt w:val="bullet"/>
+      <w:lvlText w:val=""/>
+      <w:lvlJc w:val="left"/>
+      <w:pPr>
+        <w:tabs>
+          <w:tab w:val="num" w:pos="720"/>
+        </w:tabs>
+        <w:ind w:left="720" w:hanging="360"/>
+      </w:pPr>
+      <w:rPr>
+        <w:rFonts w:ascii="Symbol" w:hAnsi="Symbol" w:hint="default"/>
+        <w:sz w:val="20"/>
+      </w:rPr>
+    </w:lvl>
+    <w:lvl w:ilvl="1" w:tentative="1">
+      <w:start w:val="1"/>
+      <w:numFmt w:val="bullet"/>
+      <w:lvlText w:val="o"/>
+      <w:lvlJc w:val="left"/>
+      <w:pPr>
+        <w:tabs>
+          <w:tab w:val="num" w:pos="1440"/>
+        </w:tabs>
+        <w:ind w:left="1440" w:hanging="360"/>
+      </w:pPr>
+      <w:rPr>
+        <w:rFonts w:ascii="Courier New" w:hAnsi="Courier New" w:hint="default"/>
+        <w:sz w:val="20"/>
+      </w:rPr>
+    </w:lvl>
+    <w:lvl w:ilvl="2" w:tentative="1">
+      <w:start w:val="1"/>
+      <w:numFmt w:val="bullet"/>
+      <w:lvlText w:val=""/>
+      <w:lvlJc w:val="left"/>
+      <w:pPr>
+        <w:tabs>
+          <w:tab w:val="num" w:pos="2160"/>
+        </w:tabs>
+        <w:ind w:left="2160" w:hanging="360"/>
+      </w:pPr>
+      <w:rPr>
+        <w:rFonts w:ascii="Wingdings" w:hAnsi="Wingdings" w:hint="default"/>
+        <w:sz w:val="20"/>
+      </w:rPr>
+    </w:lvl>
+    <w:lvl w:ilvl="3" w:tentative="1">
+      <w:start w:val="1"/>
+      <w:numFmt w:val="bullet"/>
+      <w:lvlText w:val=""/>
+      <w:lvlJc w:val="left"/>
+      <w:pPr>
+        <w:tabs>
+          <w:tab w:val="num" w:pos="2880"/>
+        </w:tabs>
+        <w:ind w:left="2880" w:hanging="360"/>
+      </w:pPr>
+      <w:rPr>
+        <w:rFonts w:ascii="Wingdings" w:hAnsi="Wingdings" w:hint="default"/>
+        <w:sz w:val="20"/>
+      </w:rPr>
+    </w:lvl>
+    <w:lvl w:ilvl="4" w:tentative="1">
+      <w:start w:val="1"/>
+      <w:numFmt w:val="bullet"/>
+      <w:lvlText w:val=""/>
+      <w:lvlJc w:val="left"/>
+      <w:pPr>
+        <w:tabs>
+          <w:tab w:val="num" w:pos="3600"/>
+        </w:tabs>
+        <w:ind w:left="3600" w:hanging="360"/>
+      </w:pPr>
+      <w:rPr>
+        <w:rFonts w:ascii="Wingdings" w:hAnsi="Wingdings" w:hint="default"/>
+        <w:sz w:val="20"/>
+      </w:rPr>
+    </w:lvl>
+    <w:lvl w:ilvl="5" w:tentative="1">
+      <w:start w:val="1"/>
+      <w:numFmt w:val="bullet"/>
+      <w:lvlText w:val=""/>
+      <w:lvlJc w:val="left"/>
+      <w:pPr>
+        <w:tabs>
+          <w:tab w:val="num" w:pos="4320"/>
+        </w:tabs>
+        <w:ind w:left="4320" w:hanging="360"/>
+      </w:pPr>
+      <w:rPr>
+        <w:rFonts w:ascii="Wingdings" w:hAnsi="Wingdings" w:hint="default"/>
+        <w:sz w:val="20"/>
+      </w:rPr>
+    </w:lvl>
+    <w:lvl w:ilvl="6" w:tentative="1">
+      <w:start w:val="1"/>
+      <w:numFmt w:val="bullet"/>
+      <w:lvlText w:val=""/>
+      <w:lvlJc w:val="left"/>
+      <w:pPr>
+        <w:tabs>
+          <w:tab w:val="num" w:pos="5040"/>
+        </w:tabs>
+        <w:ind w:left="5040" w:hanging="360"/>
+      </w:pPr>
+      <w:rPr>
+        <w:rFonts w:ascii="Wingdings" w:hAnsi="Wingdings" w:hint="default"/>
+        <w:sz w:val="20"/>
+      </w:rPr>
+    </w:lvl>
+    <w:lvl w:ilvl="7" w:tentative="1">
+      <w:start w:val="1"/>
+      <w:numFmt w:val="bullet"/>
+      <w:lvlText w:val=""/>
+      <w:lvlJc w:val="left"/>
+      <w:pPr>
+        <w:tabs>
+          <w:tab w:val="num" w:pos="5760"/>
+        </w:tabs>
+        <w:ind w:left="5760" w:hanging="360"/>
+      </w:pPr>
+      <w:rPr>
+        <w:rFonts w:ascii="Wingdings" w:hAnsi="Wingdings" w:hint="default"/>
+        <w:sz w:val="20"/>
+      </w:rPr>
+    </w:lvl>
+    <w:lvl w:ilvl="8" w:tentative="1">
+      <w:start w:val="1"/>
+      <w:numFmt w:val="bullet"/>
+      <w:lvlText w:val=""/>
+      <w:lvlJc w:val="left"/>
+      <w:pPr>
+        <w:tabs>
+          <w:tab w:val="num" w:pos="6480"/>
+        </w:tabs>
+        <w:ind w:left="6480" w:hanging="360"/>
+      </w:pPr>
+      <w:rPr>
+        <w:rFonts w:ascii="Wingdings" w:hAnsi="Wingdings" w:hint="default"/>
+        <w:sz w:val="20"/>
+      </w:rPr>
+    </w:lvl>
+  </w:abstractNum>
+  <w:abstractNum w:abstractNumId="5" w15:restartNumberingAfterBreak="0">
     <w:nsid w:val="1A526397"/>
     <w:multiLevelType w:val="multilevel"/>
     <w:tmpl w:val="ACF857F6"/>
@@ -4756,7 +5753,7 @@
       </w:rPr>
     </w:lvl>
   </w:abstractNum>
-  <w:abstractNum w:abstractNumId="4" w15:restartNumberingAfterBreak="0">
+  <w:abstractNum w:abstractNumId="6" w15:restartNumberingAfterBreak="0">
     <w:nsid w:val="22DB61D8"/>
     <w:multiLevelType w:val="multilevel"/>
     <w:tmpl w:val="D77AF5CA"/>
@@ -4869,7 +5866,7 @@
       </w:pPr>
     </w:lvl>
   </w:abstractNum>
-  <w:abstractNum w:abstractNumId="5" w15:restartNumberingAfterBreak="0">
+  <w:abstractNum w:abstractNumId="7" w15:restartNumberingAfterBreak="0">
     <w:nsid w:val="2AD55784"/>
     <w:multiLevelType w:val="multilevel"/>
     <w:tmpl w:val="6D64FCC6"/>
@@ -5018,7 +6015,7 @@
       </w:rPr>
     </w:lvl>
   </w:abstractNum>
-  <w:abstractNum w:abstractNumId="6" w15:restartNumberingAfterBreak="0">
+  <w:abstractNum w:abstractNumId="8" w15:restartNumberingAfterBreak="0">
     <w:nsid w:val="2B8E2D68"/>
     <w:multiLevelType w:val="multilevel"/>
     <w:tmpl w:val="62DCFC16"/>
@@ -5167,7 +6164,7 @@
       </w:rPr>
     </w:lvl>
   </w:abstractNum>
-  <w:abstractNum w:abstractNumId="7" w15:restartNumberingAfterBreak="0">
+  <w:abstractNum w:abstractNumId="9" w15:restartNumberingAfterBreak="0">
     <w:nsid w:val="307F3F46"/>
     <w:multiLevelType w:val="multilevel"/>
     <w:tmpl w:val="4CD02B92"/>
@@ -5316,7 +6313,7 @@
       </w:rPr>
     </w:lvl>
   </w:abstractNum>
-  <w:abstractNum w:abstractNumId="8" w15:restartNumberingAfterBreak="0">
+  <w:abstractNum w:abstractNumId="10" w15:restartNumberingAfterBreak="0">
     <w:nsid w:val="4E1129B4"/>
     <w:multiLevelType w:val="multilevel"/>
     <w:tmpl w:val="25C44C28"/>
@@ -5465,7 +6462,7 @@
       </w:rPr>
     </w:lvl>
   </w:abstractNum>
-  <w:abstractNum w:abstractNumId="9" w15:restartNumberingAfterBreak="0">
+  <w:abstractNum w:abstractNumId="11" w15:restartNumberingAfterBreak="0">
     <w:nsid w:val="4E6C49EC"/>
     <w:multiLevelType w:val="multilevel"/>
     <w:tmpl w:val="6F966304"/>
@@ -5582,7 +6579,7 @@
       </w:pPr>
     </w:lvl>
   </w:abstractNum>
-  <w:abstractNum w:abstractNumId="10" w15:restartNumberingAfterBreak="0">
+  <w:abstractNum w:abstractNumId="12" w15:restartNumberingAfterBreak="0">
     <w:nsid w:val="51764FD9"/>
     <w:multiLevelType w:val="multilevel"/>
     <w:tmpl w:val="08A60508"/>
@@ -5731,7 +6728,7 @@
       </w:rPr>
     </w:lvl>
   </w:abstractNum>
-  <w:abstractNum w:abstractNumId="11" w15:restartNumberingAfterBreak="0">
+  <w:abstractNum w:abstractNumId="13" w15:restartNumberingAfterBreak="0">
     <w:nsid w:val="52571FED"/>
     <w:multiLevelType w:val="multilevel"/>
     <w:tmpl w:val="22BCED12"/>
@@ -5880,7 +6877,7 @@
       </w:rPr>
     </w:lvl>
   </w:abstractNum>
-  <w:abstractNum w:abstractNumId="12" w15:restartNumberingAfterBreak="0">
+  <w:abstractNum w:abstractNumId="14" w15:restartNumberingAfterBreak="0">
     <w:nsid w:val="577D2BDE"/>
     <w:multiLevelType w:val="multilevel"/>
     <w:tmpl w:val="1E7AAA5C"/>
@@ -6029,7 +7026,7 @@
       </w:rPr>
     </w:lvl>
   </w:abstractNum>
-  <w:abstractNum w:abstractNumId="13" w15:restartNumberingAfterBreak="0">
+  <w:abstractNum w:abstractNumId="15" w15:restartNumberingAfterBreak="0">
     <w:nsid w:val="5ACC7AC4"/>
     <w:multiLevelType w:val="multilevel"/>
     <w:tmpl w:val="EF74BBA4"/>
@@ -6178,7 +7175,7 @@
       </w:rPr>
     </w:lvl>
   </w:abstractNum>
-  <w:abstractNum w:abstractNumId="14" w15:restartNumberingAfterBreak="0">
+  <w:abstractNum w:abstractNumId="16" w15:restartNumberingAfterBreak="0">
     <w:nsid w:val="5E1C2D7A"/>
     <w:multiLevelType w:val="multilevel"/>
     <w:tmpl w:val="B1EC4ECC"/>
@@ -6327,7 +7324,7 @@
       </w:rPr>
     </w:lvl>
   </w:abstractNum>
-  <w:abstractNum w:abstractNumId="15" w15:restartNumberingAfterBreak="0">
+  <w:abstractNum w:abstractNumId="17" w15:restartNumberingAfterBreak="0">
     <w:nsid w:val="72086280"/>
     <w:multiLevelType w:val="multilevel"/>
     <w:tmpl w:val="4DBC79AE"/>
@@ -6440,7 +7437,7 @@
       </w:pPr>
     </w:lvl>
   </w:abstractNum>
-  <w:abstractNum w:abstractNumId="16" w15:restartNumberingAfterBreak="0">
+  <w:abstractNum w:abstractNumId="18" w15:restartNumberingAfterBreak="0">
     <w:nsid w:val="799B103C"/>
     <w:multiLevelType w:val="multilevel"/>
     <w:tmpl w:val="23A613A0"/>
@@ -6589,7 +7586,7 @@
       </w:rPr>
     </w:lvl>
   </w:abstractNum>
-  <w:abstractNum w:abstractNumId="17" w15:restartNumberingAfterBreak="0">
+  <w:abstractNum w:abstractNumId="19" w15:restartNumberingAfterBreak="0">
     <w:nsid w:val="7D5B4DED"/>
     <w:multiLevelType w:val="multilevel"/>
     <w:tmpl w:val="758042DA"/>
@@ -6742,55 +7739,61 @@
     <w:abstractNumId w:val="1"/>
   </w:num>
   <w:num w:numId="2" w16cid:durableId="431315551">
-    <w:abstractNumId w:val="17"/>
+    <w:abstractNumId w:val="19"/>
   </w:num>
   <w:num w:numId="3" w16cid:durableId="1261835197">
-    <w:abstractNumId w:val="6"/>
+    <w:abstractNumId w:val="8"/>
   </w:num>
   <w:num w:numId="4" w16cid:durableId="576020663">
-    <w:abstractNumId w:val="16"/>
+    <w:abstractNumId w:val="18"/>
   </w:num>
   <w:num w:numId="5" w16cid:durableId="2081978374">
-    <w:abstractNumId w:val="13"/>
+    <w:abstractNumId w:val="15"/>
   </w:num>
   <w:num w:numId="6" w16cid:durableId="593511808">
-    <w:abstractNumId w:val="10"/>
+    <w:abstractNumId w:val="12"/>
   </w:num>
   <w:num w:numId="7" w16cid:durableId="2110809009">
     <w:abstractNumId w:val="2"/>
   </w:num>
   <w:num w:numId="8" w16cid:durableId="281230396">
-    <w:abstractNumId w:val="9"/>
+    <w:abstractNumId w:val="11"/>
   </w:num>
   <w:num w:numId="9" w16cid:durableId="1997220382">
-    <w:abstractNumId w:val="8"/>
+    <w:abstractNumId w:val="10"/>
   </w:num>
   <w:num w:numId="10" w16cid:durableId="1922173411">
     <w:abstractNumId w:val="0"/>
   </w:num>
   <w:num w:numId="11" w16cid:durableId="1394237143">
-    <w:abstractNumId w:val="15"/>
+    <w:abstractNumId w:val="17"/>
   </w:num>
   <w:num w:numId="12" w16cid:durableId="1896771950">
-    <w:abstractNumId w:val="4"/>
+    <w:abstractNumId w:val="6"/>
   </w:num>
   <w:num w:numId="13" w16cid:durableId="626354605">
+    <w:abstractNumId w:val="16"/>
+  </w:num>
+  <w:num w:numId="14" w16cid:durableId="616450917">
+    <w:abstractNumId w:val="13"/>
+  </w:num>
+  <w:num w:numId="15" w16cid:durableId="177348957">
+    <w:abstractNumId w:val="5"/>
+  </w:num>
+  <w:num w:numId="16" w16cid:durableId="2005743081">
+    <w:abstractNumId w:val="9"/>
+  </w:num>
+  <w:num w:numId="17" w16cid:durableId="393165718">
     <w:abstractNumId w:val="14"/>
   </w:num>
-  <w:num w:numId="14" w16cid:durableId="616450917">
-    <w:abstractNumId w:val="11"/>
+  <w:num w:numId="18" w16cid:durableId="1973709430">
+    <w:abstractNumId w:val="7"/>
   </w:num>
-  <w:num w:numId="15" w16cid:durableId="177348957">
+  <w:num w:numId="19" w16cid:durableId="946885701">
     <w:abstractNumId w:val="3"/>
   </w:num>
-  <w:num w:numId="16" w16cid:durableId="2005743081">
-    <w:abstractNumId w:val="7"/>
-  </w:num>
-  <w:num w:numId="17" w16cid:durableId="393165718">
-    <w:abstractNumId w:val="12"/>
-  </w:num>
-  <w:num w:numId="18" w16cid:durableId="1973709430">
-    <w:abstractNumId w:val="5"/>
+  <w:num w:numId="20" w16cid:durableId="575239028">
+    <w:abstractNumId w:val="4"/>
   </w:num>
 </w:numbering>
 </file>

</xml_diff>

<commit_message>
feat(financeiro): organizacao de arquivos e modulos
</commit_message>
<xml_diff>
--- a/Documentação/Documentação Ecossistema.docx
+++ b/Documentação/Documentação Ecossistema.docx
@@ -4857,6 +4857,9 @@
           <w:ilvl w:val="0"/>
           <w:numId w:val="20"/>
         </w:numPr>
+        <w:pBdr>
+          <w:bottom w:val="double" w:sz="6" w:space="1" w:color="auto"/>
+        </w:pBdr>
         <w:rPr>
           <w:u w:val="single"/>
         </w:rPr>
@@ -4874,6 +4877,1613 @@
           <w:u w:val="single"/>
         </w:rPr>
         <w:t>: Envio imediato para o WhatsApp do gestor.</w:t>
+      </w:r>
+    </w:p>
+    <w:p>
+      <w:pPr>
+        <w:rPr>
+          <w:u w:val="single"/>
+        </w:rPr>
+      </w:pPr>
+    </w:p>
+    <w:p>
+      <w:pPr>
+        <w:rPr>
+          <w:u w:val="single"/>
+        </w:rPr>
+      </w:pPr>
+    </w:p>
+    <w:p>
+      <w:pPr>
+        <w:rPr>
+          <w:u w:val="single"/>
+        </w:rPr>
+      </w:pPr>
+    </w:p>
+    <w:p>
+      <w:pPr>
+        <w:rPr>
+          <w:u w:val="single"/>
+        </w:rPr>
+      </w:pPr>
+    </w:p>
+    <w:p>
+      <w:pPr>
+        <w:rPr>
+          <w:u w:val="single"/>
+        </w:rPr>
+      </w:pPr>
+    </w:p>
+    <w:p>
+      <w:pPr>
+        <w:rPr>
+          <w:u w:val="single"/>
+        </w:rPr>
+      </w:pPr>
+    </w:p>
+    <w:p>
+      <w:pPr>
+        <w:rPr>
+          <w:u w:val="single"/>
+        </w:rPr>
+      </w:pPr>
+    </w:p>
+    <w:p>
+      <w:pPr>
+        <w:rPr>
+          <w:u w:val="single"/>
+        </w:rPr>
+      </w:pPr>
+    </w:p>
+    <w:p>
+      <w:pPr>
+        <w:rPr>
+          <w:u w:val="single"/>
+        </w:rPr>
+      </w:pPr>
+    </w:p>
+    <w:p>
+      <w:pPr>
+        <w:rPr>
+          <w:b/>
+          <w:bCs/>
+          <w:u w:val="single"/>
+        </w:rPr>
+      </w:pPr>
+      <w:r>
+        <w:rPr>
+          <w:b/>
+          <w:bCs/>
+          <w:u w:val="single"/>
+        </w:rPr>
+        <w:t>Documentação Técnica: Integração Financeira e Automação de Notificações</w:t>
+      </w:r>
+    </w:p>
+    <w:p>
+      <w:pPr>
+        <w:rPr>
+          <w:u w:val="single"/>
+        </w:rPr>
+      </w:pPr>
+      <w:r>
+        <w:rPr>
+          <w:b/>
+          <w:bCs/>
+          <w:u w:val="single"/>
+        </w:rPr>
+        <w:t>Projeto:</w:t>
+      </w:r>
+      <w:r>
+        <w:rPr>
+          <w:u w:val="single"/>
+        </w:rPr>
+        <w:t xml:space="preserve"> </w:t>
+      </w:r>
+      <w:proofErr w:type="spellStart"/>
+      <w:r>
+        <w:rPr>
+          <w:u w:val="single"/>
+        </w:rPr>
+        <w:t>Stellar</w:t>
+      </w:r>
+      <w:proofErr w:type="spellEnd"/>
+      <w:r>
+        <w:rPr>
+          <w:u w:val="single"/>
+        </w:rPr>
+        <w:t xml:space="preserve"> </w:t>
+      </w:r>
+      <w:proofErr w:type="spellStart"/>
+      <w:r>
+        <w:rPr>
+          <w:u w:val="single"/>
+        </w:rPr>
+        <w:t>Syntec</w:t>
+      </w:r>
+      <w:proofErr w:type="spellEnd"/>
+    </w:p>
+    <w:p>
+      <w:pPr>
+        <w:rPr>
+          <w:u w:val="single"/>
+        </w:rPr>
+      </w:pPr>
+      <w:r>
+        <w:rPr>
+          <w:b/>
+          <w:bCs/>
+          <w:u w:val="single"/>
+        </w:rPr>
+        <w:t>Data:</w:t>
+      </w:r>
+      <w:r>
+        <w:rPr>
+          <w:u w:val="single"/>
+        </w:rPr>
+        <w:t xml:space="preserve"> 28 de </w:t>
+      </w:r>
+      <w:proofErr w:type="gramStart"/>
+      <w:r>
+        <w:rPr>
+          <w:u w:val="single"/>
+        </w:rPr>
+        <w:t>Abril</w:t>
+      </w:r>
+      <w:proofErr w:type="gramEnd"/>
+      <w:r>
+        <w:rPr>
+          <w:u w:val="single"/>
+        </w:rPr>
+        <w:t xml:space="preserve"> de 2026</w:t>
+      </w:r>
+    </w:p>
+    <w:p>
+      <w:pPr>
+        <w:rPr>
+          <w:u w:val="single"/>
+        </w:rPr>
+      </w:pPr>
+      <w:r>
+        <w:rPr>
+          <w:b/>
+          <w:bCs/>
+          <w:u w:val="single"/>
+        </w:rPr>
+        <w:t>Responsável Técnico:</w:t>
+      </w:r>
+      <w:r>
+        <w:rPr>
+          <w:u w:val="single"/>
+        </w:rPr>
+        <w:t xml:space="preserve"> </w:t>
+      </w:r>
+      <w:proofErr w:type="spellStart"/>
+      <w:r>
+        <w:rPr>
+          <w:u w:val="single"/>
+        </w:rPr>
+        <w:t>Vortex</w:t>
+      </w:r>
+      <w:proofErr w:type="spellEnd"/>
+      <w:r>
+        <w:rPr>
+          <w:u w:val="single"/>
+        </w:rPr>
+        <w:t xml:space="preserve"> AI</w:t>
+      </w:r>
+    </w:p>
+    <w:p>
+      <w:pPr>
+        <w:rPr>
+          <w:b/>
+          <w:bCs/>
+          <w:u w:val="single"/>
+        </w:rPr>
+      </w:pPr>
+      <w:r>
+        <w:rPr>
+          <w:b/>
+          <w:bCs/>
+          <w:u w:val="single"/>
+        </w:rPr>
+        <w:lastRenderedPageBreak/>
+        <w:t>1. Visão Geral</w:t>
+      </w:r>
+    </w:p>
+    <w:p>
+      <w:pPr>
+        <w:rPr>
+          <w:u w:val="single"/>
+        </w:rPr>
+      </w:pPr>
+      <w:r>
+        <w:rPr>
+          <w:u w:val="single"/>
+        </w:rPr>
+        <w:t xml:space="preserve">Esta documentação detalha a implementação do fluxo completo de automação financeira, integrando o gateway de pagamentos </w:t>
+      </w:r>
+      <w:proofErr w:type="spellStart"/>
+      <w:r>
+        <w:rPr>
+          <w:b/>
+          <w:bCs/>
+          <w:u w:val="single"/>
+        </w:rPr>
+        <w:t>Asaas</w:t>
+      </w:r>
+      <w:proofErr w:type="spellEnd"/>
+      <w:r>
+        <w:rPr>
+          <w:u w:val="single"/>
+        </w:rPr>
+        <w:t xml:space="preserve">, o serviço de mensagens </w:t>
+      </w:r>
+      <w:proofErr w:type="spellStart"/>
+      <w:r>
+        <w:rPr>
+          <w:b/>
+          <w:bCs/>
+          <w:u w:val="single"/>
+        </w:rPr>
+        <w:t>EvolutionAPI</w:t>
+      </w:r>
+      <w:proofErr w:type="spellEnd"/>
+      <w:r>
+        <w:rPr>
+          <w:u w:val="single"/>
+        </w:rPr>
+        <w:t xml:space="preserve"> (WhatsApp) e a base de dados via </w:t>
+      </w:r>
+      <w:r>
+        <w:rPr>
+          <w:b/>
+          <w:bCs/>
+          <w:u w:val="single"/>
+        </w:rPr>
+        <w:t>Prisma ORM</w:t>
+      </w:r>
+      <w:r>
+        <w:rPr>
+          <w:u w:val="single"/>
+        </w:rPr>
+        <w:t xml:space="preserve"> no framework </w:t>
+      </w:r>
+      <w:proofErr w:type="spellStart"/>
+      <w:r>
+        <w:rPr>
+          <w:u w:val="single"/>
+        </w:rPr>
+        <w:t>NestJS</w:t>
+      </w:r>
+      <w:proofErr w:type="spellEnd"/>
+      <w:r>
+        <w:rPr>
+          <w:u w:val="single"/>
+        </w:rPr>
+        <w:t>.</w:t>
+      </w:r>
+    </w:p>
+    <w:p>
+      <w:pPr>
+        <w:rPr>
+          <w:b/>
+          <w:bCs/>
+          <w:u w:val="single"/>
+        </w:rPr>
+      </w:pPr>
+      <w:r>
+        <w:rPr>
+          <w:b/>
+          <w:bCs/>
+          <w:u w:val="single"/>
+        </w:rPr>
+        <w:t>2. Histórico de Implementação (Ponta a Ponta)</w:t>
+      </w:r>
+    </w:p>
+    <w:p>
+      <w:pPr>
+        <w:rPr>
+          <w:b/>
+          <w:bCs/>
+          <w:u w:val="single"/>
+        </w:rPr>
+      </w:pPr>
+      <w:r>
+        <w:rPr>
+          <w:b/>
+          <w:bCs/>
+          <w:u w:val="single"/>
+        </w:rPr>
+        <w:t>2.1. Correções de Infraestrutura e Sintaxe</w:t>
+      </w:r>
+    </w:p>
+    <w:p>
+      <w:pPr>
+        <w:numPr>
+          <w:ilvl w:val="0"/>
+          <w:numId w:val="21"/>
+        </w:numPr>
+        <w:rPr>
+          <w:u w:val="single"/>
+        </w:rPr>
+      </w:pPr>
+      <w:r>
+        <w:rPr>
+          <w:b/>
+          <w:bCs/>
+          <w:u w:val="single"/>
+        </w:rPr>
+        <w:t>Correção de Código:</w:t>
+      </w:r>
+      <w:r>
+        <w:rPr>
+          <w:u w:val="single"/>
+        </w:rPr>
+        <w:t xml:space="preserve"> Ajuste do </w:t>
+      </w:r>
+      <w:proofErr w:type="spellStart"/>
+      <w:r>
+        <w:rPr>
+          <w:u w:val="single"/>
+        </w:rPr>
+        <w:t>NotificationsService</w:t>
+      </w:r>
+      <w:proofErr w:type="spellEnd"/>
+      <w:r>
+        <w:rPr>
+          <w:u w:val="single"/>
+        </w:rPr>
+        <w:t xml:space="preserve"> para sanar erros de fechamento de blocos de função que impediam a compilação do </w:t>
+      </w:r>
+      <w:proofErr w:type="spellStart"/>
+      <w:r>
+        <w:rPr>
+          <w:u w:val="single"/>
+        </w:rPr>
+        <w:t>TypeScript</w:t>
+      </w:r>
+      <w:proofErr w:type="spellEnd"/>
+      <w:r>
+        <w:rPr>
+          <w:u w:val="single"/>
+        </w:rPr>
+        <w:t>.</w:t>
+      </w:r>
+    </w:p>
+    <w:p>
+      <w:pPr>
+        <w:numPr>
+          <w:ilvl w:val="0"/>
+          <w:numId w:val="21"/>
+        </w:numPr>
+        <w:rPr>
+          <w:u w:val="single"/>
+        </w:rPr>
+      </w:pPr>
+      <w:r>
+        <w:rPr>
+          <w:b/>
+          <w:bCs/>
+          <w:u w:val="single"/>
+        </w:rPr>
+        <w:t>Resolução de Dependências:</w:t>
+      </w:r>
+      <w:r>
+        <w:rPr>
+          <w:u w:val="single"/>
+        </w:rPr>
+        <w:t xml:space="preserve"> Configuração do </w:t>
+      </w:r>
+      <w:proofErr w:type="spellStart"/>
+      <w:r>
+        <w:rPr>
+          <w:u w:val="single"/>
+        </w:rPr>
+        <w:t>NotificationsModule</w:t>
+      </w:r>
+      <w:proofErr w:type="spellEnd"/>
+      <w:r>
+        <w:rPr>
+          <w:u w:val="single"/>
+        </w:rPr>
+        <w:t xml:space="preserve"> com exportação do </w:t>
+      </w:r>
+      <w:proofErr w:type="spellStart"/>
+      <w:r>
+        <w:rPr>
+          <w:u w:val="single"/>
+        </w:rPr>
+        <w:t>NotificationsService</w:t>
+      </w:r>
+      <w:proofErr w:type="spellEnd"/>
+      <w:r>
+        <w:rPr>
+          <w:u w:val="single"/>
+        </w:rPr>
+        <w:t xml:space="preserve"> e importação no </w:t>
+      </w:r>
+      <w:proofErr w:type="spellStart"/>
+      <w:r>
+        <w:rPr>
+          <w:u w:val="single"/>
+        </w:rPr>
+        <w:t>FinanceiroModule</w:t>
+      </w:r>
+      <w:proofErr w:type="spellEnd"/>
+      <w:r>
+        <w:rPr>
+          <w:u w:val="single"/>
+        </w:rPr>
+        <w:t xml:space="preserve">, resolvendo o erro </w:t>
+      </w:r>
+      <w:proofErr w:type="spellStart"/>
+      <w:r>
+        <w:rPr>
+          <w:i/>
+          <w:iCs/>
+          <w:u w:val="single"/>
+        </w:rPr>
+        <w:t>UnknownDependenciesException</w:t>
+      </w:r>
+      <w:proofErr w:type="spellEnd"/>
+      <w:r>
+        <w:rPr>
+          <w:u w:val="single"/>
+        </w:rPr>
+        <w:t xml:space="preserve"> no </w:t>
+      </w:r>
+      <w:proofErr w:type="spellStart"/>
+      <w:r>
+        <w:rPr>
+          <w:u w:val="single"/>
+        </w:rPr>
+        <w:t>WebhooksController</w:t>
+      </w:r>
+      <w:proofErr w:type="spellEnd"/>
+      <w:r>
+        <w:rPr>
+          <w:u w:val="single"/>
+        </w:rPr>
+        <w:t>.</w:t>
+      </w:r>
+    </w:p>
+    <w:p>
+      <w:pPr>
+        <w:rPr>
+          <w:b/>
+          <w:bCs/>
+          <w:u w:val="single"/>
+        </w:rPr>
+      </w:pPr>
+      <w:r>
+        <w:rPr>
+          <w:b/>
+          <w:bCs/>
+          <w:u w:val="single"/>
+        </w:rPr>
+        <w:t xml:space="preserve">2.2. Integração </w:t>
+      </w:r>
+      <w:proofErr w:type="spellStart"/>
+      <w:r>
+        <w:rPr>
+          <w:b/>
+          <w:bCs/>
+          <w:u w:val="single"/>
+        </w:rPr>
+        <w:t>EvolutionAPI</w:t>
+      </w:r>
+      <w:proofErr w:type="spellEnd"/>
+      <w:r>
+        <w:rPr>
+          <w:b/>
+          <w:bCs/>
+          <w:u w:val="single"/>
+        </w:rPr>
+        <w:t xml:space="preserve"> (WhatsApp)</w:t>
+      </w:r>
+    </w:p>
+    <w:p>
+      <w:pPr>
+        <w:numPr>
+          <w:ilvl w:val="0"/>
+          <w:numId w:val="22"/>
+        </w:numPr>
+        <w:rPr>
+          <w:u w:val="single"/>
+        </w:rPr>
+      </w:pPr>
+      <w:r>
+        <w:rPr>
+          <w:b/>
+          <w:bCs/>
+          <w:u w:val="single"/>
+        </w:rPr>
+        <w:t>Sanitização de Contatos:</w:t>
+      </w:r>
+      <w:r>
+        <w:rPr>
+          <w:u w:val="single"/>
+        </w:rPr>
+        <w:t xml:space="preserve"> Implementação de </w:t>
+      </w:r>
+      <w:proofErr w:type="spellStart"/>
+      <w:r>
+        <w:rPr>
+          <w:u w:val="single"/>
+        </w:rPr>
+        <w:t>Regex</w:t>
+      </w:r>
+      <w:proofErr w:type="spellEnd"/>
+      <w:r>
+        <w:rPr>
+          <w:u w:val="single"/>
+        </w:rPr>
+        <w:t xml:space="preserve"> para limpeza de caracteres especiais em números de telefone e garantia do prefixo DDI 55 (Brasil).</w:t>
+      </w:r>
+    </w:p>
+    <w:p>
+      <w:pPr>
+        <w:numPr>
+          <w:ilvl w:val="0"/>
+          <w:numId w:val="22"/>
+        </w:numPr>
+        <w:rPr>
+          <w:u w:val="single"/>
+        </w:rPr>
+      </w:pPr>
+      <w:r>
+        <w:rPr>
+          <w:b/>
+          <w:bCs/>
+          <w:u w:val="single"/>
+        </w:rPr>
+        <w:t>Tratamento de URL:</w:t>
+      </w:r>
+      <w:r>
+        <w:rPr>
+          <w:u w:val="single"/>
+        </w:rPr>
+        <w:t xml:space="preserve"> Aplicação de </w:t>
+      </w:r>
+      <w:proofErr w:type="spellStart"/>
+      <w:r>
+        <w:rPr>
+          <w:u w:val="single"/>
+        </w:rPr>
+        <w:t>encodeURIComponent</w:t>
+      </w:r>
+      <w:proofErr w:type="spellEnd"/>
+      <w:r>
+        <w:rPr>
+          <w:u w:val="single"/>
+        </w:rPr>
+        <w:t xml:space="preserve"> no nome da instância para suportar espaços e caracteres especiais (</w:t>
+      </w:r>
+      <w:proofErr w:type="spellStart"/>
+      <w:r>
+        <w:rPr>
+          <w:u w:val="single"/>
+        </w:rPr>
+        <w:t>ex</w:t>
+      </w:r>
+      <w:proofErr w:type="spellEnd"/>
+      <w:r>
+        <w:rPr>
+          <w:u w:val="single"/>
+        </w:rPr>
+        <w:t xml:space="preserve">: </w:t>
+      </w:r>
+      <w:r>
+        <w:rPr>
+          <w:i/>
+          <w:iCs/>
+          <w:u w:val="single"/>
+        </w:rPr>
+        <w:t>Escola de Música RP - Bangu</w:t>
+      </w:r>
+      <w:r>
+        <w:rPr>
+          <w:u w:val="single"/>
+        </w:rPr>
+        <w:t>).</w:t>
+      </w:r>
+    </w:p>
+    <w:p>
+      <w:pPr>
+        <w:numPr>
+          <w:ilvl w:val="0"/>
+          <w:numId w:val="22"/>
+        </w:numPr>
+        <w:rPr>
+          <w:u w:val="single"/>
+        </w:rPr>
+      </w:pPr>
+      <w:r>
+        <w:rPr>
+          <w:b/>
+          <w:bCs/>
+          <w:u w:val="single"/>
+        </w:rPr>
+        <w:t xml:space="preserve">Correção de </w:t>
+      </w:r>
+      <w:proofErr w:type="spellStart"/>
+      <w:r>
+        <w:rPr>
+          <w:b/>
+          <w:bCs/>
+          <w:u w:val="single"/>
+        </w:rPr>
+        <w:t>Endpoints</w:t>
+      </w:r>
+      <w:proofErr w:type="spellEnd"/>
+      <w:r>
+        <w:rPr>
+          <w:b/>
+          <w:bCs/>
+          <w:u w:val="single"/>
+        </w:rPr>
+        <w:t>:</w:t>
+      </w:r>
+      <w:r>
+        <w:rPr>
+          <w:u w:val="single"/>
+        </w:rPr>
+        <w:t xml:space="preserve"> Ajuste das variáveis de ambiente para garantir que as requisições de mensagens fossem direcionadas à EVOLUTION_API_URL e não à URL do </w:t>
+      </w:r>
+      <w:proofErr w:type="spellStart"/>
+      <w:r>
+        <w:rPr>
+          <w:u w:val="single"/>
+        </w:rPr>
+        <w:t>Asaas</w:t>
+      </w:r>
+      <w:proofErr w:type="spellEnd"/>
+      <w:r>
+        <w:rPr>
+          <w:u w:val="single"/>
+        </w:rPr>
+        <w:t>.</w:t>
+      </w:r>
+    </w:p>
+    <w:p>
+      <w:pPr>
+        <w:rPr>
+          <w:b/>
+          <w:bCs/>
+          <w:u w:val="single"/>
+        </w:rPr>
+      </w:pPr>
+      <w:r>
+        <w:rPr>
+          <w:b/>
+          <w:bCs/>
+          <w:u w:val="single"/>
+        </w:rPr>
+        <w:t xml:space="preserve">2.3. Lógica de </w:t>
+      </w:r>
+      <w:proofErr w:type="spellStart"/>
+      <w:r>
+        <w:rPr>
+          <w:b/>
+          <w:bCs/>
+          <w:u w:val="single"/>
+        </w:rPr>
+        <w:t>Webhook</w:t>
+      </w:r>
+      <w:proofErr w:type="spellEnd"/>
+      <w:r>
+        <w:rPr>
+          <w:b/>
+          <w:bCs/>
+          <w:u w:val="single"/>
+        </w:rPr>
+        <w:t xml:space="preserve"> e Inteligência de Dados</w:t>
+      </w:r>
+    </w:p>
+    <w:p>
+      <w:pPr>
+        <w:numPr>
+          <w:ilvl w:val="0"/>
+          <w:numId w:val="23"/>
+        </w:numPr>
+        <w:rPr>
+          <w:u w:val="single"/>
+        </w:rPr>
+      </w:pPr>
+      <w:proofErr w:type="spellStart"/>
+      <w:r>
+        <w:rPr>
+          <w:b/>
+          <w:bCs/>
+          <w:u w:val="single"/>
+        </w:rPr>
+        <w:t>Idempotência</w:t>
+      </w:r>
+      <w:proofErr w:type="spellEnd"/>
+      <w:r>
+        <w:rPr>
+          <w:b/>
+          <w:bCs/>
+          <w:u w:val="single"/>
+        </w:rPr>
+        <w:t>:</w:t>
+      </w:r>
+      <w:r>
+        <w:rPr>
+          <w:u w:val="single"/>
+        </w:rPr>
+        <w:t xml:space="preserve"> Inclusão de uma trava de segurança que consulta o banco de dados antes de processar o </w:t>
+      </w:r>
+      <w:proofErr w:type="spellStart"/>
+      <w:r>
+        <w:rPr>
+          <w:u w:val="single"/>
+        </w:rPr>
+        <w:t>webhook</w:t>
+      </w:r>
+      <w:proofErr w:type="spellEnd"/>
+      <w:r>
+        <w:rPr>
+          <w:u w:val="single"/>
+        </w:rPr>
+        <w:t xml:space="preserve">. Se a fatura já constar como "PAGO", o sistema ignora eventos duplicados do </w:t>
+      </w:r>
+      <w:proofErr w:type="spellStart"/>
+      <w:r>
+        <w:rPr>
+          <w:u w:val="single"/>
+        </w:rPr>
+        <w:t>Asaas</w:t>
+      </w:r>
+      <w:proofErr w:type="spellEnd"/>
+      <w:r>
+        <w:rPr>
+          <w:u w:val="single"/>
+        </w:rPr>
+        <w:t>.</w:t>
+      </w:r>
+    </w:p>
+    <w:p>
+      <w:pPr>
+        <w:numPr>
+          <w:ilvl w:val="0"/>
+          <w:numId w:val="23"/>
+        </w:numPr>
+        <w:rPr>
+          <w:u w:val="single"/>
+        </w:rPr>
+      </w:pPr>
+      <w:r>
+        <w:rPr>
+          <w:b/>
+          <w:bCs/>
+          <w:u w:val="single"/>
+        </w:rPr>
+        <w:t>Sincronização com SQL Server:</w:t>
+      </w:r>
+      <w:r>
+        <w:rPr>
+          <w:u w:val="single"/>
+        </w:rPr>
+        <w:t xml:space="preserve"> Atualização em tempo real do status da fatura e data de pagamento via Prisma.</w:t>
+      </w:r>
+    </w:p>
+    <w:p>
+      <w:pPr>
+        <w:rPr>
+          <w:b/>
+          <w:bCs/>
+          <w:u w:val="single"/>
+        </w:rPr>
+      </w:pPr>
+      <w:r>
+        <w:rPr>
+          <w:b/>
+          <w:bCs/>
+          <w:u w:val="single"/>
+        </w:rPr>
+        <w:t>3. Fluxo de Entrega do Comprovante Oficial</w:t>
+      </w:r>
+    </w:p>
+    <w:p>
+      <w:pPr>
+        <w:rPr>
+          <w:u w:val="single"/>
+        </w:rPr>
+      </w:pPr>
+      <w:r>
+        <w:rPr>
+          <w:u w:val="single"/>
+        </w:rPr>
+        <w:t xml:space="preserve">Para contornar o tempo de processamento de </w:t>
+      </w:r>
+      <w:proofErr w:type="spellStart"/>
+      <w:r>
+        <w:rPr>
+          <w:u w:val="single"/>
+        </w:rPr>
+        <w:t>PDFs</w:t>
+      </w:r>
+      <w:proofErr w:type="spellEnd"/>
+      <w:r>
+        <w:rPr>
+          <w:u w:val="single"/>
+        </w:rPr>
+        <w:t xml:space="preserve"> no ambiente de </w:t>
+      </w:r>
+      <w:proofErr w:type="spellStart"/>
+      <w:r>
+        <w:rPr>
+          <w:u w:val="single"/>
+        </w:rPr>
+        <w:t>Sandbox</w:t>
+      </w:r>
+      <w:proofErr w:type="spellEnd"/>
+      <w:r>
+        <w:rPr>
+          <w:u w:val="single"/>
+        </w:rPr>
+        <w:t xml:space="preserve"> do </w:t>
+      </w:r>
+      <w:proofErr w:type="spellStart"/>
+      <w:r>
+        <w:rPr>
+          <w:u w:val="single"/>
+        </w:rPr>
+        <w:t>Asaas</w:t>
+      </w:r>
+      <w:proofErr w:type="spellEnd"/>
+      <w:r>
+        <w:rPr>
+          <w:u w:val="single"/>
+        </w:rPr>
+        <w:t xml:space="preserve">, foi implementada uma lógica de </w:t>
+      </w:r>
+      <w:r>
+        <w:rPr>
+          <w:b/>
+          <w:bCs/>
+          <w:u w:val="single"/>
+        </w:rPr>
+        <w:t>Busca Resiliente</w:t>
+      </w:r>
+      <w:r>
+        <w:rPr>
+          <w:u w:val="single"/>
+        </w:rPr>
+        <w:t>:</w:t>
+      </w:r>
+    </w:p>
+    <w:p>
+      <w:pPr>
+        <w:numPr>
+          <w:ilvl w:val="0"/>
+          <w:numId w:val="24"/>
+        </w:numPr>
+        <w:rPr>
+          <w:u w:val="single"/>
+        </w:rPr>
+      </w:pPr>
+      <w:proofErr w:type="spellStart"/>
+      <w:r>
+        <w:rPr>
+          <w:b/>
+          <w:bCs/>
+          <w:u w:val="single"/>
+        </w:rPr>
+        <w:lastRenderedPageBreak/>
+        <w:t>Polling</w:t>
+      </w:r>
+      <w:proofErr w:type="spellEnd"/>
+      <w:r>
+        <w:rPr>
+          <w:b/>
+          <w:bCs/>
+          <w:u w:val="single"/>
+        </w:rPr>
+        <w:t xml:space="preserve"> (</w:t>
+      </w:r>
+      <w:proofErr w:type="spellStart"/>
+      <w:r>
+        <w:rPr>
+          <w:b/>
+          <w:bCs/>
+          <w:u w:val="single"/>
+        </w:rPr>
+        <w:t>Retry</w:t>
+      </w:r>
+      <w:proofErr w:type="spellEnd"/>
+      <w:r>
+        <w:rPr>
+          <w:b/>
+          <w:bCs/>
+          <w:u w:val="single"/>
+        </w:rPr>
+        <w:t xml:space="preserve"> Loop):</w:t>
+      </w:r>
+      <w:r>
+        <w:rPr>
+          <w:u w:val="single"/>
+        </w:rPr>
+        <w:t xml:space="preserve"> O sistema realiza até 4 tentativas de busca com intervalo de 8 segundos entre elas.</w:t>
+      </w:r>
+    </w:p>
+    <w:p>
+      <w:pPr>
+        <w:numPr>
+          <w:ilvl w:val="0"/>
+          <w:numId w:val="24"/>
+        </w:numPr>
+        <w:rPr>
+          <w:u w:val="single"/>
+        </w:rPr>
+      </w:pPr>
+      <w:r>
+        <w:rPr>
+          <w:b/>
+          <w:bCs/>
+          <w:u w:val="single"/>
+        </w:rPr>
+        <w:t>Consulta Dupla:</w:t>
+      </w:r>
+      <w:r>
+        <w:rPr>
+          <w:u w:val="single"/>
+        </w:rPr>
+        <w:t xml:space="preserve"> O serviço verifica primeiro o campo </w:t>
+      </w:r>
+      <w:proofErr w:type="spellStart"/>
+      <w:r>
+        <w:rPr>
+          <w:u w:val="single"/>
+        </w:rPr>
+        <w:t>transactionReceiptUrl</w:t>
+      </w:r>
+      <w:proofErr w:type="spellEnd"/>
+      <w:r>
+        <w:rPr>
+          <w:u w:val="single"/>
+        </w:rPr>
+        <w:t xml:space="preserve"> no objeto principal da fatura e, em seguida, o </w:t>
+      </w:r>
+      <w:proofErr w:type="spellStart"/>
+      <w:r>
+        <w:rPr>
+          <w:u w:val="single"/>
+        </w:rPr>
+        <w:t>endpoint</w:t>
+      </w:r>
+      <w:proofErr w:type="spellEnd"/>
+      <w:r>
+        <w:rPr>
+          <w:u w:val="single"/>
+        </w:rPr>
+        <w:t xml:space="preserve"> de recibo (/</w:t>
+      </w:r>
+      <w:proofErr w:type="spellStart"/>
+      <w:r>
+        <w:rPr>
+          <w:u w:val="single"/>
+        </w:rPr>
+        <w:t>receipt</w:t>
+      </w:r>
+      <w:proofErr w:type="spellEnd"/>
+      <w:r>
+        <w:rPr>
+          <w:u w:val="single"/>
+        </w:rPr>
+        <w:t>).</w:t>
+      </w:r>
+    </w:p>
+    <w:p>
+      <w:pPr>
+        <w:numPr>
+          <w:ilvl w:val="0"/>
+          <w:numId w:val="24"/>
+        </w:numPr>
+        <w:rPr>
+          <w:u w:val="single"/>
+        </w:rPr>
+      </w:pPr>
+      <w:proofErr w:type="spellStart"/>
+      <w:r>
+        <w:rPr>
+          <w:b/>
+          <w:bCs/>
+          <w:u w:val="single"/>
+        </w:rPr>
+        <w:t>Template</w:t>
+      </w:r>
+      <w:proofErr w:type="spellEnd"/>
+      <w:r>
+        <w:rPr>
+          <w:b/>
+          <w:bCs/>
+          <w:u w:val="single"/>
+        </w:rPr>
+        <w:t xml:space="preserve"> Profissional:</w:t>
+      </w:r>
+      <w:r>
+        <w:rPr>
+          <w:u w:val="single"/>
+        </w:rPr>
+        <w:t xml:space="preserve"> Implementação da mensagem no estilo </w:t>
+      </w:r>
+      <w:proofErr w:type="spellStart"/>
+      <w:r>
+        <w:rPr>
+          <w:i/>
+          <w:iCs/>
+          <w:u w:val="single"/>
+        </w:rPr>
+        <w:t>Executive</w:t>
+      </w:r>
+      <w:proofErr w:type="spellEnd"/>
+      <w:r>
+        <w:rPr>
+          <w:u w:val="single"/>
+        </w:rPr>
+        <w:t xml:space="preserve"> (Opção 2), garantindo uma comunicação formal e clara com o cliente final.</w:t>
+      </w:r>
+    </w:p>
+    <w:p>
+      <w:pPr>
+        <w:rPr>
+          <w:b/>
+          <w:bCs/>
+          <w:u w:val="single"/>
+        </w:rPr>
+      </w:pPr>
+      <w:r>
+        <w:rPr>
+          <w:b/>
+          <w:bCs/>
+          <w:u w:val="single"/>
+        </w:rPr>
+        <w:t>4. Registro de Testes e Entidades</w:t>
+      </w:r>
+    </w:p>
+    <w:p>
+      <w:pPr>
+        <w:rPr>
+          <w:u w:val="single"/>
+        </w:rPr>
+      </w:pPr>
+      <w:r>
+        <w:rPr>
+          <w:u w:val="single"/>
+        </w:rPr>
+        <w:t>Durante o desenvolvimento, as seguintes entidades e faturas foram validadas com sucesso:</w:t>
+      </w:r>
+    </w:p>
+    <w:tbl>
+      <w:tblPr>
+        <w:tblW w:w="0" w:type="auto"/>
+        <w:tblCellMar>
+          <w:top w:w="15" w:type="dxa"/>
+          <w:left w:w="15" w:type="dxa"/>
+          <w:bottom w:w="15" w:type="dxa"/>
+          <w:right w:w="15" w:type="dxa"/>
+        </w:tblCellMar>
+        <w:tblLook w:val="04A0" w:firstRow="1" w:lastRow="0" w:firstColumn="1" w:lastColumn="0" w:noHBand="0" w:noVBand="1"/>
+      </w:tblPr>
+      <w:tblGrid>
+        <w:gridCol w:w="2817"/>
+        <w:gridCol w:w="2722"/>
+        <w:gridCol w:w="2949"/>
+      </w:tblGrid>
+      <w:tr>
+        <w:trPr>
+          <w:tblHeader/>
+        </w:trPr>
+        <w:tc>
+          <w:tcPr>
+            <w:tcW w:w="0" w:type="auto"/>
+            <w:tcBorders>
+              <w:top w:val="single" w:sz="6" w:space="0" w:color="000000"/>
+              <w:left w:val="single" w:sz="6" w:space="0" w:color="000000"/>
+              <w:bottom w:val="single" w:sz="6" w:space="0" w:color="000000"/>
+              <w:right w:val="single" w:sz="6" w:space="0" w:color="000000"/>
+            </w:tcBorders>
+            <w:shd w:val="clear" w:color="auto" w:fill="F2F2F2"/>
+            <w:tcMar>
+              <w:top w:w="150" w:type="dxa"/>
+              <w:left w:w="150" w:type="dxa"/>
+              <w:bottom w:w="150" w:type="dxa"/>
+              <w:right w:w="150" w:type="dxa"/>
+            </w:tcMar>
+            <w:hideMark/>
+          </w:tcPr>
+          <w:p>
+            <w:pPr>
+              <w:rPr>
+                <w:b/>
+                <w:bCs/>
+                <w:u w:val="single"/>
+              </w:rPr>
+            </w:pPr>
+            <w:r>
+              <w:rPr>
+                <w:u w:val="single"/>
+              </w:rPr>
+              <w:t>Cliente / Entidade</w:t>
+            </w:r>
+          </w:p>
+        </w:tc>
+        <w:tc>
+          <w:tcPr>
+            <w:tcW w:w="0" w:type="auto"/>
+            <w:tcBorders>
+              <w:top w:val="single" w:sz="6" w:space="0" w:color="000000"/>
+              <w:left w:val="single" w:sz="6" w:space="0" w:color="000000"/>
+              <w:bottom w:val="single" w:sz="6" w:space="0" w:color="000000"/>
+              <w:right w:val="single" w:sz="6" w:space="0" w:color="000000"/>
+            </w:tcBorders>
+            <w:shd w:val="clear" w:color="auto" w:fill="F2F2F2"/>
+            <w:tcMar>
+              <w:top w:w="150" w:type="dxa"/>
+              <w:left w:w="150" w:type="dxa"/>
+              <w:bottom w:w="150" w:type="dxa"/>
+              <w:right w:w="150" w:type="dxa"/>
+            </w:tcMar>
+            <w:hideMark/>
+          </w:tcPr>
+          <w:p>
+            <w:pPr>
+              <w:rPr>
+                <w:b/>
+                <w:bCs/>
+                <w:u w:val="single"/>
+              </w:rPr>
+            </w:pPr>
+            <w:r>
+              <w:rPr>
+                <w:u w:val="single"/>
+              </w:rPr>
+              <w:t>ID da Fatura (</w:t>
+            </w:r>
+            <w:proofErr w:type="spellStart"/>
+            <w:r>
+              <w:rPr>
+                <w:u w:val="single"/>
+              </w:rPr>
+              <w:t>Sandbox</w:t>
+            </w:r>
+            <w:proofErr w:type="spellEnd"/>
+            <w:r>
+              <w:rPr>
+                <w:u w:val="single"/>
+              </w:rPr>
+              <w:t>)</w:t>
+            </w:r>
+          </w:p>
+        </w:tc>
+        <w:tc>
+          <w:tcPr>
+            <w:tcW w:w="0" w:type="auto"/>
+            <w:tcBorders>
+              <w:top w:val="single" w:sz="6" w:space="0" w:color="000000"/>
+              <w:left w:val="single" w:sz="6" w:space="0" w:color="000000"/>
+              <w:bottom w:val="single" w:sz="6" w:space="0" w:color="000000"/>
+              <w:right w:val="single" w:sz="6" w:space="0" w:color="000000"/>
+            </w:tcBorders>
+            <w:shd w:val="clear" w:color="auto" w:fill="F2F2F2"/>
+            <w:tcMar>
+              <w:top w:w="150" w:type="dxa"/>
+              <w:left w:w="150" w:type="dxa"/>
+              <w:bottom w:w="150" w:type="dxa"/>
+              <w:right w:w="150" w:type="dxa"/>
+            </w:tcMar>
+            <w:hideMark/>
+          </w:tcPr>
+          <w:p>
+            <w:pPr>
+              <w:rPr>
+                <w:b/>
+                <w:bCs/>
+                <w:u w:val="single"/>
+              </w:rPr>
+            </w:pPr>
+            <w:r>
+              <w:rPr>
+                <w:u w:val="single"/>
+              </w:rPr>
+              <w:t>Resultado</w:t>
+            </w:r>
+          </w:p>
+          <w:p>
+            <w:pPr>
+              <w:rPr>
+                <w:b/>
+                <w:bCs/>
+                <w:u w:val="single"/>
+              </w:rPr>
+            </w:pPr>
+            <w:r>
+              <w:rPr>
+                <w:u w:val="single"/>
+              </w:rPr>
+              <w:t> </w:t>
+            </w:r>
+          </w:p>
+        </w:tc>
+      </w:tr>
+      <w:tr>
+        <w:tc>
+          <w:tcPr>
+            <w:tcW w:w="0" w:type="auto"/>
+            <w:tcBorders>
+              <w:top w:val="single" w:sz="6" w:space="0" w:color="000000"/>
+              <w:left w:val="single" w:sz="6" w:space="0" w:color="000000"/>
+              <w:bottom w:val="single" w:sz="6" w:space="0" w:color="000000"/>
+              <w:right w:val="single" w:sz="6" w:space="0" w:color="000000"/>
+            </w:tcBorders>
+            <w:tcMar>
+              <w:top w:w="150" w:type="dxa"/>
+              <w:left w:w="150" w:type="dxa"/>
+              <w:bottom w:w="150" w:type="dxa"/>
+              <w:right w:w="150" w:type="dxa"/>
+            </w:tcMar>
+            <w:hideMark/>
+          </w:tcPr>
+          <w:p>
+            <w:pPr>
+              <w:rPr>
+                <w:u w:val="single"/>
+              </w:rPr>
+            </w:pPr>
+            <w:r>
+              <w:rPr>
+                <w:u w:val="single"/>
+              </w:rPr>
+              <w:t>Escola de Música RP - Bangu</w:t>
+            </w:r>
+          </w:p>
+        </w:tc>
+        <w:tc>
+          <w:tcPr>
+            <w:tcW w:w="0" w:type="auto"/>
+            <w:tcBorders>
+              <w:top w:val="single" w:sz="6" w:space="0" w:color="000000"/>
+              <w:left w:val="single" w:sz="6" w:space="0" w:color="000000"/>
+              <w:bottom w:val="single" w:sz="6" w:space="0" w:color="000000"/>
+              <w:right w:val="single" w:sz="6" w:space="0" w:color="000000"/>
+            </w:tcBorders>
+            <w:tcMar>
+              <w:top w:w="150" w:type="dxa"/>
+              <w:left w:w="150" w:type="dxa"/>
+              <w:bottom w:w="150" w:type="dxa"/>
+              <w:right w:w="150" w:type="dxa"/>
+            </w:tcMar>
+            <w:hideMark/>
+          </w:tcPr>
+          <w:p>
+            <w:pPr>
+              <w:rPr>
+                <w:u w:val="single"/>
+              </w:rPr>
+            </w:pPr>
+            <w:r>
+              <w:rPr>
+                <w:u w:val="single"/>
+              </w:rPr>
+              <w:t>pay_31ut6sdhqyq2tpug</w:t>
+            </w:r>
+          </w:p>
+        </w:tc>
+        <w:tc>
+          <w:tcPr>
+            <w:tcW w:w="0" w:type="auto"/>
+            <w:tcBorders>
+              <w:top w:val="single" w:sz="6" w:space="0" w:color="000000"/>
+              <w:left w:val="single" w:sz="6" w:space="0" w:color="000000"/>
+              <w:bottom w:val="single" w:sz="6" w:space="0" w:color="000000"/>
+              <w:right w:val="single" w:sz="6" w:space="0" w:color="000000"/>
+            </w:tcBorders>
+            <w:tcMar>
+              <w:top w:w="150" w:type="dxa"/>
+              <w:left w:w="150" w:type="dxa"/>
+              <w:bottom w:w="150" w:type="dxa"/>
+              <w:right w:w="150" w:type="dxa"/>
+            </w:tcMar>
+            <w:hideMark/>
+          </w:tcPr>
+          <w:p>
+            <w:pPr>
+              <w:rPr>
+                <w:u w:val="single"/>
+              </w:rPr>
+            </w:pPr>
+            <w:r>
+              <w:rPr>
+                <w:rFonts w:ascii="Segoe UI Emoji" w:hAnsi="Segoe UI Emoji" w:cs="Segoe UI Emoji"/>
+                <w:u w:val="single"/>
+              </w:rPr>
+              <w:t>✅</w:t>
+            </w:r>
+            <w:r>
+              <w:rPr>
+                <w:u w:val="single"/>
+              </w:rPr>
+              <w:t xml:space="preserve"> Sucesso (Recibo Enviado)</w:t>
+            </w:r>
+          </w:p>
+        </w:tc>
+      </w:tr>
+      <w:tr>
+        <w:tc>
+          <w:tcPr>
+            <w:tcW w:w="0" w:type="auto"/>
+            <w:tcBorders>
+              <w:top w:val="single" w:sz="6" w:space="0" w:color="000000"/>
+              <w:left w:val="single" w:sz="6" w:space="0" w:color="000000"/>
+              <w:bottom w:val="single" w:sz="6" w:space="0" w:color="000000"/>
+              <w:right w:val="single" w:sz="6" w:space="0" w:color="000000"/>
+            </w:tcBorders>
+            <w:tcMar>
+              <w:top w:w="150" w:type="dxa"/>
+              <w:left w:w="150" w:type="dxa"/>
+              <w:bottom w:w="150" w:type="dxa"/>
+              <w:right w:w="150" w:type="dxa"/>
+            </w:tcMar>
+            <w:hideMark/>
+          </w:tcPr>
+          <w:p>
+            <w:pPr>
+              <w:rPr>
+                <w:u w:val="single"/>
+              </w:rPr>
+            </w:pPr>
+            <w:proofErr w:type="spellStart"/>
+            <w:r>
+              <w:rPr>
+                <w:u w:val="single"/>
+              </w:rPr>
+              <w:t>Stellar</w:t>
+            </w:r>
+            <w:proofErr w:type="spellEnd"/>
+            <w:r>
+              <w:rPr>
+                <w:u w:val="single"/>
+              </w:rPr>
+              <w:t xml:space="preserve"> </w:t>
+            </w:r>
+            <w:proofErr w:type="spellStart"/>
+            <w:r>
+              <w:rPr>
+                <w:u w:val="single"/>
+              </w:rPr>
+              <w:t>Syntec</w:t>
+            </w:r>
+            <w:proofErr w:type="spellEnd"/>
+            <w:r>
+              <w:rPr>
+                <w:u w:val="single"/>
+              </w:rPr>
+              <w:t xml:space="preserve"> (Teste Interno)</w:t>
+            </w:r>
+          </w:p>
+        </w:tc>
+        <w:tc>
+          <w:tcPr>
+            <w:tcW w:w="0" w:type="auto"/>
+            <w:tcBorders>
+              <w:top w:val="single" w:sz="6" w:space="0" w:color="000000"/>
+              <w:left w:val="single" w:sz="6" w:space="0" w:color="000000"/>
+              <w:bottom w:val="single" w:sz="6" w:space="0" w:color="000000"/>
+              <w:right w:val="single" w:sz="6" w:space="0" w:color="000000"/>
+            </w:tcBorders>
+            <w:tcMar>
+              <w:top w:w="150" w:type="dxa"/>
+              <w:left w:w="150" w:type="dxa"/>
+              <w:bottom w:w="150" w:type="dxa"/>
+              <w:right w:w="150" w:type="dxa"/>
+            </w:tcMar>
+            <w:hideMark/>
+          </w:tcPr>
+          <w:p>
+            <w:pPr>
+              <w:rPr>
+                <w:u w:val="single"/>
+              </w:rPr>
+            </w:pPr>
+            <w:r>
+              <w:rPr>
+                <w:u w:val="single"/>
+              </w:rPr>
+              <w:t>pay_f2i1muihne0d0tf6</w:t>
+            </w:r>
+          </w:p>
+        </w:tc>
+        <w:tc>
+          <w:tcPr>
+            <w:tcW w:w="0" w:type="auto"/>
+            <w:tcBorders>
+              <w:top w:val="single" w:sz="6" w:space="0" w:color="000000"/>
+              <w:left w:val="single" w:sz="6" w:space="0" w:color="000000"/>
+              <w:bottom w:val="single" w:sz="6" w:space="0" w:color="000000"/>
+              <w:right w:val="single" w:sz="6" w:space="0" w:color="000000"/>
+            </w:tcBorders>
+            <w:tcMar>
+              <w:top w:w="150" w:type="dxa"/>
+              <w:left w:w="150" w:type="dxa"/>
+              <w:bottom w:w="150" w:type="dxa"/>
+              <w:right w:w="150" w:type="dxa"/>
+            </w:tcMar>
+            <w:hideMark/>
+          </w:tcPr>
+          <w:p>
+            <w:pPr>
+              <w:rPr>
+                <w:u w:val="single"/>
+              </w:rPr>
+            </w:pPr>
+            <w:r>
+              <w:rPr>
+                <w:rFonts w:ascii="Segoe UI Emoji" w:hAnsi="Segoe UI Emoji" w:cs="Segoe UI Emoji"/>
+                <w:u w:val="single"/>
+              </w:rPr>
+              <w:t>✅</w:t>
+            </w:r>
+            <w:r>
+              <w:rPr>
+                <w:u w:val="single"/>
+              </w:rPr>
+              <w:t xml:space="preserve"> Sucesso (Fluxo Completo)</w:t>
+            </w:r>
+          </w:p>
+        </w:tc>
+      </w:tr>
+    </w:tbl>
+    <w:p>
+      <w:pPr>
+        <w:rPr>
+          <w:b/>
+          <w:bCs/>
+          <w:u w:val="single"/>
+        </w:rPr>
+      </w:pPr>
+      <w:r>
+        <w:rPr>
+          <w:b/>
+          <w:bCs/>
+          <w:u w:val="single"/>
+        </w:rPr>
+        <w:t>5. Próximos Passos</w:t>
+      </w:r>
+    </w:p>
+    <w:p>
+      <w:pPr>
+        <w:rPr>
+          <w:u w:val="single"/>
+        </w:rPr>
+      </w:pPr>
+      <w:r>
+        <w:rPr>
+          <w:u w:val="single"/>
+        </w:rPr>
+        <w:t xml:space="preserve">O desenvolvimento continuará com foco no refinamento da automação do </w:t>
+      </w:r>
+      <w:proofErr w:type="spellStart"/>
+      <w:r>
+        <w:rPr>
+          <w:u w:val="single"/>
+        </w:rPr>
+        <w:t>Asaas</w:t>
+      </w:r>
+      <w:proofErr w:type="spellEnd"/>
+      <w:r>
+        <w:rPr>
+          <w:u w:val="single"/>
+        </w:rPr>
+        <w:t>, incluindo:</w:t>
+      </w:r>
+    </w:p>
+    <w:p>
+      <w:pPr>
+        <w:numPr>
+          <w:ilvl w:val="0"/>
+          <w:numId w:val="25"/>
+        </w:numPr>
+        <w:rPr>
+          <w:u w:val="single"/>
+        </w:rPr>
+      </w:pPr>
+      <w:r>
+        <w:rPr>
+          <w:b/>
+          <w:bCs/>
+          <w:u w:val="single"/>
+        </w:rPr>
+        <w:t xml:space="preserve">Ajustes na Automação do </w:t>
+      </w:r>
+      <w:proofErr w:type="spellStart"/>
+      <w:r>
+        <w:rPr>
+          <w:b/>
+          <w:bCs/>
+          <w:u w:val="single"/>
+        </w:rPr>
+        <w:t>Asaas</w:t>
+      </w:r>
+      <w:proofErr w:type="spellEnd"/>
+      <w:r>
+        <w:rPr>
+          <w:b/>
+          <w:bCs/>
+          <w:u w:val="single"/>
+        </w:rPr>
+        <w:t>:</w:t>
+      </w:r>
+      <w:r>
+        <w:rPr>
+          <w:u w:val="single"/>
+        </w:rPr>
+        <w:t xml:space="preserve"> Refinamento contínuo das regras de negócio e tratamento de exceções.</w:t>
+      </w:r>
+    </w:p>
+    <w:p>
+      <w:pPr>
+        <w:numPr>
+          <w:ilvl w:val="0"/>
+          <w:numId w:val="25"/>
+        </w:numPr>
+        <w:rPr>
+          <w:u w:val="single"/>
+        </w:rPr>
+      </w:pPr>
+      <w:r>
+        <w:rPr>
+          <w:b/>
+          <w:bCs/>
+          <w:u w:val="single"/>
+        </w:rPr>
+        <w:t>Notificações Proativas:</w:t>
+      </w:r>
+      <w:r>
+        <w:rPr>
+          <w:u w:val="single"/>
+        </w:rPr>
+        <w:t xml:space="preserve"> Implementação de alertas de vencimento (lembretes de pagamento) via WhatsApp.</w:t>
+      </w:r>
+    </w:p>
+    <w:p>
+      <w:pPr>
+        <w:numPr>
+          <w:ilvl w:val="0"/>
+          <w:numId w:val="25"/>
+        </w:numPr>
+        <w:rPr>
+          <w:u w:val="single"/>
+        </w:rPr>
+      </w:pPr>
+      <w:r>
+        <w:rPr>
+          <w:b/>
+          <w:bCs/>
+          <w:u w:val="single"/>
+        </w:rPr>
+        <w:t>Escalabilidade:</w:t>
+      </w:r>
+      <w:r>
+        <w:rPr>
+          <w:u w:val="single"/>
+        </w:rPr>
+        <w:t xml:space="preserve"> Preparação do ambiente para integração com novos clientes (</w:t>
+      </w:r>
+      <w:proofErr w:type="spellStart"/>
+      <w:r>
+        <w:rPr>
+          <w:u w:val="single"/>
+        </w:rPr>
+        <w:t>ex</w:t>
+      </w:r>
+      <w:proofErr w:type="spellEnd"/>
+      <w:r>
+        <w:rPr>
+          <w:u w:val="single"/>
+        </w:rPr>
+        <w:t>: Clínicas Médicas e outras Unidades Escolares).</w:t>
       </w:r>
     </w:p>
     <w:p>
@@ -5307,6 +6917,155 @@
     </w:lvl>
   </w:abstractNum>
   <w:abstractNum w:abstractNumId="3" w15:restartNumberingAfterBreak="0">
+    <w:nsid w:val="087D5208"/>
+    <w:multiLevelType w:val="multilevel"/>
+    <w:tmpl w:val="740A240E"/>
+    <w:lvl w:ilvl="0">
+      <w:start w:val="1"/>
+      <w:numFmt w:val="bullet"/>
+      <w:lvlText w:val=""/>
+      <w:lvlJc w:val="left"/>
+      <w:pPr>
+        <w:tabs>
+          <w:tab w:val="num" w:pos="720"/>
+        </w:tabs>
+        <w:ind w:left="720" w:hanging="360"/>
+      </w:pPr>
+      <w:rPr>
+        <w:rFonts w:ascii="Symbol" w:hAnsi="Symbol" w:hint="default"/>
+        <w:sz w:val="20"/>
+      </w:rPr>
+    </w:lvl>
+    <w:lvl w:ilvl="1" w:tentative="1">
+      <w:start w:val="1"/>
+      <w:numFmt w:val="bullet"/>
+      <w:lvlText w:val="o"/>
+      <w:lvlJc w:val="left"/>
+      <w:pPr>
+        <w:tabs>
+          <w:tab w:val="num" w:pos="1440"/>
+        </w:tabs>
+        <w:ind w:left="1440" w:hanging="360"/>
+      </w:pPr>
+      <w:rPr>
+        <w:rFonts w:ascii="Courier New" w:hAnsi="Courier New" w:hint="default"/>
+        <w:sz w:val="20"/>
+      </w:rPr>
+    </w:lvl>
+    <w:lvl w:ilvl="2" w:tentative="1">
+      <w:start w:val="1"/>
+      <w:numFmt w:val="bullet"/>
+      <w:lvlText w:val=""/>
+      <w:lvlJc w:val="left"/>
+      <w:pPr>
+        <w:tabs>
+          <w:tab w:val="num" w:pos="2160"/>
+        </w:tabs>
+        <w:ind w:left="2160" w:hanging="360"/>
+      </w:pPr>
+      <w:rPr>
+        <w:rFonts w:ascii="Wingdings" w:hAnsi="Wingdings" w:hint="default"/>
+        <w:sz w:val="20"/>
+      </w:rPr>
+    </w:lvl>
+    <w:lvl w:ilvl="3" w:tentative="1">
+      <w:start w:val="1"/>
+      <w:numFmt w:val="bullet"/>
+      <w:lvlText w:val=""/>
+      <w:lvlJc w:val="left"/>
+      <w:pPr>
+        <w:tabs>
+          <w:tab w:val="num" w:pos="2880"/>
+        </w:tabs>
+        <w:ind w:left="2880" w:hanging="360"/>
+      </w:pPr>
+      <w:rPr>
+        <w:rFonts w:ascii="Wingdings" w:hAnsi="Wingdings" w:hint="default"/>
+        <w:sz w:val="20"/>
+      </w:rPr>
+    </w:lvl>
+    <w:lvl w:ilvl="4" w:tentative="1">
+      <w:start w:val="1"/>
+      <w:numFmt w:val="bullet"/>
+      <w:lvlText w:val=""/>
+      <w:lvlJc w:val="left"/>
+      <w:pPr>
+        <w:tabs>
+          <w:tab w:val="num" w:pos="3600"/>
+        </w:tabs>
+        <w:ind w:left="3600" w:hanging="360"/>
+      </w:pPr>
+      <w:rPr>
+        <w:rFonts w:ascii="Wingdings" w:hAnsi="Wingdings" w:hint="default"/>
+        <w:sz w:val="20"/>
+      </w:rPr>
+    </w:lvl>
+    <w:lvl w:ilvl="5" w:tentative="1">
+      <w:start w:val="1"/>
+      <w:numFmt w:val="bullet"/>
+      <w:lvlText w:val=""/>
+      <w:lvlJc w:val="left"/>
+      <w:pPr>
+        <w:tabs>
+          <w:tab w:val="num" w:pos="4320"/>
+        </w:tabs>
+        <w:ind w:left="4320" w:hanging="360"/>
+      </w:pPr>
+      <w:rPr>
+        <w:rFonts w:ascii="Wingdings" w:hAnsi="Wingdings" w:hint="default"/>
+        <w:sz w:val="20"/>
+      </w:rPr>
+    </w:lvl>
+    <w:lvl w:ilvl="6" w:tentative="1">
+      <w:start w:val="1"/>
+      <w:numFmt w:val="bullet"/>
+      <w:lvlText w:val=""/>
+      <w:lvlJc w:val="left"/>
+      <w:pPr>
+        <w:tabs>
+          <w:tab w:val="num" w:pos="5040"/>
+        </w:tabs>
+        <w:ind w:left="5040" w:hanging="360"/>
+      </w:pPr>
+      <w:rPr>
+        <w:rFonts w:ascii="Wingdings" w:hAnsi="Wingdings" w:hint="default"/>
+        <w:sz w:val="20"/>
+      </w:rPr>
+    </w:lvl>
+    <w:lvl w:ilvl="7" w:tentative="1">
+      <w:start w:val="1"/>
+      <w:numFmt w:val="bullet"/>
+      <w:lvlText w:val=""/>
+      <w:lvlJc w:val="left"/>
+      <w:pPr>
+        <w:tabs>
+          <w:tab w:val="num" w:pos="5760"/>
+        </w:tabs>
+        <w:ind w:left="5760" w:hanging="360"/>
+      </w:pPr>
+      <w:rPr>
+        <w:rFonts w:ascii="Wingdings" w:hAnsi="Wingdings" w:hint="default"/>
+        <w:sz w:val="20"/>
+      </w:rPr>
+    </w:lvl>
+    <w:lvl w:ilvl="8" w:tentative="1">
+      <w:start w:val="1"/>
+      <w:numFmt w:val="bullet"/>
+      <w:lvlText w:val=""/>
+      <w:lvlJc w:val="left"/>
+      <w:pPr>
+        <w:tabs>
+          <w:tab w:val="num" w:pos="6480"/>
+        </w:tabs>
+        <w:ind w:left="6480" w:hanging="360"/>
+      </w:pPr>
+      <w:rPr>
+        <w:rFonts w:ascii="Wingdings" w:hAnsi="Wingdings" w:hint="default"/>
+        <w:sz w:val="20"/>
+      </w:rPr>
+    </w:lvl>
+  </w:abstractNum>
+  <w:abstractNum w:abstractNumId="4" w15:restartNumberingAfterBreak="0">
     <w:nsid w:val="0B0D1E84"/>
     <w:multiLevelType w:val="multilevel"/>
     <w:tmpl w:val="C366CB9A"/>
@@ -5455,7 +7214,7 @@
       </w:rPr>
     </w:lvl>
   </w:abstractNum>
-  <w:abstractNum w:abstractNumId="4" w15:restartNumberingAfterBreak="0">
+  <w:abstractNum w:abstractNumId="5" w15:restartNumberingAfterBreak="0">
     <w:nsid w:val="18E24FC3"/>
     <w:multiLevelType w:val="multilevel"/>
     <w:tmpl w:val="810888D2"/>
@@ -5604,7 +7363,7 @@
       </w:rPr>
     </w:lvl>
   </w:abstractNum>
-  <w:abstractNum w:abstractNumId="5" w15:restartNumberingAfterBreak="0">
+  <w:abstractNum w:abstractNumId="6" w15:restartNumberingAfterBreak="0">
     <w:nsid w:val="1A526397"/>
     <w:multiLevelType w:val="multilevel"/>
     <w:tmpl w:val="ACF857F6"/>
@@ -5753,7 +7512,120 @@
       </w:rPr>
     </w:lvl>
   </w:abstractNum>
-  <w:abstractNum w:abstractNumId="6" w15:restartNumberingAfterBreak="0">
+  <w:abstractNum w:abstractNumId="7" w15:restartNumberingAfterBreak="0">
+    <w:nsid w:val="1DC71BA3"/>
+    <w:multiLevelType w:val="multilevel"/>
+    <w:tmpl w:val="CA8C1B8A"/>
+    <w:lvl w:ilvl="0">
+      <w:start w:val="1"/>
+      <w:numFmt w:val="decimal"/>
+      <w:lvlText w:val="%1."/>
+      <w:lvlJc w:val="left"/>
+      <w:pPr>
+        <w:tabs>
+          <w:tab w:val="num" w:pos="720"/>
+        </w:tabs>
+        <w:ind w:left="720" w:hanging="360"/>
+      </w:pPr>
+    </w:lvl>
+    <w:lvl w:ilvl="1" w:tentative="1">
+      <w:start w:val="1"/>
+      <w:numFmt w:val="decimal"/>
+      <w:lvlText w:val="%2."/>
+      <w:lvlJc w:val="left"/>
+      <w:pPr>
+        <w:tabs>
+          <w:tab w:val="num" w:pos="1440"/>
+        </w:tabs>
+        <w:ind w:left="1440" w:hanging="360"/>
+      </w:pPr>
+    </w:lvl>
+    <w:lvl w:ilvl="2" w:tentative="1">
+      <w:start w:val="1"/>
+      <w:numFmt w:val="decimal"/>
+      <w:lvlText w:val="%3."/>
+      <w:lvlJc w:val="left"/>
+      <w:pPr>
+        <w:tabs>
+          <w:tab w:val="num" w:pos="2160"/>
+        </w:tabs>
+        <w:ind w:left="2160" w:hanging="360"/>
+      </w:pPr>
+    </w:lvl>
+    <w:lvl w:ilvl="3" w:tentative="1">
+      <w:start w:val="1"/>
+      <w:numFmt w:val="decimal"/>
+      <w:lvlText w:val="%4."/>
+      <w:lvlJc w:val="left"/>
+      <w:pPr>
+        <w:tabs>
+          <w:tab w:val="num" w:pos="2880"/>
+        </w:tabs>
+        <w:ind w:left="2880" w:hanging="360"/>
+      </w:pPr>
+    </w:lvl>
+    <w:lvl w:ilvl="4" w:tentative="1">
+      <w:start w:val="1"/>
+      <w:numFmt w:val="decimal"/>
+      <w:lvlText w:val="%5."/>
+      <w:lvlJc w:val="left"/>
+      <w:pPr>
+        <w:tabs>
+          <w:tab w:val="num" w:pos="3600"/>
+        </w:tabs>
+        <w:ind w:left="3600" w:hanging="360"/>
+      </w:pPr>
+    </w:lvl>
+    <w:lvl w:ilvl="5" w:tentative="1">
+      <w:start w:val="1"/>
+      <w:numFmt w:val="decimal"/>
+      <w:lvlText w:val="%6."/>
+      <w:lvlJc w:val="left"/>
+      <w:pPr>
+        <w:tabs>
+          <w:tab w:val="num" w:pos="4320"/>
+        </w:tabs>
+        <w:ind w:left="4320" w:hanging="360"/>
+      </w:pPr>
+    </w:lvl>
+    <w:lvl w:ilvl="6" w:tentative="1">
+      <w:start w:val="1"/>
+      <w:numFmt w:val="decimal"/>
+      <w:lvlText w:val="%7."/>
+      <w:lvlJc w:val="left"/>
+      <w:pPr>
+        <w:tabs>
+          <w:tab w:val="num" w:pos="5040"/>
+        </w:tabs>
+        <w:ind w:left="5040" w:hanging="360"/>
+      </w:pPr>
+    </w:lvl>
+    <w:lvl w:ilvl="7" w:tentative="1">
+      <w:start w:val="1"/>
+      <w:numFmt w:val="decimal"/>
+      <w:lvlText w:val="%8."/>
+      <w:lvlJc w:val="left"/>
+      <w:pPr>
+        <w:tabs>
+          <w:tab w:val="num" w:pos="5760"/>
+        </w:tabs>
+        <w:ind w:left="5760" w:hanging="360"/>
+      </w:pPr>
+    </w:lvl>
+    <w:lvl w:ilvl="8" w:tentative="1">
+      <w:start w:val="1"/>
+      <w:numFmt w:val="decimal"/>
+      <w:lvlText w:val="%9."/>
+      <w:lvlJc w:val="left"/>
+      <w:pPr>
+        <w:tabs>
+          <w:tab w:val="num" w:pos="6480"/>
+        </w:tabs>
+        <w:ind w:left="6480" w:hanging="360"/>
+      </w:pPr>
+    </w:lvl>
+  </w:abstractNum>
+  <w:abstractNum w:abstractNumId="8" w15:restartNumberingAfterBreak="0">
     <w:nsid w:val="22DB61D8"/>
     <w:multiLevelType w:val="multilevel"/>
     <w:tmpl w:val="D77AF5CA"/>
@@ -5866,7 +7738,7 @@
       </w:pPr>
     </w:lvl>
   </w:abstractNum>
-  <w:abstractNum w:abstractNumId="7" w15:restartNumberingAfterBreak="0">
+  <w:abstractNum w:abstractNumId="9" w15:restartNumberingAfterBreak="0">
     <w:nsid w:val="2AD55784"/>
     <w:multiLevelType w:val="multilevel"/>
     <w:tmpl w:val="6D64FCC6"/>
@@ -6015,7 +7887,7 @@
       </w:rPr>
     </w:lvl>
   </w:abstractNum>
-  <w:abstractNum w:abstractNumId="8" w15:restartNumberingAfterBreak="0">
+  <w:abstractNum w:abstractNumId="10" w15:restartNumberingAfterBreak="0">
     <w:nsid w:val="2B8E2D68"/>
     <w:multiLevelType w:val="multilevel"/>
     <w:tmpl w:val="62DCFC16"/>
@@ -6164,7 +8036,305 @@
       </w:rPr>
     </w:lvl>
   </w:abstractNum>
-  <w:abstractNum w:abstractNumId="9" w15:restartNumberingAfterBreak="0">
+  <w:abstractNum w:abstractNumId="11" w15:restartNumberingAfterBreak="0">
+    <w:nsid w:val="2D391B75"/>
+    <w:multiLevelType w:val="multilevel"/>
+    <w:tmpl w:val="FFC0252C"/>
+    <w:lvl w:ilvl="0">
+      <w:start w:val="1"/>
+      <w:numFmt w:val="bullet"/>
+      <w:lvlText w:val=""/>
+      <w:lvlJc w:val="left"/>
+      <w:pPr>
+        <w:tabs>
+          <w:tab w:val="num" w:pos="720"/>
+        </w:tabs>
+        <w:ind w:left="720" w:hanging="360"/>
+      </w:pPr>
+      <w:rPr>
+        <w:rFonts w:ascii="Symbol" w:hAnsi="Symbol" w:hint="default"/>
+        <w:sz w:val="20"/>
+      </w:rPr>
+    </w:lvl>
+    <w:lvl w:ilvl="1" w:tentative="1">
+      <w:start w:val="1"/>
+      <w:numFmt w:val="bullet"/>
+      <w:lvlText w:val="o"/>
+      <w:lvlJc w:val="left"/>
+      <w:pPr>
+        <w:tabs>
+          <w:tab w:val="num" w:pos="1440"/>
+        </w:tabs>
+        <w:ind w:left="1440" w:hanging="360"/>
+      </w:pPr>
+      <w:rPr>
+        <w:rFonts w:ascii="Courier New" w:hAnsi="Courier New" w:hint="default"/>
+        <w:sz w:val="20"/>
+      </w:rPr>
+    </w:lvl>
+    <w:lvl w:ilvl="2" w:tentative="1">
+      <w:start w:val="1"/>
+      <w:numFmt w:val="bullet"/>
+      <w:lvlText w:val=""/>
+      <w:lvlJc w:val="left"/>
+      <w:pPr>
+        <w:tabs>
+          <w:tab w:val="num" w:pos="2160"/>
+        </w:tabs>
+        <w:ind w:left="2160" w:hanging="360"/>
+      </w:pPr>
+      <w:rPr>
+        <w:rFonts w:ascii="Wingdings" w:hAnsi="Wingdings" w:hint="default"/>
+        <w:sz w:val="20"/>
+      </w:rPr>
+    </w:lvl>
+    <w:lvl w:ilvl="3" w:tentative="1">
+      <w:start w:val="1"/>
+      <w:numFmt w:val="bullet"/>
+      <w:lvlText w:val=""/>
+      <w:lvlJc w:val="left"/>
+      <w:pPr>
+        <w:tabs>
+          <w:tab w:val="num" w:pos="2880"/>
+        </w:tabs>
+        <w:ind w:left="2880" w:hanging="360"/>
+      </w:pPr>
+      <w:rPr>
+        <w:rFonts w:ascii="Wingdings" w:hAnsi="Wingdings" w:hint="default"/>
+        <w:sz w:val="20"/>
+      </w:rPr>
+    </w:lvl>
+    <w:lvl w:ilvl="4" w:tentative="1">
+      <w:start w:val="1"/>
+      <w:numFmt w:val="bullet"/>
+      <w:lvlText w:val=""/>
+      <w:lvlJc w:val="left"/>
+      <w:pPr>
+        <w:tabs>
+          <w:tab w:val="num" w:pos="3600"/>
+        </w:tabs>
+        <w:ind w:left="3600" w:hanging="360"/>
+      </w:pPr>
+      <w:rPr>
+        <w:rFonts w:ascii="Wingdings" w:hAnsi="Wingdings" w:hint="default"/>
+        <w:sz w:val="20"/>
+      </w:rPr>
+    </w:lvl>
+    <w:lvl w:ilvl="5" w:tentative="1">
+      <w:start w:val="1"/>
+      <w:numFmt w:val="bullet"/>
+      <w:lvlText w:val=""/>
+      <w:lvlJc w:val="left"/>
+      <w:pPr>
+        <w:tabs>
+          <w:tab w:val="num" w:pos="4320"/>
+        </w:tabs>
+        <w:ind w:left="4320" w:hanging="360"/>
+      </w:pPr>
+      <w:rPr>
+        <w:rFonts w:ascii="Wingdings" w:hAnsi="Wingdings" w:hint="default"/>
+        <w:sz w:val="20"/>
+      </w:rPr>
+    </w:lvl>
+    <w:lvl w:ilvl="6" w:tentative="1">
+      <w:start w:val="1"/>
+      <w:numFmt w:val="bullet"/>
+      <w:lvlText w:val=""/>
+      <w:lvlJc w:val="left"/>
+      <w:pPr>
+        <w:tabs>
+          <w:tab w:val="num" w:pos="5040"/>
+        </w:tabs>
+        <w:ind w:left="5040" w:hanging="360"/>
+      </w:pPr>
+      <w:rPr>
+        <w:rFonts w:ascii="Wingdings" w:hAnsi="Wingdings" w:hint="default"/>
+        <w:sz w:val="20"/>
+      </w:rPr>
+    </w:lvl>
+    <w:lvl w:ilvl="7" w:tentative="1">
+      <w:start w:val="1"/>
+      <w:numFmt w:val="bullet"/>
+      <w:lvlText w:val=""/>
+      <w:lvlJc w:val="left"/>
+      <w:pPr>
+        <w:tabs>
+          <w:tab w:val="num" w:pos="5760"/>
+        </w:tabs>
+        <w:ind w:left="5760" w:hanging="360"/>
+      </w:pPr>
+      <w:rPr>
+        <w:rFonts w:ascii="Wingdings" w:hAnsi="Wingdings" w:hint="default"/>
+        <w:sz w:val="20"/>
+      </w:rPr>
+    </w:lvl>
+    <w:lvl w:ilvl="8" w:tentative="1">
+      <w:start w:val="1"/>
+      <w:numFmt w:val="bullet"/>
+      <w:lvlText w:val=""/>
+      <w:lvlJc w:val="left"/>
+      <w:pPr>
+        <w:tabs>
+          <w:tab w:val="num" w:pos="6480"/>
+        </w:tabs>
+        <w:ind w:left="6480" w:hanging="360"/>
+      </w:pPr>
+      <w:rPr>
+        <w:rFonts w:ascii="Wingdings" w:hAnsi="Wingdings" w:hint="default"/>
+        <w:sz w:val="20"/>
+      </w:rPr>
+    </w:lvl>
+  </w:abstractNum>
+  <w:abstractNum w:abstractNumId="12" w15:restartNumberingAfterBreak="0">
+    <w:nsid w:val="2F337628"/>
+    <w:multiLevelType w:val="multilevel"/>
+    <w:tmpl w:val="453A507E"/>
+    <w:lvl w:ilvl="0">
+      <w:start w:val="1"/>
+      <w:numFmt w:val="bullet"/>
+      <w:lvlText w:val=""/>
+      <w:lvlJc w:val="left"/>
+      <w:pPr>
+        <w:tabs>
+          <w:tab w:val="num" w:pos="720"/>
+        </w:tabs>
+        <w:ind w:left="720" w:hanging="360"/>
+      </w:pPr>
+      <w:rPr>
+        <w:rFonts w:ascii="Symbol" w:hAnsi="Symbol" w:hint="default"/>
+        <w:sz w:val="20"/>
+      </w:rPr>
+    </w:lvl>
+    <w:lvl w:ilvl="1" w:tentative="1">
+      <w:start w:val="1"/>
+      <w:numFmt w:val="bullet"/>
+      <w:lvlText w:val="o"/>
+      <w:lvlJc w:val="left"/>
+      <w:pPr>
+        <w:tabs>
+          <w:tab w:val="num" w:pos="1440"/>
+        </w:tabs>
+        <w:ind w:left="1440" w:hanging="360"/>
+      </w:pPr>
+      <w:rPr>
+        <w:rFonts w:ascii="Courier New" w:hAnsi="Courier New" w:hint="default"/>
+        <w:sz w:val="20"/>
+      </w:rPr>
+    </w:lvl>
+    <w:lvl w:ilvl="2" w:tentative="1">
+      <w:start w:val="1"/>
+      <w:numFmt w:val="bullet"/>
+      <w:lvlText w:val=""/>
+      <w:lvlJc w:val="left"/>
+      <w:pPr>
+        <w:tabs>
+          <w:tab w:val="num" w:pos="2160"/>
+        </w:tabs>
+        <w:ind w:left="2160" w:hanging="360"/>
+      </w:pPr>
+      <w:rPr>
+        <w:rFonts w:ascii="Wingdings" w:hAnsi="Wingdings" w:hint="default"/>
+        <w:sz w:val="20"/>
+      </w:rPr>
+    </w:lvl>
+    <w:lvl w:ilvl="3" w:tentative="1">
+      <w:start w:val="1"/>
+      <w:numFmt w:val="bullet"/>
+      <w:lvlText w:val=""/>
+      <w:lvlJc w:val="left"/>
+      <w:pPr>
+        <w:tabs>
+          <w:tab w:val="num" w:pos="2880"/>
+        </w:tabs>
+        <w:ind w:left="2880" w:hanging="360"/>
+      </w:pPr>
+      <w:rPr>
+        <w:rFonts w:ascii="Wingdings" w:hAnsi="Wingdings" w:hint="default"/>
+        <w:sz w:val="20"/>
+      </w:rPr>
+    </w:lvl>
+    <w:lvl w:ilvl="4" w:tentative="1">
+      <w:start w:val="1"/>
+      <w:numFmt w:val="bullet"/>
+      <w:lvlText w:val=""/>
+      <w:lvlJc w:val="left"/>
+      <w:pPr>
+        <w:tabs>
+          <w:tab w:val="num" w:pos="3600"/>
+        </w:tabs>
+        <w:ind w:left="3600" w:hanging="360"/>
+      </w:pPr>
+      <w:rPr>
+        <w:rFonts w:ascii="Wingdings" w:hAnsi="Wingdings" w:hint="default"/>
+        <w:sz w:val="20"/>
+      </w:rPr>
+    </w:lvl>
+    <w:lvl w:ilvl="5" w:tentative="1">
+      <w:start w:val="1"/>
+      <w:numFmt w:val="bullet"/>
+      <w:lvlText w:val=""/>
+      <w:lvlJc w:val="left"/>
+      <w:pPr>
+        <w:tabs>
+          <w:tab w:val="num" w:pos="4320"/>
+        </w:tabs>
+        <w:ind w:left="4320" w:hanging="360"/>
+      </w:pPr>
+      <w:rPr>
+        <w:rFonts w:ascii="Wingdings" w:hAnsi="Wingdings" w:hint="default"/>
+        <w:sz w:val="20"/>
+      </w:rPr>
+    </w:lvl>
+    <w:lvl w:ilvl="6" w:tentative="1">
+      <w:start w:val="1"/>
+      <w:numFmt w:val="bullet"/>
+      <w:lvlText w:val=""/>
+      <w:lvlJc w:val="left"/>
+      <w:pPr>
+        <w:tabs>
+          <w:tab w:val="num" w:pos="5040"/>
+        </w:tabs>
+        <w:ind w:left="5040" w:hanging="360"/>
+      </w:pPr>
+      <w:rPr>
+        <w:rFonts w:ascii="Wingdings" w:hAnsi="Wingdings" w:hint="default"/>
+        <w:sz w:val="20"/>
+      </w:rPr>
+    </w:lvl>
+    <w:lvl w:ilvl="7" w:tentative="1">
+      <w:start w:val="1"/>
+      <w:numFmt w:val="bullet"/>
+      <w:lvlText w:val=""/>
+      <w:lvlJc w:val="left"/>
+      <w:pPr>
+        <w:tabs>
+          <w:tab w:val="num" w:pos="5760"/>
+        </w:tabs>
+        <w:ind w:left="5760" w:hanging="360"/>
+      </w:pPr>
+      <w:rPr>
+        <w:rFonts w:ascii="Wingdings" w:hAnsi="Wingdings" w:hint="default"/>
+        <w:sz w:val="20"/>
+      </w:rPr>
+    </w:lvl>
+    <w:lvl w:ilvl="8" w:tentative="1">
+      <w:start w:val="1"/>
+      <w:numFmt w:val="bullet"/>
+      <w:lvlText w:val=""/>
+      <w:lvlJc w:val="left"/>
+      <w:pPr>
+        <w:tabs>
+          <w:tab w:val="num" w:pos="6480"/>
+        </w:tabs>
+        <w:ind w:left="6480" w:hanging="360"/>
+      </w:pPr>
+      <w:rPr>
+        <w:rFonts w:ascii="Wingdings" w:hAnsi="Wingdings" w:hint="default"/>
+        <w:sz w:val="20"/>
+      </w:rPr>
+    </w:lvl>
+  </w:abstractNum>
+  <w:abstractNum w:abstractNumId="13" w15:restartNumberingAfterBreak="0">
     <w:nsid w:val="307F3F46"/>
     <w:multiLevelType w:val="multilevel"/>
     <w:tmpl w:val="4CD02B92"/>
@@ -6313,7 +8483,156 @@
       </w:rPr>
     </w:lvl>
   </w:abstractNum>
-  <w:abstractNum w:abstractNumId="10" w15:restartNumberingAfterBreak="0">
+  <w:abstractNum w:abstractNumId="14" w15:restartNumberingAfterBreak="0">
+    <w:nsid w:val="3F960E41"/>
+    <w:multiLevelType w:val="multilevel"/>
+    <w:tmpl w:val="294C8DD0"/>
+    <w:lvl w:ilvl="0">
+      <w:start w:val="1"/>
+      <w:numFmt w:val="bullet"/>
+      <w:lvlText w:val=""/>
+      <w:lvlJc w:val="left"/>
+      <w:pPr>
+        <w:tabs>
+          <w:tab w:val="num" w:pos="720"/>
+        </w:tabs>
+        <w:ind w:left="720" w:hanging="360"/>
+      </w:pPr>
+      <w:rPr>
+        <w:rFonts w:ascii="Symbol" w:hAnsi="Symbol" w:hint="default"/>
+        <w:sz w:val="20"/>
+      </w:rPr>
+    </w:lvl>
+    <w:lvl w:ilvl="1" w:tentative="1">
+      <w:start w:val="1"/>
+      <w:numFmt w:val="bullet"/>
+      <w:lvlText w:val="o"/>
+      <w:lvlJc w:val="left"/>
+      <w:pPr>
+        <w:tabs>
+          <w:tab w:val="num" w:pos="1440"/>
+        </w:tabs>
+        <w:ind w:left="1440" w:hanging="360"/>
+      </w:pPr>
+      <w:rPr>
+        <w:rFonts w:ascii="Courier New" w:hAnsi="Courier New" w:hint="default"/>
+        <w:sz w:val="20"/>
+      </w:rPr>
+    </w:lvl>
+    <w:lvl w:ilvl="2" w:tentative="1">
+      <w:start w:val="1"/>
+      <w:numFmt w:val="bullet"/>
+      <w:lvlText w:val=""/>
+      <w:lvlJc w:val="left"/>
+      <w:pPr>
+        <w:tabs>
+          <w:tab w:val="num" w:pos="2160"/>
+        </w:tabs>
+        <w:ind w:left="2160" w:hanging="360"/>
+      </w:pPr>
+      <w:rPr>
+        <w:rFonts w:ascii="Wingdings" w:hAnsi="Wingdings" w:hint="default"/>
+        <w:sz w:val="20"/>
+      </w:rPr>
+    </w:lvl>
+    <w:lvl w:ilvl="3" w:tentative="1">
+      <w:start w:val="1"/>
+      <w:numFmt w:val="bullet"/>
+      <w:lvlText w:val=""/>
+      <w:lvlJc w:val="left"/>
+      <w:pPr>
+        <w:tabs>
+          <w:tab w:val="num" w:pos="2880"/>
+        </w:tabs>
+        <w:ind w:left="2880" w:hanging="360"/>
+      </w:pPr>
+      <w:rPr>
+        <w:rFonts w:ascii="Wingdings" w:hAnsi="Wingdings" w:hint="default"/>
+        <w:sz w:val="20"/>
+      </w:rPr>
+    </w:lvl>
+    <w:lvl w:ilvl="4" w:tentative="1">
+      <w:start w:val="1"/>
+      <w:numFmt w:val="bullet"/>
+      <w:lvlText w:val=""/>
+      <w:lvlJc w:val="left"/>
+      <w:pPr>
+        <w:tabs>
+          <w:tab w:val="num" w:pos="3600"/>
+        </w:tabs>
+        <w:ind w:left="3600" w:hanging="360"/>
+      </w:pPr>
+      <w:rPr>
+        <w:rFonts w:ascii="Wingdings" w:hAnsi="Wingdings" w:hint="default"/>
+        <w:sz w:val="20"/>
+      </w:rPr>
+    </w:lvl>
+    <w:lvl w:ilvl="5" w:tentative="1">
+      <w:start w:val="1"/>
+      <w:numFmt w:val="bullet"/>
+      <w:lvlText w:val=""/>
+      <w:lvlJc w:val="left"/>
+      <w:pPr>
+        <w:tabs>
+          <w:tab w:val="num" w:pos="4320"/>
+        </w:tabs>
+        <w:ind w:left="4320" w:hanging="360"/>
+      </w:pPr>
+      <w:rPr>
+        <w:rFonts w:ascii="Wingdings" w:hAnsi="Wingdings" w:hint="default"/>
+        <w:sz w:val="20"/>
+      </w:rPr>
+    </w:lvl>
+    <w:lvl w:ilvl="6" w:tentative="1">
+      <w:start w:val="1"/>
+      <w:numFmt w:val="bullet"/>
+      <w:lvlText w:val=""/>
+      <w:lvlJc w:val="left"/>
+      <w:pPr>
+        <w:tabs>
+          <w:tab w:val="num" w:pos="5040"/>
+        </w:tabs>
+        <w:ind w:left="5040" w:hanging="360"/>
+      </w:pPr>
+      <w:rPr>
+        <w:rFonts w:ascii="Wingdings" w:hAnsi="Wingdings" w:hint="default"/>
+        <w:sz w:val="20"/>
+      </w:rPr>
+    </w:lvl>
+    <w:lvl w:ilvl="7" w:tentative="1">
+      <w:start w:val="1"/>
+      <w:numFmt w:val="bullet"/>
+      <w:lvlText w:val=""/>
+      <w:lvlJc w:val="left"/>
+      <w:pPr>
+        <w:tabs>
+          <w:tab w:val="num" w:pos="5760"/>
+        </w:tabs>
+        <w:ind w:left="5760" w:hanging="360"/>
+      </w:pPr>
+      <w:rPr>
+        <w:rFonts w:ascii="Wingdings" w:hAnsi="Wingdings" w:hint="default"/>
+        <w:sz w:val="20"/>
+      </w:rPr>
+    </w:lvl>
+    <w:lvl w:ilvl="8" w:tentative="1">
+      <w:start w:val="1"/>
+      <w:numFmt w:val="bullet"/>
+      <w:lvlText w:val=""/>
+      <w:lvlJc w:val="left"/>
+      <w:pPr>
+        <w:tabs>
+          <w:tab w:val="num" w:pos="6480"/>
+        </w:tabs>
+        <w:ind w:left="6480" w:hanging="360"/>
+      </w:pPr>
+      <w:rPr>
+        <w:rFonts w:ascii="Wingdings" w:hAnsi="Wingdings" w:hint="default"/>
+        <w:sz w:val="20"/>
+      </w:rPr>
+    </w:lvl>
+  </w:abstractNum>
+  <w:abstractNum w:abstractNumId="15" w15:restartNumberingAfterBreak="0">
     <w:nsid w:val="4E1129B4"/>
     <w:multiLevelType w:val="multilevel"/>
     <w:tmpl w:val="25C44C28"/>
@@ -6462,7 +8781,7 @@
       </w:rPr>
     </w:lvl>
   </w:abstractNum>
-  <w:abstractNum w:abstractNumId="11" w15:restartNumberingAfterBreak="0">
+  <w:abstractNum w:abstractNumId="16" w15:restartNumberingAfterBreak="0">
     <w:nsid w:val="4E6C49EC"/>
     <w:multiLevelType w:val="multilevel"/>
     <w:tmpl w:val="6F966304"/>
@@ -6579,7 +8898,7 @@
       </w:pPr>
     </w:lvl>
   </w:abstractNum>
-  <w:abstractNum w:abstractNumId="12" w15:restartNumberingAfterBreak="0">
+  <w:abstractNum w:abstractNumId="17" w15:restartNumberingAfterBreak="0">
     <w:nsid w:val="51764FD9"/>
     <w:multiLevelType w:val="multilevel"/>
     <w:tmpl w:val="08A60508"/>
@@ -6728,7 +9047,7 @@
       </w:rPr>
     </w:lvl>
   </w:abstractNum>
-  <w:abstractNum w:abstractNumId="13" w15:restartNumberingAfterBreak="0">
+  <w:abstractNum w:abstractNumId="18" w15:restartNumberingAfterBreak="0">
     <w:nsid w:val="52571FED"/>
     <w:multiLevelType w:val="multilevel"/>
     <w:tmpl w:val="22BCED12"/>
@@ -6877,7 +9196,7 @@
       </w:rPr>
     </w:lvl>
   </w:abstractNum>
-  <w:abstractNum w:abstractNumId="14" w15:restartNumberingAfterBreak="0">
+  <w:abstractNum w:abstractNumId="19" w15:restartNumberingAfterBreak="0">
     <w:nsid w:val="577D2BDE"/>
     <w:multiLevelType w:val="multilevel"/>
     <w:tmpl w:val="1E7AAA5C"/>
@@ -7026,7 +9345,7 @@
       </w:rPr>
     </w:lvl>
   </w:abstractNum>
-  <w:abstractNum w:abstractNumId="15" w15:restartNumberingAfterBreak="0">
+  <w:abstractNum w:abstractNumId="20" w15:restartNumberingAfterBreak="0">
     <w:nsid w:val="5ACC7AC4"/>
     <w:multiLevelType w:val="multilevel"/>
     <w:tmpl w:val="EF74BBA4"/>
@@ -7175,7 +9494,7 @@
       </w:rPr>
     </w:lvl>
   </w:abstractNum>
-  <w:abstractNum w:abstractNumId="16" w15:restartNumberingAfterBreak="0">
+  <w:abstractNum w:abstractNumId="21" w15:restartNumberingAfterBreak="0">
     <w:nsid w:val="5E1C2D7A"/>
     <w:multiLevelType w:val="multilevel"/>
     <w:tmpl w:val="B1EC4ECC"/>
@@ -7324,7 +9643,7 @@
       </w:rPr>
     </w:lvl>
   </w:abstractNum>
-  <w:abstractNum w:abstractNumId="17" w15:restartNumberingAfterBreak="0">
+  <w:abstractNum w:abstractNumId="22" w15:restartNumberingAfterBreak="0">
     <w:nsid w:val="72086280"/>
     <w:multiLevelType w:val="multilevel"/>
     <w:tmpl w:val="4DBC79AE"/>
@@ -7437,7 +9756,7 @@
       </w:pPr>
     </w:lvl>
   </w:abstractNum>
-  <w:abstractNum w:abstractNumId="18" w15:restartNumberingAfterBreak="0">
+  <w:abstractNum w:abstractNumId="23" w15:restartNumberingAfterBreak="0">
     <w:nsid w:val="799B103C"/>
     <w:multiLevelType w:val="multilevel"/>
     <w:tmpl w:val="23A613A0"/>
@@ -7586,7 +9905,7 @@
       </w:rPr>
     </w:lvl>
   </w:abstractNum>
-  <w:abstractNum w:abstractNumId="19" w15:restartNumberingAfterBreak="0">
+  <w:abstractNum w:abstractNumId="24" w15:restartNumberingAfterBreak="0">
     <w:nsid w:val="7D5B4DED"/>
     <w:multiLevelType w:val="multilevel"/>
     <w:tmpl w:val="758042DA"/>
@@ -7739,61 +10058,76 @@
     <w:abstractNumId w:val="1"/>
   </w:num>
   <w:num w:numId="2" w16cid:durableId="431315551">
-    <w:abstractNumId w:val="19"/>
+    <w:abstractNumId w:val="24"/>
   </w:num>
   <w:num w:numId="3" w16cid:durableId="1261835197">
-    <w:abstractNumId w:val="8"/>
+    <w:abstractNumId w:val="10"/>
   </w:num>
   <w:num w:numId="4" w16cid:durableId="576020663">
-    <w:abstractNumId w:val="18"/>
+    <w:abstractNumId w:val="23"/>
   </w:num>
   <w:num w:numId="5" w16cid:durableId="2081978374">
-    <w:abstractNumId w:val="15"/>
+    <w:abstractNumId w:val="20"/>
   </w:num>
   <w:num w:numId="6" w16cid:durableId="593511808">
-    <w:abstractNumId w:val="12"/>
+    <w:abstractNumId w:val="17"/>
   </w:num>
   <w:num w:numId="7" w16cid:durableId="2110809009">
     <w:abstractNumId w:val="2"/>
   </w:num>
   <w:num w:numId="8" w16cid:durableId="281230396">
-    <w:abstractNumId w:val="11"/>
+    <w:abstractNumId w:val="16"/>
   </w:num>
   <w:num w:numId="9" w16cid:durableId="1997220382">
-    <w:abstractNumId w:val="10"/>
+    <w:abstractNumId w:val="15"/>
   </w:num>
   <w:num w:numId="10" w16cid:durableId="1922173411">
     <w:abstractNumId w:val="0"/>
   </w:num>
   <w:num w:numId="11" w16cid:durableId="1394237143">
-    <w:abstractNumId w:val="17"/>
+    <w:abstractNumId w:val="22"/>
   </w:num>
   <w:num w:numId="12" w16cid:durableId="1896771950">
+    <w:abstractNumId w:val="8"/>
+  </w:num>
+  <w:num w:numId="13" w16cid:durableId="626354605">
+    <w:abstractNumId w:val="21"/>
+  </w:num>
+  <w:num w:numId="14" w16cid:durableId="616450917">
+    <w:abstractNumId w:val="18"/>
+  </w:num>
+  <w:num w:numId="15" w16cid:durableId="177348957">
     <w:abstractNumId w:val="6"/>
   </w:num>
-  <w:num w:numId="13" w16cid:durableId="626354605">
-    <w:abstractNumId w:val="16"/>
-  </w:num>
-  <w:num w:numId="14" w16cid:durableId="616450917">
+  <w:num w:numId="16" w16cid:durableId="2005743081">
     <w:abstractNumId w:val="13"/>
   </w:num>
-  <w:num w:numId="15" w16cid:durableId="177348957">
+  <w:num w:numId="17" w16cid:durableId="393165718">
+    <w:abstractNumId w:val="19"/>
+  </w:num>
+  <w:num w:numId="18" w16cid:durableId="1973709430">
+    <w:abstractNumId w:val="9"/>
+  </w:num>
+  <w:num w:numId="19" w16cid:durableId="946885701">
+    <w:abstractNumId w:val="4"/>
+  </w:num>
+  <w:num w:numId="20" w16cid:durableId="575239028">
     <w:abstractNumId w:val="5"/>
   </w:num>
-  <w:num w:numId="16" w16cid:durableId="2005743081">
-    <w:abstractNumId w:val="9"/>
+  <w:num w:numId="21" w16cid:durableId="1161389367">
+    <w:abstractNumId w:val="3"/>
   </w:num>
-  <w:num w:numId="17" w16cid:durableId="393165718">
+  <w:num w:numId="22" w16cid:durableId="2066175265">
     <w:abstractNumId w:val="14"/>
   </w:num>
-  <w:num w:numId="18" w16cid:durableId="1973709430">
+  <w:num w:numId="23" w16cid:durableId="977877563">
+    <w:abstractNumId w:val="11"/>
+  </w:num>
+  <w:num w:numId="24" w16cid:durableId="1581522678">
     <w:abstractNumId w:val="7"/>
   </w:num>
-  <w:num w:numId="19" w16cid:durableId="946885701">
-    <w:abstractNumId w:val="3"/>
-  </w:num>
-  <w:num w:numId="20" w16cid:durableId="575239028">
-    <w:abstractNumId w:val="4"/>
+  <w:num w:numId="25" w16cid:durableId="1017850321">
+    <w:abstractNumId w:val="12"/>
   </w:num>
 </w:numbering>
 </file>

</xml_diff>

<commit_message>
feat: implement multi-tenancy architecture and stabilize prisma v5
- Downgrade tático para Prisma v5 para compatibilidade com NestJS[cite: 1].- Criação do RolesGuard para validação de permissões via banco de dados.- Implementação de escopo Global (Stellar) vs Local (Clientes)[cite: 1, 5].- Criação dos módulos de Financeiro e Usuários com suporte a permissões[cite: 3, 4, 6].- Correção de erro de tipagem 1272 no AuthService e controllers[cite: 2, 5].
</commit_message>
<xml_diff>
--- a/Documentação/Documentação Ecossistema.docx
+++ b/Documentação/Documentação Ecossistema.docx
@@ -6488,6 +6488,1269 @@
     </w:p>
     <w:p>
       <w:pPr>
+        <w:pBdr>
+          <w:bottom w:val="double" w:sz="6" w:space="1" w:color="auto"/>
+        </w:pBdr>
+        <w:rPr>
+          <w:u w:val="single"/>
+        </w:rPr>
+      </w:pPr>
+    </w:p>
+    <w:p>
+      <w:pPr>
+        <w:rPr>
+          <w:u w:val="single"/>
+        </w:rPr>
+      </w:pPr>
+    </w:p>
+    <w:p>
+      <w:pPr>
+        <w:rPr>
+          <w:u w:val="single"/>
+        </w:rPr>
+      </w:pPr>
+    </w:p>
+    <w:p>
+      <w:pPr>
+        <w:rPr>
+          <w:u w:val="single"/>
+        </w:rPr>
+      </w:pPr>
+    </w:p>
+    <w:p>
+      <w:pPr>
+        <w:rPr>
+          <w:u w:val="single"/>
+        </w:rPr>
+      </w:pPr>
+    </w:p>
+    <w:p>
+      <w:pPr>
+        <w:rPr>
+          <w:u w:val="single"/>
+        </w:rPr>
+      </w:pPr>
+    </w:p>
+    <w:p>
+      <w:pPr>
+        <w:rPr>
+          <w:u w:val="single"/>
+        </w:rPr>
+      </w:pPr>
+    </w:p>
+    <w:p>
+      <w:pPr>
+        <w:rPr>
+          <w:b/>
+          <w:bCs/>
+          <w:u w:val="single"/>
+        </w:rPr>
+      </w:pPr>
+      <w:r>
+        <w:rPr>
+          <w:rFonts w:ascii="Segoe UI Emoji" w:hAnsi="Segoe UI Emoji" w:cs="Segoe UI Emoji"/>
+          <w:b/>
+          <w:bCs/>
+          <w:u w:val="single"/>
+        </w:rPr>
+        <w:t>🔧</w:t>
+      </w:r>
+      <w:r>
+        <w:rPr>
+          <w:b/>
+          <w:bCs/>
+          <w:u w:val="single"/>
+        </w:rPr>
+        <w:t xml:space="preserve"> 1. Estabilização do Motor de Dados (Prisma)</w:t>
+      </w:r>
+    </w:p>
+    <w:p>
+      <w:pPr>
+        <w:rPr>
+          <w:u w:val="single"/>
+        </w:rPr>
+      </w:pPr>
+      <w:r>
+        <w:rPr>
+          <w:u w:val="single"/>
+        </w:rPr>
+        <w:t xml:space="preserve">Enfrentamos o desafio do Prisma 7, que mudou radicalmente a forma de lidar com conexões no SQL Server. </w:t>
+      </w:r>
+    </w:p>
+    <w:p>
+      <w:pPr>
+        <w:numPr>
+          <w:ilvl w:val="0"/>
+          <w:numId w:val="26"/>
+        </w:numPr>
+        <w:rPr>
+          <w:u w:val="single"/>
+        </w:rPr>
+      </w:pPr>
+      <w:proofErr w:type="spellStart"/>
+      <w:r>
+        <w:rPr>
+          <w:b/>
+          <w:bCs/>
+          <w:u w:val="single"/>
+        </w:rPr>
+        <w:t>Downgrade</w:t>
+      </w:r>
+      <w:proofErr w:type="spellEnd"/>
+      <w:r>
+        <w:rPr>
+          <w:b/>
+          <w:bCs/>
+          <w:u w:val="single"/>
+        </w:rPr>
+        <w:t xml:space="preserve"> Tático</w:t>
+      </w:r>
+      <w:r>
+        <w:rPr>
+          <w:u w:val="single"/>
+        </w:rPr>
+        <w:t xml:space="preserve">: Recuamos para a </w:t>
+      </w:r>
+      <w:r>
+        <w:rPr>
+          <w:b/>
+          <w:bCs/>
+          <w:u w:val="single"/>
+        </w:rPr>
+        <w:t>versão 5.x</w:t>
+      </w:r>
+      <w:r>
+        <w:rPr>
+          <w:u w:val="single"/>
+        </w:rPr>
+        <w:t xml:space="preserve">, garantindo 100% de compatibilidade com o </w:t>
+      </w:r>
+      <w:proofErr w:type="spellStart"/>
+      <w:r>
+        <w:rPr>
+          <w:u w:val="single"/>
+        </w:rPr>
+        <w:t>NestJS</w:t>
+      </w:r>
+      <w:proofErr w:type="spellEnd"/>
+      <w:r>
+        <w:rPr>
+          <w:u w:val="single"/>
+        </w:rPr>
+        <w:t xml:space="preserve"> e eliminando os erros de "</w:t>
+      </w:r>
+      <w:proofErr w:type="spellStart"/>
+      <w:r>
+        <w:rPr>
+          <w:u w:val="single"/>
+        </w:rPr>
+        <w:t>engine</w:t>
+      </w:r>
+      <w:proofErr w:type="spellEnd"/>
+      <w:r>
+        <w:rPr>
+          <w:u w:val="single"/>
+        </w:rPr>
+        <w:t xml:space="preserve"> </w:t>
+      </w:r>
+      <w:proofErr w:type="spellStart"/>
+      <w:r>
+        <w:rPr>
+          <w:u w:val="single"/>
+        </w:rPr>
+        <w:t>type</w:t>
+      </w:r>
+      <w:proofErr w:type="spellEnd"/>
+      <w:r>
+        <w:rPr>
+          <w:u w:val="single"/>
+        </w:rPr>
+        <w:t xml:space="preserve">". </w:t>
+      </w:r>
+    </w:p>
+    <w:p>
+      <w:pPr>
+        <w:numPr>
+          <w:ilvl w:val="0"/>
+          <w:numId w:val="26"/>
+        </w:numPr>
+        <w:rPr>
+          <w:u w:val="single"/>
+        </w:rPr>
+      </w:pPr>
+      <w:r>
+        <w:rPr>
+          <w:b/>
+          <w:bCs/>
+          <w:u w:val="single"/>
+        </w:rPr>
+        <w:t>Limpeza de Configuração</w:t>
+      </w:r>
+      <w:r>
+        <w:rPr>
+          <w:u w:val="single"/>
+        </w:rPr>
+        <w:t xml:space="preserve">: Removemos o arquivo </w:t>
+      </w:r>
+      <w:proofErr w:type="spellStart"/>
+      <w:r>
+        <w:rPr>
+          <w:u w:val="single"/>
+        </w:rPr>
+        <w:t>prisma.config.ts</w:t>
+      </w:r>
+      <w:proofErr w:type="spellEnd"/>
+      <w:r>
+        <w:rPr>
+          <w:u w:val="single"/>
+        </w:rPr>
+        <w:t xml:space="preserve"> e voltamos a centralizar a URL de conexão no </w:t>
+      </w:r>
+      <w:proofErr w:type="gramStart"/>
+      <w:r>
+        <w:rPr>
+          <w:u w:val="single"/>
+        </w:rPr>
+        <w:t>arquivo .</w:t>
+      </w:r>
+      <w:proofErr w:type="spellStart"/>
+      <w:r>
+        <w:rPr>
+          <w:u w:val="single"/>
+        </w:rPr>
+        <w:t>env</w:t>
+      </w:r>
+      <w:proofErr w:type="spellEnd"/>
+      <w:proofErr w:type="gramEnd"/>
+      <w:r>
+        <w:rPr>
+          <w:u w:val="single"/>
+        </w:rPr>
+        <w:t xml:space="preserve"> e no </w:t>
+      </w:r>
+      <w:proofErr w:type="spellStart"/>
+      <w:proofErr w:type="gramStart"/>
+      <w:r>
+        <w:rPr>
+          <w:u w:val="single"/>
+        </w:rPr>
+        <w:t>schema.prisma</w:t>
+      </w:r>
+      <w:proofErr w:type="spellEnd"/>
+      <w:proofErr w:type="gramEnd"/>
+      <w:r>
+        <w:rPr>
+          <w:u w:val="single"/>
+        </w:rPr>
+        <w:t xml:space="preserve">, simplificando a manutenção. </w:t>
+      </w:r>
+    </w:p>
+    <w:p>
+      <w:pPr>
+        <w:numPr>
+          <w:ilvl w:val="0"/>
+          <w:numId w:val="26"/>
+        </w:numPr>
+        <w:rPr>
+          <w:u w:val="single"/>
+        </w:rPr>
+      </w:pPr>
+      <w:r>
+        <w:rPr>
+          <w:b/>
+          <w:bCs/>
+          <w:u w:val="single"/>
+        </w:rPr>
+        <w:t>Sincronização</w:t>
+      </w:r>
+      <w:r>
+        <w:rPr>
+          <w:u w:val="single"/>
+        </w:rPr>
+        <w:t xml:space="preserve">: Realizamos o </w:t>
+      </w:r>
+      <w:proofErr w:type="spellStart"/>
+      <w:r>
+        <w:rPr>
+          <w:u w:val="single"/>
+        </w:rPr>
+        <w:t>npx</w:t>
+      </w:r>
+      <w:proofErr w:type="spellEnd"/>
+      <w:r>
+        <w:rPr>
+          <w:u w:val="single"/>
+        </w:rPr>
+        <w:t xml:space="preserve"> prisma </w:t>
+      </w:r>
+      <w:proofErr w:type="spellStart"/>
+      <w:r>
+        <w:rPr>
+          <w:u w:val="single"/>
+        </w:rPr>
+        <w:t>generate</w:t>
+      </w:r>
+      <w:proofErr w:type="spellEnd"/>
+      <w:r>
+        <w:rPr>
+          <w:u w:val="single"/>
+        </w:rPr>
+        <w:t xml:space="preserve"> para reconstruir o cliente e o </w:t>
+      </w:r>
+      <w:proofErr w:type="spellStart"/>
+      <w:r>
+        <w:rPr>
+          <w:u w:val="single"/>
+        </w:rPr>
+        <w:t>npx</w:t>
+      </w:r>
+      <w:proofErr w:type="spellEnd"/>
+      <w:r>
+        <w:rPr>
+          <w:u w:val="single"/>
+        </w:rPr>
+        <w:t xml:space="preserve"> prisma </w:t>
+      </w:r>
+      <w:proofErr w:type="spellStart"/>
+      <w:r>
+        <w:rPr>
+          <w:u w:val="single"/>
+        </w:rPr>
+        <w:t>db</w:t>
+      </w:r>
+      <w:proofErr w:type="spellEnd"/>
+      <w:r>
+        <w:rPr>
+          <w:u w:val="single"/>
+        </w:rPr>
+        <w:t xml:space="preserve"> </w:t>
+      </w:r>
+      <w:proofErr w:type="spellStart"/>
+      <w:r>
+        <w:rPr>
+          <w:u w:val="single"/>
+        </w:rPr>
+        <w:t>pull</w:t>
+      </w:r>
+      <w:proofErr w:type="spellEnd"/>
+      <w:r>
+        <w:rPr>
+          <w:u w:val="single"/>
+        </w:rPr>
+        <w:t xml:space="preserve"> para sincronizar as mudanças feitas via </w:t>
+      </w:r>
+      <w:proofErr w:type="spellStart"/>
+      <w:r>
+        <w:rPr>
+          <w:u w:val="single"/>
+        </w:rPr>
+        <w:t>SqlDbx</w:t>
+      </w:r>
+      <w:proofErr w:type="spellEnd"/>
+      <w:r>
+        <w:rPr>
+          <w:u w:val="single"/>
+        </w:rPr>
+        <w:t xml:space="preserve">. </w:t>
+      </w:r>
+    </w:p>
+    <w:p>
+      <w:pPr>
+        <w:rPr>
+          <w:u w:val="single"/>
+        </w:rPr>
+      </w:pPr>
+      <w:r>
+        <w:rPr>
+          <w:u w:val="single"/>
+        </w:rPr>
+        <w:pict w14:anchorId="46DE15F8">
+          <v:rect id="_x0000_i1057" style="width:0;height:1.5pt" o:hralign="center" o:hrstd="t" o:hr="t" fillcolor="#a0a0a0" stroked="f"/>
+        </w:pict>
+      </w:r>
+    </w:p>
+    <w:p>
+      <w:pPr>
+        <w:rPr>
+          <w:b/>
+          <w:bCs/>
+          <w:u w:val="single"/>
+        </w:rPr>
+      </w:pPr>
+      <w:r>
+        <w:rPr>
+          <w:rFonts w:ascii="Segoe UI Emoji" w:hAnsi="Segoe UI Emoji" w:cs="Segoe UI Emoji"/>
+          <w:b/>
+          <w:bCs/>
+          <w:u w:val="single"/>
+        </w:rPr>
+        <w:t>🏛️</w:t>
+      </w:r>
+      <w:r>
+        <w:rPr>
+          <w:b/>
+          <w:bCs/>
+          <w:u w:val="single"/>
+        </w:rPr>
+        <w:t xml:space="preserve"> 2. Evolução do Banco de Dados</w:t>
+      </w:r>
+    </w:p>
+    <w:p>
+      <w:pPr>
+        <w:rPr>
+          <w:u w:val="single"/>
+        </w:rPr>
+      </w:pPr>
+      <w:r>
+        <w:rPr>
+          <w:u w:val="single"/>
+        </w:rPr>
+        <w:t xml:space="preserve">Ajustamos a estrutura de permissões para suportar o novo módulo financeiro. </w:t>
+      </w:r>
+    </w:p>
+    <w:p>
+      <w:pPr>
+        <w:numPr>
+          <w:ilvl w:val="0"/>
+          <w:numId w:val="27"/>
+        </w:numPr>
+        <w:rPr>
+          <w:u w:val="single"/>
+        </w:rPr>
+      </w:pPr>
+      <w:r>
+        <w:rPr>
+          <w:b/>
+          <w:bCs/>
+          <w:u w:val="single"/>
+        </w:rPr>
+        <w:t>Novas Permissões</w:t>
+      </w:r>
+      <w:r>
+        <w:rPr>
+          <w:u w:val="single"/>
+        </w:rPr>
+        <w:t xml:space="preserve">: Adicionada a coluna </w:t>
+      </w:r>
+      <w:proofErr w:type="spellStart"/>
+      <w:r>
+        <w:rPr>
+          <w:u w:val="single"/>
+        </w:rPr>
+        <w:t>can_generate_invoices</w:t>
+      </w:r>
+      <w:proofErr w:type="spellEnd"/>
+      <w:r>
+        <w:rPr>
+          <w:u w:val="single"/>
+        </w:rPr>
+        <w:t xml:space="preserve"> (BIT) na tabela </w:t>
+      </w:r>
+      <w:proofErr w:type="spellStart"/>
+      <w:r>
+        <w:rPr>
+          <w:u w:val="single"/>
+        </w:rPr>
+        <w:t>perfis_acesso</w:t>
+      </w:r>
+      <w:proofErr w:type="spellEnd"/>
+      <w:r>
+        <w:rPr>
+          <w:u w:val="single"/>
+        </w:rPr>
+        <w:t xml:space="preserve"> para controlar quem pode emitir faturas. </w:t>
+      </w:r>
+    </w:p>
+    <w:p>
+      <w:pPr>
+        <w:numPr>
+          <w:ilvl w:val="0"/>
+          <w:numId w:val="27"/>
+        </w:numPr>
+        <w:rPr>
+          <w:u w:val="single"/>
+        </w:rPr>
+      </w:pPr>
+      <w:r>
+        <w:rPr>
+          <w:b/>
+          <w:bCs/>
+          <w:u w:val="single"/>
+        </w:rPr>
+        <w:t>Refinamento de Perfis</w:t>
+      </w:r>
+      <w:r>
+        <w:rPr>
+          <w:u w:val="single"/>
+        </w:rPr>
+        <w:t xml:space="preserve">: Validamos que perfis como "Gestor do Cliente" e "Super Admin" agora possuem campos booleanos claros para cada funcionalidade do sistema. </w:t>
+      </w:r>
+    </w:p>
+    <w:p>
+      <w:pPr>
+        <w:rPr>
+          <w:u w:val="single"/>
+        </w:rPr>
+      </w:pPr>
+      <w:r>
+        <w:rPr>
+          <w:u w:val="single"/>
+        </w:rPr>
+        <w:pict w14:anchorId="50FDAE86">
+          <v:rect id="_x0000_i1058" style="width:0;height:1.5pt" o:hralign="center" o:hrstd="t" o:hr="t" fillcolor="#a0a0a0" stroked="f"/>
+        </w:pict>
+      </w:r>
+    </w:p>
+    <w:p>
+      <w:pPr>
+        <w:rPr>
+          <w:b/>
+          <w:bCs/>
+          <w:u w:val="single"/>
+        </w:rPr>
+      </w:pPr>
+      <w:r>
+        <w:rPr>
+          <w:rFonts w:ascii="Segoe UI Emoji" w:hAnsi="Segoe UI Emoji" w:cs="Segoe UI Emoji"/>
+          <w:b/>
+          <w:bCs/>
+          <w:u w:val="single"/>
+        </w:rPr>
+        <w:t>🛡️</w:t>
+      </w:r>
+      <w:r>
+        <w:rPr>
+          <w:b/>
+          <w:bCs/>
+          <w:u w:val="single"/>
+        </w:rPr>
+        <w:t xml:space="preserve"> 3. Arquitetura de Segurança e </w:t>
+      </w:r>
+      <w:proofErr w:type="spellStart"/>
+      <w:r>
+        <w:rPr>
+          <w:b/>
+          <w:bCs/>
+          <w:u w:val="single"/>
+        </w:rPr>
+        <w:t>Multi-tenancy</w:t>
+      </w:r>
+      <w:proofErr w:type="spellEnd"/>
+    </w:p>
+    <w:p>
+      <w:pPr>
+        <w:rPr>
+          <w:u w:val="single"/>
+        </w:rPr>
+      </w:pPr>
+      <w:r>
+        <w:rPr>
+          <w:u w:val="single"/>
+        </w:rPr>
+        <w:t xml:space="preserve">Criamos a "inteligência" que diferencia os Fundadores dos Clientes. </w:t>
+      </w:r>
+    </w:p>
+    <w:p>
+      <w:pPr>
+        <w:numPr>
+          <w:ilvl w:val="0"/>
+          <w:numId w:val="28"/>
+        </w:numPr>
+        <w:rPr>
+          <w:u w:val="single"/>
+        </w:rPr>
+      </w:pPr>
+      <w:proofErr w:type="spellStart"/>
+      <w:r>
+        <w:rPr>
+          <w:b/>
+          <w:bCs/>
+          <w:u w:val="single"/>
+        </w:rPr>
+        <w:t>RolesGuard</w:t>
+      </w:r>
+      <w:proofErr w:type="spellEnd"/>
+      <w:r>
+        <w:rPr>
+          <w:u w:val="single"/>
+        </w:rPr>
+        <w:t xml:space="preserve">: Implementamos um Guard global que verifica as permissões em tempo real diretamente no SQL Server. </w:t>
+      </w:r>
+    </w:p>
+    <w:p>
+      <w:pPr>
+        <w:numPr>
+          <w:ilvl w:val="0"/>
+          <w:numId w:val="28"/>
+        </w:numPr>
+        <w:rPr>
+          <w:u w:val="single"/>
+        </w:rPr>
+      </w:pPr>
+      <w:r>
+        <w:rPr>
+          <w:b/>
+          <w:bCs/>
+          <w:u w:val="single"/>
+        </w:rPr>
+        <w:t xml:space="preserve">Identidade </w:t>
+      </w:r>
+      <w:proofErr w:type="spellStart"/>
+      <w:r>
+        <w:rPr>
+          <w:b/>
+          <w:bCs/>
+          <w:u w:val="single"/>
+        </w:rPr>
+        <w:t>Stellar</w:t>
+      </w:r>
+      <w:proofErr w:type="spellEnd"/>
+      <w:r>
+        <w:rPr>
+          <w:u w:val="single"/>
+        </w:rPr>
+        <w:t xml:space="preserve">: O sistema agora reconhece automaticamente você, o Gustavo e o Rômulo como </w:t>
+      </w:r>
+      <w:r>
+        <w:rPr>
+          <w:b/>
+          <w:bCs/>
+          <w:u w:val="single"/>
+        </w:rPr>
+        <w:t xml:space="preserve">Super </w:t>
+      </w:r>
+      <w:proofErr w:type="spellStart"/>
+      <w:r>
+        <w:rPr>
+          <w:b/>
+          <w:bCs/>
+          <w:u w:val="single"/>
+        </w:rPr>
+        <w:t>Admins</w:t>
+      </w:r>
+      <w:proofErr w:type="spellEnd"/>
+      <w:r>
+        <w:rPr>
+          <w:u w:val="single"/>
+        </w:rPr>
+        <w:t xml:space="preserve"> através do nome da empresa, liberando o </w:t>
+      </w:r>
+      <w:proofErr w:type="spellStart"/>
+      <w:r>
+        <w:rPr>
+          <w:u w:val="single"/>
+        </w:rPr>
+        <w:t>userScope</w:t>
+      </w:r>
+      <w:proofErr w:type="spellEnd"/>
+      <w:r>
+        <w:rPr>
+          <w:u w:val="single"/>
+        </w:rPr>
+        <w:t xml:space="preserve">: 'global'. </w:t>
+      </w:r>
+    </w:p>
+    <w:p>
+      <w:pPr>
+        <w:numPr>
+          <w:ilvl w:val="0"/>
+          <w:numId w:val="28"/>
+        </w:numPr>
+        <w:rPr>
+          <w:u w:val="single"/>
+        </w:rPr>
+      </w:pPr>
+      <w:r>
+        <w:rPr>
+          <w:b/>
+          <w:bCs/>
+          <w:u w:val="single"/>
+        </w:rPr>
+        <w:lastRenderedPageBreak/>
+        <w:t>Isolamento de Silos</w:t>
+      </w:r>
+      <w:r>
+        <w:rPr>
+          <w:u w:val="single"/>
+        </w:rPr>
+        <w:t xml:space="preserve">: Clientes agora recebem um </w:t>
+      </w:r>
+      <w:proofErr w:type="spellStart"/>
+      <w:r>
+        <w:rPr>
+          <w:u w:val="single"/>
+        </w:rPr>
+        <w:t>userScope</w:t>
+      </w:r>
+      <w:proofErr w:type="spellEnd"/>
+      <w:r>
+        <w:rPr>
+          <w:u w:val="single"/>
+        </w:rPr>
+        <w:t xml:space="preserve">: 'local', o que garante que eles nunca vejam dados de outras empresas ou da própria </w:t>
+      </w:r>
+      <w:proofErr w:type="spellStart"/>
+      <w:r>
+        <w:rPr>
+          <w:u w:val="single"/>
+        </w:rPr>
+        <w:t>Stellar</w:t>
+      </w:r>
+      <w:proofErr w:type="spellEnd"/>
+      <w:r>
+        <w:rPr>
+          <w:u w:val="single"/>
+        </w:rPr>
+        <w:t xml:space="preserve">. </w:t>
+      </w:r>
+    </w:p>
+    <w:p>
+      <w:pPr>
+        <w:numPr>
+          <w:ilvl w:val="0"/>
+          <w:numId w:val="28"/>
+        </w:numPr>
+        <w:rPr>
+          <w:u w:val="single"/>
+        </w:rPr>
+      </w:pPr>
+      <w:proofErr w:type="spellStart"/>
+      <w:r>
+        <w:rPr>
+          <w:b/>
+          <w:bCs/>
+          <w:u w:val="single"/>
+        </w:rPr>
+        <w:t>Decorators</w:t>
+      </w:r>
+      <w:proofErr w:type="spellEnd"/>
+      <w:r>
+        <w:rPr>
+          <w:b/>
+          <w:bCs/>
+          <w:u w:val="single"/>
+        </w:rPr>
+        <w:t xml:space="preserve"> Customizados</w:t>
+      </w:r>
+      <w:r>
+        <w:rPr>
+          <w:u w:val="single"/>
+        </w:rPr>
+        <w:t>: Criamos o @</w:t>
+      </w:r>
+      <w:proofErr w:type="gramStart"/>
+      <w:r>
+        <w:rPr>
+          <w:u w:val="single"/>
+        </w:rPr>
+        <w:t>Permissions(</w:t>
+      </w:r>
+      <w:proofErr w:type="gramEnd"/>
+      <w:r>
+        <w:rPr>
+          <w:u w:val="single"/>
+        </w:rPr>
+        <w:t xml:space="preserve">), permitindo proteger qualquer rota apenas passando o nome da coluna do banco de dados. </w:t>
+      </w:r>
+    </w:p>
+    <w:p>
+      <w:pPr>
+        <w:rPr>
+          <w:u w:val="single"/>
+        </w:rPr>
+      </w:pPr>
+      <w:r>
+        <w:rPr>
+          <w:u w:val="single"/>
+        </w:rPr>
+        <w:pict w14:anchorId="2F1D25F2">
+          <v:rect id="_x0000_i1059" style="width:0;height:1.5pt" o:hralign="center" o:hrstd="t" o:hr="t" fillcolor="#a0a0a0" stroked="f"/>
+        </w:pict>
+      </w:r>
+    </w:p>
+    <w:p>
+      <w:pPr>
+        <w:rPr>
+          <w:b/>
+          <w:bCs/>
+          <w:u w:val="single"/>
+        </w:rPr>
+      </w:pPr>
+      <w:r>
+        <w:rPr>
+          <w:rFonts w:ascii="Segoe UI Emoji" w:hAnsi="Segoe UI Emoji" w:cs="Segoe UI Emoji"/>
+          <w:b/>
+          <w:bCs/>
+          <w:u w:val="single"/>
+        </w:rPr>
+        <w:t>🐞</w:t>
+      </w:r>
+      <w:r>
+        <w:rPr>
+          <w:b/>
+          <w:bCs/>
+          <w:u w:val="single"/>
+        </w:rPr>
+        <w:t xml:space="preserve"> 4. Correções Técnicas e Refatoração</w:t>
+      </w:r>
+    </w:p>
+    <w:p>
+      <w:pPr>
+        <w:rPr>
+          <w:u w:val="single"/>
+        </w:rPr>
+      </w:pPr>
+      <w:r>
+        <w:rPr>
+          <w:u w:val="single"/>
+        </w:rPr>
+        <w:t xml:space="preserve">Limpamos o caminho para um código sem "linhas vermelhas". </w:t>
+      </w:r>
+    </w:p>
+    <w:p>
+      <w:pPr>
+        <w:numPr>
+          <w:ilvl w:val="0"/>
+          <w:numId w:val="29"/>
+        </w:numPr>
+        <w:rPr>
+          <w:u w:val="single"/>
+        </w:rPr>
+      </w:pPr>
+      <w:r>
+        <w:rPr>
+          <w:b/>
+          <w:bCs/>
+          <w:u w:val="single"/>
+        </w:rPr>
+        <w:t>Erro 1272 (</w:t>
+      </w:r>
+      <w:proofErr w:type="spellStart"/>
+      <w:r>
+        <w:rPr>
+          <w:b/>
+          <w:bCs/>
+          <w:u w:val="single"/>
+        </w:rPr>
+        <w:t>TypeScript</w:t>
+      </w:r>
+      <w:proofErr w:type="spellEnd"/>
+      <w:r>
+        <w:rPr>
+          <w:b/>
+          <w:bCs/>
+          <w:u w:val="single"/>
+        </w:rPr>
+        <w:t>)</w:t>
+      </w:r>
+      <w:r>
+        <w:rPr>
+          <w:u w:val="single"/>
+        </w:rPr>
+        <w:t xml:space="preserve">: Corrigido o problema de metadados em decoradores utilizando </w:t>
+      </w:r>
+      <w:proofErr w:type="spellStart"/>
+      <w:r>
+        <w:rPr>
+          <w:u w:val="single"/>
+        </w:rPr>
+        <w:t>import</w:t>
+      </w:r>
+      <w:proofErr w:type="spellEnd"/>
+      <w:r>
+        <w:rPr>
+          <w:u w:val="single"/>
+        </w:rPr>
+        <w:t xml:space="preserve"> </w:t>
+      </w:r>
+      <w:proofErr w:type="spellStart"/>
+      <w:r>
+        <w:rPr>
+          <w:u w:val="single"/>
+        </w:rPr>
+        <w:t>type</w:t>
+      </w:r>
+      <w:proofErr w:type="spellEnd"/>
+      <w:r>
+        <w:rPr>
+          <w:u w:val="single"/>
+        </w:rPr>
+        <w:t xml:space="preserve"> para interfaces de autenticação. </w:t>
+      </w:r>
+    </w:p>
+    <w:p>
+      <w:pPr>
+        <w:numPr>
+          <w:ilvl w:val="0"/>
+          <w:numId w:val="29"/>
+        </w:numPr>
+        <w:rPr>
+          <w:u w:val="single"/>
+        </w:rPr>
+      </w:pPr>
+      <w:proofErr w:type="spellStart"/>
+      <w:r>
+        <w:rPr>
+          <w:b/>
+          <w:bCs/>
+          <w:u w:val="single"/>
+        </w:rPr>
+        <w:t>AuthService</w:t>
+      </w:r>
+      <w:proofErr w:type="spellEnd"/>
+      <w:r>
+        <w:rPr>
+          <w:b/>
+          <w:bCs/>
+          <w:u w:val="single"/>
+        </w:rPr>
+        <w:t xml:space="preserve"> Crash</w:t>
+      </w:r>
+      <w:r>
+        <w:rPr>
+          <w:u w:val="single"/>
+        </w:rPr>
+        <w:t xml:space="preserve">: Corrigido o erro de </w:t>
+      </w:r>
+      <w:proofErr w:type="spellStart"/>
+      <w:r>
+        <w:rPr>
+          <w:u w:val="single"/>
+        </w:rPr>
+        <w:t>undefined</w:t>
+      </w:r>
+      <w:proofErr w:type="spellEnd"/>
+      <w:r>
+        <w:rPr>
+          <w:u w:val="single"/>
+        </w:rPr>
+        <w:t xml:space="preserve"> (</w:t>
+      </w:r>
+      <w:proofErr w:type="spellStart"/>
+      <w:r>
+        <w:rPr>
+          <w:u w:val="single"/>
+        </w:rPr>
+        <w:t>reading</w:t>
+      </w:r>
+      <w:proofErr w:type="spellEnd"/>
+      <w:r>
+        <w:rPr>
+          <w:u w:val="single"/>
+        </w:rPr>
+        <w:t xml:space="preserve"> 'nome') através da inclusão de relações (include) na busca do usuário e uso de </w:t>
+      </w:r>
+      <w:proofErr w:type="spellStart"/>
+      <w:r>
+        <w:rPr>
+          <w:i/>
+          <w:iCs/>
+          <w:u w:val="single"/>
+        </w:rPr>
+        <w:t>optional</w:t>
+      </w:r>
+      <w:proofErr w:type="spellEnd"/>
+      <w:r>
+        <w:rPr>
+          <w:i/>
+          <w:iCs/>
+          <w:u w:val="single"/>
+        </w:rPr>
+        <w:t xml:space="preserve"> </w:t>
+      </w:r>
+      <w:proofErr w:type="spellStart"/>
+      <w:r>
+        <w:rPr>
+          <w:i/>
+          <w:iCs/>
+          <w:u w:val="single"/>
+        </w:rPr>
+        <w:t>chaining</w:t>
+      </w:r>
+      <w:proofErr w:type="spellEnd"/>
+      <w:r>
+        <w:rPr>
+          <w:u w:val="single"/>
+        </w:rPr>
+        <w:t xml:space="preserve"> </w:t>
+      </w:r>
+      <w:proofErr w:type="gramStart"/>
+      <w:r>
+        <w:rPr>
+          <w:u w:val="single"/>
+        </w:rPr>
+        <w:t>(?.</w:t>
+      </w:r>
+      <w:proofErr w:type="gramEnd"/>
+      <w:r>
+        <w:rPr>
+          <w:u w:val="single"/>
+        </w:rPr>
+        <w:t xml:space="preserve">). </w:t>
+      </w:r>
+    </w:p>
+    <w:p>
+      <w:pPr>
+        <w:numPr>
+          <w:ilvl w:val="0"/>
+          <w:numId w:val="29"/>
+        </w:numPr>
+        <w:rPr>
+          <w:u w:val="single"/>
+        </w:rPr>
+      </w:pPr>
+      <w:r>
+        <w:rPr>
+          <w:b/>
+          <w:bCs/>
+          <w:u w:val="single"/>
+        </w:rPr>
+        <w:t>Logs de Query</w:t>
+      </w:r>
+      <w:r>
+        <w:rPr>
+          <w:u w:val="single"/>
+        </w:rPr>
+        <w:t xml:space="preserve">: Ativamos o log de 'query' no </w:t>
+      </w:r>
+      <w:proofErr w:type="spellStart"/>
+      <w:r>
+        <w:rPr>
+          <w:u w:val="single"/>
+        </w:rPr>
+        <w:t>PrismaService</w:t>
+      </w:r>
+      <w:proofErr w:type="spellEnd"/>
+      <w:r>
+        <w:rPr>
+          <w:u w:val="single"/>
+        </w:rPr>
+        <w:t xml:space="preserve"> para monitorar cada SELECT disparado contra o banco durante a fase de testes. </w:t>
+      </w:r>
+    </w:p>
+    <w:p>
+      <w:pPr>
+        <w:rPr>
+          <w:u w:val="single"/>
+        </w:rPr>
+      </w:pPr>
+      <w:r>
+        <w:rPr>
+          <w:u w:val="single"/>
+        </w:rPr>
+        <w:pict w14:anchorId="0C457189">
+          <v:rect id="_x0000_i1060" style="width:0;height:1.5pt" o:hralign="center" o:hrstd="t" o:hr="t" fillcolor="#a0a0a0" stroked="f"/>
+        </w:pict>
+      </w:r>
+    </w:p>
+    <w:p>
+      <w:pPr>
+        <w:rPr>
+          <w:b/>
+          <w:bCs/>
+          <w:u w:val="single"/>
+        </w:rPr>
+      </w:pPr>
+      <w:r>
+        <w:rPr>
+          <w:rFonts w:ascii="Segoe UI Emoji" w:hAnsi="Segoe UI Emoji" w:cs="Segoe UI Emoji"/>
+          <w:b/>
+          <w:bCs/>
+          <w:u w:val="single"/>
+        </w:rPr>
+        <w:t>🚀</w:t>
+      </w:r>
+      <w:r>
+        <w:rPr>
+          <w:b/>
+          <w:bCs/>
+          <w:u w:val="single"/>
+        </w:rPr>
+        <w:t xml:space="preserve"> Status Atual do Sistema</w:t>
+      </w:r>
+    </w:p>
+    <w:p>
+      <w:pPr>
+        <w:numPr>
+          <w:ilvl w:val="0"/>
+          <w:numId w:val="30"/>
+        </w:numPr>
+        <w:rPr>
+          <w:u w:val="single"/>
+        </w:rPr>
+      </w:pPr>
+      <w:r>
+        <w:rPr>
+          <w:b/>
+          <w:bCs/>
+          <w:u w:val="single"/>
+        </w:rPr>
+        <w:t>Autenticação</w:t>
+      </w:r>
+      <w:r>
+        <w:rPr>
+          <w:u w:val="single"/>
+        </w:rPr>
+        <w:t xml:space="preserve">: Gerando tokens JWT com </w:t>
+      </w:r>
+      <w:proofErr w:type="spellStart"/>
+      <w:r>
+        <w:rPr>
+          <w:u w:val="single"/>
+        </w:rPr>
+        <w:t>payload</w:t>
+      </w:r>
+      <w:proofErr w:type="spellEnd"/>
+      <w:r>
+        <w:rPr>
+          <w:u w:val="single"/>
+        </w:rPr>
+        <w:t xml:space="preserve"> completo (empresa, perfil e permissões). </w:t>
+      </w:r>
+    </w:p>
+    <w:p>
+      <w:pPr>
+        <w:numPr>
+          <w:ilvl w:val="0"/>
+          <w:numId w:val="30"/>
+        </w:numPr>
+        <w:rPr>
+          <w:u w:val="single"/>
+        </w:rPr>
+      </w:pPr>
+      <w:r>
+        <w:rPr>
+          <w:b/>
+          <w:bCs/>
+          <w:u w:val="single"/>
+        </w:rPr>
+        <w:t>Módulo de Usuários</w:t>
+      </w:r>
+      <w:r>
+        <w:rPr>
+          <w:u w:val="single"/>
+        </w:rPr>
+        <w:t xml:space="preserve">: Criado e filtrando dados por escopo (Global </w:t>
+      </w:r>
+      <w:proofErr w:type="spellStart"/>
+      <w:proofErr w:type="gramStart"/>
+      <w:r>
+        <w:rPr>
+          <w:u w:val="single"/>
+        </w:rPr>
+        <w:t>vs</w:t>
+      </w:r>
+      <w:proofErr w:type="spellEnd"/>
+      <w:r>
+        <w:rPr>
+          <w:u w:val="single"/>
+        </w:rPr>
+        <w:t xml:space="preserve"> Local</w:t>
+      </w:r>
+      <w:proofErr w:type="gramEnd"/>
+      <w:r>
+        <w:rPr>
+          <w:u w:val="single"/>
+        </w:rPr>
+        <w:t xml:space="preserve">). </w:t>
+      </w:r>
+    </w:p>
+    <w:p>
+      <w:pPr>
+        <w:numPr>
+          <w:ilvl w:val="0"/>
+          <w:numId w:val="30"/>
+        </w:numPr>
+        <w:rPr>
+          <w:u w:val="single"/>
+        </w:rPr>
+      </w:pPr>
+      <w:r>
+        <w:rPr>
+          <w:b/>
+          <w:bCs/>
+          <w:u w:val="single"/>
+        </w:rPr>
+        <w:t>Módulo Financeiro</w:t>
+      </w:r>
+      <w:r>
+        <w:rPr>
+          <w:u w:val="single"/>
+        </w:rPr>
+        <w:t xml:space="preserve">: Preparado para a geração de faturas com trava de segurança ativa. </w:t>
+      </w:r>
+    </w:p>
+    <w:p>
+      <w:pPr>
+        <w:numPr>
+          <w:ilvl w:val="0"/>
+          <w:numId w:val="30"/>
+        </w:numPr>
+        <w:rPr>
+          <w:u w:val="single"/>
+        </w:rPr>
+      </w:pPr>
+      <w:r>
+        <w:rPr>
+          <w:b/>
+          <w:bCs/>
+          <w:u w:val="single"/>
+        </w:rPr>
+        <w:t>Prisma Studio</w:t>
+      </w:r>
+      <w:r>
+        <w:rPr>
+          <w:u w:val="single"/>
+        </w:rPr>
+        <w:t xml:space="preserve">: Operacional e refletindo a estrutura atualizada do SQL Server. </w:t>
+      </w:r>
+    </w:p>
+    <w:p>
+      <w:pPr>
+        <w:rPr>
+          <w:u w:val="single"/>
+        </w:rPr>
+      </w:pPr>
+      <w:r>
+        <w:rPr>
+          <w:u w:val="single"/>
+        </w:rPr>
+        <w:t xml:space="preserve">O </w:t>
+      </w:r>
+      <w:r>
+        <w:rPr>
+          <w:b/>
+          <w:bCs/>
+          <w:u w:val="single"/>
+        </w:rPr>
+        <w:t xml:space="preserve">Ecossistema </w:t>
+      </w:r>
+      <w:proofErr w:type="spellStart"/>
+      <w:r>
+        <w:rPr>
+          <w:b/>
+          <w:bCs/>
+          <w:u w:val="single"/>
+        </w:rPr>
+        <w:t>Stellar</w:t>
+      </w:r>
+      <w:proofErr w:type="spellEnd"/>
+      <w:r>
+        <w:rPr>
+          <w:u w:val="single"/>
+        </w:rPr>
+        <w:t xml:space="preserve"> agora entende perfeitamente quem manda em quê. </w:t>
+      </w:r>
+      <w:r>
+        <w:rPr>
+          <w:rFonts w:ascii="Segoe UI Emoji" w:hAnsi="Segoe UI Emoji" w:cs="Segoe UI Emoji"/>
+          <w:u w:val="single"/>
+        </w:rPr>
+        <w:t>🌌🚀🐢</w:t>
+      </w:r>
+    </w:p>
+    <w:p>
+      <w:pPr>
         <w:rPr>
           <w:u w:val="single"/>
         </w:rPr>
@@ -7066,6 +8329,155 @@
     </w:lvl>
   </w:abstractNum>
   <w:abstractNum w:abstractNumId="4" w15:restartNumberingAfterBreak="0">
+    <w:nsid w:val="0883361A"/>
+    <w:multiLevelType w:val="multilevel"/>
+    <w:tmpl w:val="70DC4746"/>
+    <w:lvl w:ilvl="0">
+      <w:start w:val="1"/>
+      <w:numFmt w:val="bullet"/>
+      <w:lvlText w:val=""/>
+      <w:lvlJc w:val="left"/>
+      <w:pPr>
+        <w:tabs>
+          <w:tab w:val="num" w:pos="720"/>
+        </w:tabs>
+        <w:ind w:left="720" w:hanging="360"/>
+      </w:pPr>
+      <w:rPr>
+        <w:rFonts w:ascii="Symbol" w:hAnsi="Symbol" w:hint="default"/>
+        <w:sz w:val="20"/>
+      </w:rPr>
+    </w:lvl>
+    <w:lvl w:ilvl="1" w:tentative="1">
+      <w:start w:val="1"/>
+      <w:numFmt w:val="bullet"/>
+      <w:lvlText w:val="o"/>
+      <w:lvlJc w:val="left"/>
+      <w:pPr>
+        <w:tabs>
+          <w:tab w:val="num" w:pos="1440"/>
+        </w:tabs>
+        <w:ind w:left="1440" w:hanging="360"/>
+      </w:pPr>
+      <w:rPr>
+        <w:rFonts w:ascii="Courier New" w:hAnsi="Courier New" w:hint="default"/>
+        <w:sz w:val="20"/>
+      </w:rPr>
+    </w:lvl>
+    <w:lvl w:ilvl="2" w:tentative="1">
+      <w:start w:val="1"/>
+      <w:numFmt w:val="bullet"/>
+      <w:lvlText w:val=""/>
+      <w:lvlJc w:val="left"/>
+      <w:pPr>
+        <w:tabs>
+          <w:tab w:val="num" w:pos="2160"/>
+        </w:tabs>
+        <w:ind w:left="2160" w:hanging="360"/>
+      </w:pPr>
+      <w:rPr>
+        <w:rFonts w:ascii="Wingdings" w:hAnsi="Wingdings" w:hint="default"/>
+        <w:sz w:val="20"/>
+      </w:rPr>
+    </w:lvl>
+    <w:lvl w:ilvl="3" w:tentative="1">
+      <w:start w:val="1"/>
+      <w:numFmt w:val="bullet"/>
+      <w:lvlText w:val=""/>
+      <w:lvlJc w:val="left"/>
+      <w:pPr>
+        <w:tabs>
+          <w:tab w:val="num" w:pos="2880"/>
+        </w:tabs>
+        <w:ind w:left="2880" w:hanging="360"/>
+      </w:pPr>
+      <w:rPr>
+        <w:rFonts w:ascii="Wingdings" w:hAnsi="Wingdings" w:hint="default"/>
+        <w:sz w:val="20"/>
+      </w:rPr>
+    </w:lvl>
+    <w:lvl w:ilvl="4" w:tentative="1">
+      <w:start w:val="1"/>
+      <w:numFmt w:val="bullet"/>
+      <w:lvlText w:val=""/>
+      <w:lvlJc w:val="left"/>
+      <w:pPr>
+        <w:tabs>
+          <w:tab w:val="num" w:pos="3600"/>
+        </w:tabs>
+        <w:ind w:left="3600" w:hanging="360"/>
+      </w:pPr>
+      <w:rPr>
+        <w:rFonts w:ascii="Wingdings" w:hAnsi="Wingdings" w:hint="default"/>
+        <w:sz w:val="20"/>
+      </w:rPr>
+    </w:lvl>
+    <w:lvl w:ilvl="5" w:tentative="1">
+      <w:start w:val="1"/>
+      <w:numFmt w:val="bullet"/>
+      <w:lvlText w:val=""/>
+      <w:lvlJc w:val="left"/>
+      <w:pPr>
+        <w:tabs>
+          <w:tab w:val="num" w:pos="4320"/>
+        </w:tabs>
+        <w:ind w:left="4320" w:hanging="360"/>
+      </w:pPr>
+      <w:rPr>
+        <w:rFonts w:ascii="Wingdings" w:hAnsi="Wingdings" w:hint="default"/>
+        <w:sz w:val="20"/>
+      </w:rPr>
+    </w:lvl>
+    <w:lvl w:ilvl="6" w:tentative="1">
+      <w:start w:val="1"/>
+      <w:numFmt w:val="bullet"/>
+      <w:lvlText w:val=""/>
+      <w:lvlJc w:val="left"/>
+      <w:pPr>
+        <w:tabs>
+          <w:tab w:val="num" w:pos="5040"/>
+        </w:tabs>
+        <w:ind w:left="5040" w:hanging="360"/>
+      </w:pPr>
+      <w:rPr>
+        <w:rFonts w:ascii="Wingdings" w:hAnsi="Wingdings" w:hint="default"/>
+        <w:sz w:val="20"/>
+      </w:rPr>
+    </w:lvl>
+    <w:lvl w:ilvl="7" w:tentative="1">
+      <w:start w:val="1"/>
+      <w:numFmt w:val="bullet"/>
+      <w:lvlText w:val=""/>
+      <w:lvlJc w:val="left"/>
+      <w:pPr>
+        <w:tabs>
+          <w:tab w:val="num" w:pos="5760"/>
+        </w:tabs>
+        <w:ind w:left="5760" w:hanging="360"/>
+      </w:pPr>
+      <w:rPr>
+        <w:rFonts w:ascii="Wingdings" w:hAnsi="Wingdings" w:hint="default"/>
+        <w:sz w:val="20"/>
+      </w:rPr>
+    </w:lvl>
+    <w:lvl w:ilvl="8" w:tentative="1">
+      <w:start w:val="1"/>
+      <w:numFmt w:val="bullet"/>
+      <w:lvlText w:val=""/>
+      <w:lvlJc w:val="left"/>
+      <w:pPr>
+        <w:tabs>
+          <w:tab w:val="num" w:pos="6480"/>
+        </w:tabs>
+        <w:ind w:left="6480" w:hanging="360"/>
+      </w:pPr>
+      <w:rPr>
+        <w:rFonts w:ascii="Wingdings" w:hAnsi="Wingdings" w:hint="default"/>
+        <w:sz w:val="20"/>
+      </w:rPr>
+    </w:lvl>
+  </w:abstractNum>
+  <w:abstractNum w:abstractNumId="5" w15:restartNumberingAfterBreak="0">
     <w:nsid w:val="0B0D1E84"/>
     <w:multiLevelType w:val="multilevel"/>
     <w:tmpl w:val="C366CB9A"/>
@@ -7214,7 +8626,7 @@
       </w:rPr>
     </w:lvl>
   </w:abstractNum>
-  <w:abstractNum w:abstractNumId="5" w15:restartNumberingAfterBreak="0">
+  <w:abstractNum w:abstractNumId="6" w15:restartNumberingAfterBreak="0">
     <w:nsid w:val="18E24FC3"/>
     <w:multiLevelType w:val="multilevel"/>
     <w:tmpl w:val="810888D2"/>
@@ -7363,7 +8775,7 @@
       </w:rPr>
     </w:lvl>
   </w:abstractNum>
-  <w:abstractNum w:abstractNumId="6" w15:restartNumberingAfterBreak="0">
+  <w:abstractNum w:abstractNumId="7" w15:restartNumberingAfterBreak="0">
     <w:nsid w:val="1A526397"/>
     <w:multiLevelType w:val="multilevel"/>
     <w:tmpl w:val="ACF857F6"/>
@@ -7512,7 +8924,7 @@
       </w:rPr>
     </w:lvl>
   </w:abstractNum>
-  <w:abstractNum w:abstractNumId="7" w15:restartNumberingAfterBreak="0">
+  <w:abstractNum w:abstractNumId="8" w15:restartNumberingAfterBreak="0">
     <w:nsid w:val="1DC71BA3"/>
     <w:multiLevelType w:val="multilevel"/>
     <w:tmpl w:val="CA8C1B8A"/>
@@ -7625,7 +9037,7 @@
       </w:pPr>
     </w:lvl>
   </w:abstractNum>
-  <w:abstractNum w:abstractNumId="8" w15:restartNumberingAfterBreak="0">
+  <w:abstractNum w:abstractNumId="9" w15:restartNumberingAfterBreak="0">
     <w:nsid w:val="22DB61D8"/>
     <w:multiLevelType w:val="multilevel"/>
     <w:tmpl w:val="D77AF5CA"/>
@@ -7738,7 +9150,156 @@
       </w:pPr>
     </w:lvl>
   </w:abstractNum>
-  <w:abstractNum w:abstractNumId="9" w15:restartNumberingAfterBreak="0">
+  <w:abstractNum w:abstractNumId="10" w15:restartNumberingAfterBreak="0">
+    <w:nsid w:val="29E866F5"/>
+    <w:multiLevelType w:val="multilevel"/>
+    <w:tmpl w:val="42E6D3A0"/>
+    <w:lvl w:ilvl="0">
+      <w:start w:val="1"/>
+      <w:numFmt w:val="bullet"/>
+      <w:lvlText w:val=""/>
+      <w:lvlJc w:val="left"/>
+      <w:pPr>
+        <w:tabs>
+          <w:tab w:val="num" w:pos="720"/>
+        </w:tabs>
+        <w:ind w:left="720" w:hanging="360"/>
+      </w:pPr>
+      <w:rPr>
+        <w:rFonts w:ascii="Symbol" w:hAnsi="Symbol" w:hint="default"/>
+        <w:sz w:val="20"/>
+      </w:rPr>
+    </w:lvl>
+    <w:lvl w:ilvl="1" w:tentative="1">
+      <w:start w:val="1"/>
+      <w:numFmt w:val="bullet"/>
+      <w:lvlText w:val="o"/>
+      <w:lvlJc w:val="left"/>
+      <w:pPr>
+        <w:tabs>
+          <w:tab w:val="num" w:pos="1440"/>
+        </w:tabs>
+        <w:ind w:left="1440" w:hanging="360"/>
+      </w:pPr>
+      <w:rPr>
+        <w:rFonts w:ascii="Courier New" w:hAnsi="Courier New" w:hint="default"/>
+        <w:sz w:val="20"/>
+      </w:rPr>
+    </w:lvl>
+    <w:lvl w:ilvl="2" w:tentative="1">
+      <w:start w:val="1"/>
+      <w:numFmt w:val="bullet"/>
+      <w:lvlText w:val=""/>
+      <w:lvlJc w:val="left"/>
+      <w:pPr>
+        <w:tabs>
+          <w:tab w:val="num" w:pos="2160"/>
+        </w:tabs>
+        <w:ind w:left="2160" w:hanging="360"/>
+      </w:pPr>
+      <w:rPr>
+        <w:rFonts w:ascii="Wingdings" w:hAnsi="Wingdings" w:hint="default"/>
+        <w:sz w:val="20"/>
+      </w:rPr>
+    </w:lvl>
+    <w:lvl w:ilvl="3" w:tentative="1">
+      <w:start w:val="1"/>
+      <w:numFmt w:val="bullet"/>
+      <w:lvlText w:val=""/>
+      <w:lvlJc w:val="left"/>
+      <w:pPr>
+        <w:tabs>
+          <w:tab w:val="num" w:pos="2880"/>
+        </w:tabs>
+        <w:ind w:left="2880" w:hanging="360"/>
+      </w:pPr>
+      <w:rPr>
+        <w:rFonts w:ascii="Wingdings" w:hAnsi="Wingdings" w:hint="default"/>
+        <w:sz w:val="20"/>
+      </w:rPr>
+    </w:lvl>
+    <w:lvl w:ilvl="4" w:tentative="1">
+      <w:start w:val="1"/>
+      <w:numFmt w:val="bullet"/>
+      <w:lvlText w:val=""/>
+      <w:lvlJc w:val="left"/>
+      <w:pPr>
+        <w:tabs>
+          <w:tab w:val="num" w:pos="3600"/>
+        </w:tabs>
+        <w:ind w:left="3600" w:hanging="360"/>
+      </w:pPr>
+      <w:rPr>
+        <w:rFonts w:ascii="Wingdings" w:hAnsi="Wingdings" w:hint="default"/>
+        <w:sz w:val="20"/>
+      </w:rPr>
+    </w:lvl>
+    <w:lvl w:ilvl="5" w:tentative="1">
+      <w:start w:val="1"/>
+      <w:numFmt w:val="bullet"/>
+      <w:lvlText w:val=""/>
+      <w:lvlJc w:val="left"/>
+      <w:pPr>
+        <w:tabs>
+          <w:tab w:val="num" w:pos="4320"/>
+        </w:tabs>
+        <w:ind w:left="4320" w:hanging="360"/>
+      </w:pPr>
+      <w:rPr>
+        <w:rFonts w:ascii="Wingdings" w:hAnsi="Wingdings" w:hint="default"/>
+        <w:sz w:val="20"/>
+      </w:rPr>
+    </w:lvl>
+    <w:lvl w:ilvl="6" w:tentative="1">
+      <w:start w:val="1"/>
+      <w:numFmt w:val="bullet"/>
+      <w:lvlText w:val=""/>
+      <w:lvlJc w:val="left"/>
+      <w:pPr>
+        <w:tabs>
+          <w:tab w:val="num" w:pos="5040"/>
+        </w:tabs>
+        <w:ind w:left="5040" w:hanging="360"/>
+      </w:pPr>
+      <w:rPr>
+        <w:rFonts w:ascii="Wingdings" w:hAnsi="Wingdings" w:hint="default"/>
+        <w:sz w:val="20"/>
+      </w:rPr>
+    </w:lvl>
+    <w:lvl w:ilvl="7" w:tentative="1">
+      <w:start w:val="1"/>
+      <w:numFmt w:val="bullet"/>
+      <w:lvlText w:val=""/>
+      <w:lvlJc w:val="left"/>
+      <w:pPr>
+        <w:tabs>
+          <w:tab w:val="num" w:pos="5760"/>
+        </w:tabs>
+        <w:ind w:left="5760" w:hanging="360"/>
+      </w:pPr>
+      <w:rPr>
+        <w:rFonts w:ascii="Wingdings" w:hAnsi="Wingdings" w:hint="default"/>
+        <w:sz w:val="20"/>
+      </w:rPr>
+    </w:lvl>
+    <w:lvl w:ilvl="8" w:tentative="1">
+      <w:start w:val="1"/>
+      <w:numFmt w:val="bullet"/>
+      <w:lvlText w:val=""/>
+      <w:lvlJc w:val="left"/>
+      <w:pPr>
+        <w:tabs>
+          <w:tab w:val="num" w:pos="6480"/>
+        </w:tabs>
+        <w:ind w:left="6480" w:hanging="360"/>
+      </w:pPr>
+      <w:rPr>
+        <w:rFonts w:ascii="Wingdings" w:hAnsi="Wingdings" w:hint="default"/>
+        <w:sz w:val="20"/>
+      </w:rPr>
+    </w:lvl>
+  </w:abstractNum>
+  <w:abstractNum w:abstractNumId="11" w15:restartNumberingAfterBreak="0">
     <w:nsid w:val="2AD55784"/>
     <w:multiLevelType w:val="multilevel"/>
     <w:tmpl w:val="6D64FCC6"/>
@@ -7887,7 +9448,7 @@
       </w:rPr>
     </w:lvl>
   </w:abstractNum>
-  <w:abstractNum w:abstractNumId="10" w15:restartNumberingAfterBreak="0">
+  <w:abstractNum w:abstractNumId="12" w15:restartNumberingAfterBreak="0">
     <w:nsid w:val="2B8E2D68"/>
     <w:multiLevelType w:val="multilevel"/>
     <w:tmpl w:val="62DCFC16"/>
@@ -8036,7 +9597,7 @@
       </w:rPr>
     </w:lvl>
   </w:abstractNum>
-  <w:abstractNum w:abstractNumId="11" w15:restartNumberingAfterBreak="0">
+  <w:abstractNum w:abstractNumId="13" w15:restartNumberingAfterBreak="0">
     <w:nsid w:val="2D391B75"/>
     <w:multiLevelType w:val="multilevel"/>
     <w:tmpl w:val="FFC0252C"/>
@@ -8185,7 +9746,7 @@
       </w:rPr>
     </w:lvl>
   </w:abstractNum>
-  <w:abstractNum w:abstractNumId="12" w15:restartNumberingAfterBreak="0">
+  <w:abstractNum w:abstractNumId="14" w15:restartNumberingAfterBreak="0">
     <w:nsid w:val="2F337628"/>
     <w:multiLevelType w:val="multilevel"/>
     <w:tmpl w:val="453A507E"/>
@@ -8334,7 +9895,7 @@
       </w:rPr>
     </w:lvl>
   </w:abstractNum>
-  <w:abstractNum w:abstractNumId="13" w15:restartNumberingAfterBreak="0">
+  <w:abstractNum w:abstractNumId="15" w15:restartNumberingAfterBreak="0">
     <w:nsid w:val="307F3F46"/>
     <w:multiLevelType w:val="multilevel"/>
     <w:tmpl w:val="4CD02B92"/>
@@ -8483,7 +10044,7 @@
       </w:rPr>
     </w:lvl>
   </w:abstractNum>
-  <w:abstractNum w:abstractNumId="14" w15:restartNumberingAfterBreak="0">
+  <w:abstractNum w:abstractNumId="16" w15:restartNumberingAfterBreak="0">
     <w:nsid w:val="3F960E41"/>
     <w:multiLevelType w:val="multilevel"/>
     <w:tmpl w:val="294C8DD0"/>
@@ -8632,7 +10193,7 @@
       </w:rPr>
     </w:lvl>
   </w:abstractNum>
-  <w:abstractNum w:abstractNumId="15" w15:restartNumberingAfterBreak="0">
+  <w:abstractNum w:abstractNumId="17" w15:restartNumberingAfterBreak="0">
     <w:nsid w:val="4E1129B4"/>
     <w:multiLevelType w:val="multilevel"/>
     <w:tmpl w:val="25C44C28"/>
@@ -8781,7 +10342,7 @@
       </w:rPr>
     </w:lvl>
   </w:abstractNum>
-  <w:abstractNum w:abstractNumId="16" w15:restartNumberingAfterBreak="0">
+  <w:abstractNum w:abstractNumId="18" w15:restartNumberingAfterBreak="0">
     <w:nsid w:val="4E6C49EC"/>
     <w:multiLevelType w:val="multilevel"/>
     <w:tmpl w:val="6F966304"/>
@@ -8898,7 +10459,7 @@
       </w:pPr>
     </w:lvl>
   </w:abstractNum>
-  <w:abstractNum w:abstractNumId="17" w15:restartNumberingAfterBreak="0">
+  <w:abstractNum w:abstractNumId="19" w15:restartNumberingAfterBreak="0">
     <w:nsid w:val="51764FD9"/>
     <w:multiLevelType w:val="multilevel"/>
     <w:tmpl w:val="08A60508"/>
@@ -9047,7 +10608,7 @@
       </w:rPr>
     </w:lvl>
   </w:abstractNum>
-  <w:abstractNum w:abstractNumId="18" w15:restartNumberingAfterBreak="0">
+  <w:abstractNum w:abstractNumId="20" w15:restartNumberingAfterBreak="0">
     <w:nsid w:val="52571FED"/>
     <w:multiLevelType w:val="multilevel"/>
     <w:tmpl w:val="22BCED12"/>
@@ -9196,7 +10757,7 @@
       </w:rPr>
     </w:lvl>
   </w:abstractNum>
-  <w:abstractNum w:abstractNumId="19" w15:restartNumberingAfterBreak="0">
+  <w:abstractNum w:abstractNumId="21" w15:restartNumberingAfterBreak="0">
     <w:nsid w:val="577D2BDE"/>
     <w:multiLevelType w:val="multilevel"/>
     <w:tmpl w:val="1E7AAA5C"/>
@@ -9345,7 +10906,7 @@
       </w:rPr>
     </w:lvl>
   </w:abstractNum>
-  <w:abstractNum w:abstractNumId="20" w15:restartNumberingAfterBreak="0">
+  <w:abstractNum w:abstractNumId="22" w15:restartNumberingAfterBreak="0">
     <w:nsid w:val="5ACC7AC4"/>
     <w:multiLevelType w:val="multilevel"/>
     <w:tmpl w:val="EF74BBA4"/>
@@ -9494,7 +11055,156 @@
       </w:rPr>
     </w:lvl>
   </w:abstractNum>
-  <w:abstractNum w:abstractNumId="21" w15:restartNumberingAfterBreak="0">
+  <w:abstractNum w:abstractNumId="23" w15:restartNumberingAfterBreak="0">
+    <w:nsid w:val="5B7603A4"/>
+    <w:multiLevelType w:val="multilevel"/>
+    <w:tmpl w:val="96629F4A"/>
+    <w:lvl w:ilvl="0">
+      <w:start w:val="1"/>
+      <w:numFmt w:val="bullet"/>
+      <w:lvlText w:val=""/>
+      <w:lvlJc w:val="left"/>
+      <w:pPr>
+        <w:tabs>
+          <w:tab w:val="num" w:pos="720"/>
+        </w:tabs>
+        <w:ind w:left="720" w:hanging="360"/>
+      </w:pPr>
+      <w:rPr>
+        <w:rFonts w:ascii="Symbol" w:hAnsi="Symbol" w:hint="default"/>
+        <w:sz w:val="20"/>
+      </w:rPr>
+    </w:lvl>
+    <w:lvl w:ilvl="1" w:tentative="1">
+      <w:start w:val="1"/>
+      <w:numFmt w:val="bullet"/>
+      <w:lvlText w:val="o"/>
+      <w:lvlJc w:val="left"/>
+      <w:pPr>
+        <w:tabs>
+          <w:tab w:val="num" w:pos="1440"/>
+        </w:tabs>
+        <w:ind w:left="1440" w:hanging="360"/>
+      </w:pPr>
+      <w:rPr>
+        <w:rFonts w:ascii="Courier New" w:hAnsi="Courier New" w:hint="default"/>
+        <w:sz w:val="20"/>
+      </w:rPr>
+    </w:lvl>
+    <w:lvl w:ilvl="2" w:tentative="1">
+      <w:start w:val="1"/>
+      <w:numFmt w:val="bullet"/>
+      <w:lvlText w:val=""/>
+      <w:lvlJc w:val="left"/>
+      <w:pPr>
+        <w:tabs>
+          <w:tab w:val="num" w:pos="2160"/>
+        </w:tabs>
+        <w:ind w:left="2160" w:hanging="360"/>
+      </w:pPr>
+      <w:rPr>
+        <w:rFonts w:ascii="Wingdings" w:hAnsi="Wingdings" w:hint="default"/>
+        <w:sz w:val="20"/>
+      </w:rPr>
+    </w:lvl>
+    <w:lvl w:ilvl="3" w:tentative="1">
+      <w:start w:val="1"/>
+      <w:numFmt w:val="bullet"/>
+      <w:lvlText w:val=""/>
+      <w:lvlJc w:val="left"/>
+      <w:pPr>
+        <w:tabs>
+          <w:tab w:val="num" w:pos="2880"/>
+        </w:tabs>
+        <w:ind w:left="2880" w:hanging="360"/>
+      </w:pPr>
+      <w:rPr>
+        <w:rFonts w:ascii="Wingdings" w:hAnsi="Wingdings" w:hint="default"/>
+        <w:sz w:val="20"/>
+      </w:rPr>
+    </w:lvl>
+    <w:lvl w:ilvl="4" w:tentative="1">
+      <w:start w:val="1"/>
+      <w:numFmt w:val="bullet"/>
+      <w:lvlText w:val=""/>
+      <w:lvlJc w:val="left"/>
+      <w:pPr>
+        <w:tabs>
+          <w:tab w:val="num" w:pos="3600"/>
+        </w:tabs>
+        <w:ind w:left="3600" w:hanging="360"/>
+      </w:pPr>
+      <w:rPr>
+        <w:rFonts w:ascii="Wingdings" w:hAnsi="Wingdings" w:hint="default"/>
+        <w:sz w:val="20"/>
+      </w:rPr>
+    </w:lvl>
+    <w:lvl w:ilvl="5" w:tentative="1">
+      <w:start w:val="1"/>
+      <w:numFmt w:val="bullet"/>
+      <w:lvlText w:val=""/>
+      <w:lvlJc w:val="left"/>
+      <w:pPr>
+        <w:tabs>
+          <w:tab w:val="num" w:pos="4320"/>
+        </w:tabs>
+        <w:ind w:left="4320" w:hanging="360"/>
+      </w:pPr>
+      <w:rPr>
+        <w:rFonts w:ascii="Wingdings" w:hAnsi="Wingdings" w:hint="default"/>
+        <w:sz w:val="20"/>
+      </w:rPr>
+    </w:lvl>
+    <w:lvl w:ilvl="6" w:tentative="1">
+      <w:start w:val="1"/>
+      <w:numFmt w:val="bullet"/>
+      <w:lvlText w:val=""/>
+      <w:lvlJc w:val="left"/>
+      <w:pPr>
+        <w:tabs>
+          <w:tab w:val="num" w:pos="5040"/>
+        </w:tabs>
+        <w:ind w:left="5040" w:hanging="360"/>
+      </w:pPr>
+      <w:rPr>
+        <w:rFonts w:ascii="Wingdings" w:hAnsi="Wingdings" w:hint="default"/>
+        <w:sz w:val="20"/>
+      </w:rPr>
+    </w:lvl>
+    <w:lvl w:ilvl="7" w:tentative="1">
+      <w:start w:val="1"/>
+      <w:numFmt w:val="bullet"/>
+      <w:lvlText w:val=""/>
+      <w:lvlJc w:val="left"/>
+      <w:pPr>
+        <w:tabs>
+          <w:tab w:val="num" w:pos="5760"/>
+        </w:tabs>
+        <w:ind w:left="5760" w:hanging="360"/>
+      </w:pPr>
+      <w:rPr>
+        <w:rFonts w:ascii="Wingdings" w:hAnsi="Wingdings" w:hint="default"/>
+        <w:sz w:val="20"/>
+      </w:rPr>
+    </w:lvl>
+    <w:lvl w:ilvl="8" w:tentative="1">
+      <w:start w:val="1"/>
+      <w:numFmt w:val="bullet"/>
+      <w:lvlText w:val=""/>
+      <w:lvlJc w:val="left"/>
+      <w:pPr>
+        <w:tabs>
+          <w:tab w:val="num" w:pos="6480"/>
+        </w:tabs>
+        <w:ind w:left="6480" w:hanging="360"/>
+      </w:pPr>
+      <w:rPr>
+        <w:rFonts w:ascii="Wingdings" w:hAnsi="Wingdings" w:hint="default"/>
+        <w:sz w:val="20"/>
+      </w:rPr>
+    </w:lvl>
+  </w:abstractNum>
+  <w:abstractNum w:abstractNumId="24" w15:restartNumberingAfterBreak="0">
     <w:nsid w:val="5E1C2D7A"/>
     <w:multiLevelType w:val="multilevel"/>
     <w:tmpl w:val="B1EC4ECC"/>
@@ -9643,7 +11353,305 @@
       </w:rPr>
     </w:lvl>
   </w:abstractNum>
-  <w:abstractNum w:abstractNumId="22" w15:restartNumberingAfterBreak="0">
+  <w:abstractNum w:abstractNumId="25" w15:restartNumberingAfterBreak="0">
+    <w:nsid w:val="64931ABC"/>
+    <w:multiLevelType w:val="multilevel"/>
+    <w:tmpl w:val="9138A7D8"/>
+    <w:lvl w:ilvl="0">
+      <w:start w:val="1"/>
+      <w:numFmt w:val="bullet"/>
+      <w:lvlText w:val=""/>
+      <w:lvlJc w:val="left"/>
+      <w:pPr>
+        <w:tabs>
+          <w:tab w:val="num" w:pos="720"/>
+        </w:tabs>
+        <w:ind w:left="720" w:hanging="360"/>
+      </w:pPr>
+      <w:rPr>
+        <w:rFonts w:ascii="Symbol" w:hAnsi="Symbol" w:hint="default"/>
+        <w:sz w:val="20"/>
+      </w:rPr>
+    </w:lvl>
+    <w:lvl w:ilvl="1" w:tentative="1">
+      <w:start w:val="1"/>
+      <w:numFmt w:val="bullet"/>
+      <w:lvlText w:val="o"/>
+      <w:lvlJc w:val="left"/>
+      <w:pPr>
+        <w:tabs>
+          <w:tab w:val="num" w:pos="1440"/>
+        </w:tabs>
+        <w:ind w:left="1440" w:hanging="360"/>
+      </w:pPr>
+      <w:rPr>
+        <w:rFonts w:ascii="Courier New" w:hAnsi="Courier New" w:hint="default"/>
+        <w:sz w:val="20"/>
+      </w:rPr>
+    </w:lvl>
+    <w:lvl w:ilvl="2" w:tentative="1">
+      <w:start w:val="1"/>
+      <w:numFmt w:val="bullet"/>
+      <w:lvlText w:val=""/>
+      <w:lvlJc w:val="left"/>
+      <w:pPr>
+        <w:tabs>
+          <w:tab w:val="num" w:pos="2160"/>
+        </w:tabs>
+        <w:ind w:left="2160" w:hanging="360"/>
+      </w:pPr>
+      <w:rPr>
+        <w:rFonts w:ascii="Wingdings" w:hAnsi="Wingdings" w:hint="default"/>
+        <w:sz w:val="20"/>
+      </w:rPr>
+    </w:lvl>
+    <w:lvl w:ilvl="3" w:tentative="1">
+      <w:start w:val="1"/>
+      <w:numFmt w:val="bullet"/>
+      <w:lvlText w:val=""/>
+      <w:lvlJc w:val="left"/>
+      <w:pPr>
+        <w:tabs>
+          <w:tab w:val="num" w:pos="2880"/>
+        </w:tabs>
+        <w:ind w:left="2880" w:hanging="360"/>
+      </w:pPr>
+      <w:rPr>
+        <w:rFonts w:ascii="Wingdings" w:hAnsi="Wingdings" w:hint="default"/>
+        <w:sz w:val="20"/>
+      </w:rPr>
+    </w:lvl>
+    <w:lvl w:ilvl="4" w:tentative="1">
+      <w:start w:val="1"/>
+      <w:numFmt w:val="bullet"/>
+      <w:lvlText w:val=""/>
+      <w:lvlJc w:val="left"/>
+      <w:pPr>
+        <w:tabs>
+          <w:tab w:val="num" w:pos="3600"/>
+        </w:tabs>
+        <w:ind w:left="3600" w:hanging="360"/>
+      </w:pPr>
+      <w:rPr>
+        <w:rFonts w:ascii="Wingdings" w:hAnsi="Wingdings" w:hint="default"/>
+        <w:sz w:val="20"/>
+      </w:rPr>
+    </w:lvl>
+    <w:lvl w:ilvl="5" w:tentative="1">
+      <w:start w:val="1"/>
+      <w:numFmt w:val="bullet"/>
+      <w:lvlText w:val=""/>
+      <w:lvlJc w:val="left"/>
+      <w:pPr>
+        <w:tabs>
+          <w:tab w:val="num" w:pos="4320"/>
+        </w:tabs>
+        <w:ind w:left="4320" w:hanging="360"/>
+      </w:pPr>
+      <w:rPr>
+        <w:rFonts w:ascii="Wingdings" w:hAnsi="Wingdings" w:hint="default"/>
+        <w:sz w:val="20"/>
+      </w:rPr>
+    </w:lvl>
+    <w:lvl w:ilvl="6" w:tentative="1">
+      <w:start w:val="1"/>
+      <w:numFmt w:val="bullet"/>
+      <w:lvlText w:val=""/>
+      <w:lvlJc w:val="left"/>
+      <w:pPr>
+        <w:tabs>
+          <w:tab w:val="num" w:pos="5040"/>
+        </w:tabs>
+        <w:ind w:left="5040" w:hanging="360"/>
+      </w:pPr>
+      <w:rPr>
+        <w:rFonts w:ascii="Wingdings" w:hAnsi="Wingdings" w:hint="default"/>
+        <w:sz w:val="20"/>
+      </w:rPr>
+    </w:lvl>
+    <w:lvl w:ilvl="7" w:tentative="1">
+      <w:start w:val="1"/>
+      <w:numFmt w:val="bullet"/>
+      <w:lvlText w:val=""/>
+      <w:lvlJc w:val="left"/>
+      <w:pPr>
+        <w:tabs>
+          <w:tab w:val="num" w:pos="5760"/>
+        </w:tabs>
+        <w:ind w:left="5760" w:hanging="360"/>
+      </w:pPr>
+      <w:rPr>
+        <w:rFonts w:ascii="Wingdings" w:hAnsi="Wingdings" w:hint="default"/>
+        <w:sz w:val="20"/>
+      </w:rPr>
+    </w:lvl>
+    <w:lvl w:ilvl="8" w:tentative="1">
+      <w:start w:val="1"/>
+      <w:numFmt w:val="bullet"/>
+      <w:lvlText w:val=""/>
+      <w:lvlJc w:val="left"/>
+      <w:pPr>
+        <w:tabs>
+          <w:tab w:val="num" w:pos="6480"/>
+        </w:tabs>
+        <w:ind w:left="6480" w:hanging="360"/>
+      </w:pPr>
+      <w:rPr>
+        <w:rFonts w:ascii="Wingdings" w:hAnsi="Wingdings" w:hint="default"/>
+        <w:sz w:val="20"/>
+      </w:rPr>
+    </w:lvl>
+  </w:abstractNum>
+  <w:abstractNum w:abstractNumId="26" w15:restartNumberingAfterBreak="0">
+    <w:nsid w:val="68CD3E81"/>
+    <w:multiLevelType w:val="multilevel"/>
+    <w:tmpl w:val="55005712"/>
+    <w:lvl w:ilvl="0">
+      <w:start w:val="1"/>
+      <w:numFmt w:val="bullet"/>
+      <w:lvlText w:val=""/>
+      <w:lvlJc w:val="left"/>
+      <w:pPr>
+        <w:tabs>
+          <w:tab w:val="num" w:pos="720"/>
+        </w:tabs>
+        <w:ind w:left="720" w:hanging="360"/>
+      </w:pPr>
+      <w:rPr>
+        <w:rFonts w:ascii="Symbol" w:hAnsi="Symbol" w:hint="default"/>
+        <w:sz w:val="20"/>
+      </w:rPr>
+    </w:lvl>
+    <w:lvl w:ilvl="1" w:tentative="1">
+      <w:start w:val="1"/>
+      <w:numFmt w:val="bullet"/>
+      <w:lvlText w:val="o"/>
+      <w:lvlJc w:val="left"/>
+      <w:pPr>
+        <w:tabs>
+          <w:tab w:val="num" w:pos="1440"/>
+        </w:tabs>
+        <w:ind w:left="1440" w:hanging="360"/>
+      </w:pPr>
+      <w:rPr>
+        <w:rFonts w:ascii="Courier New" w:hAnsi="Courier New" w:hint="default"/>
+        <w:sz w:val="20"/>
+      </w:rPr>
+    </w:lvl>
+    <w:lvl w:ilvl="2" w:tentative="1">
+      <w:start w:val="1"/>
+      <w:numFmt w:val="bullet"/>
+      <w:lvlText w:val=""/>
+      <w:lvlJc w:val="left"/>
+      <w:pPr>
+        <w:tabs>
+          <w:tab w:val="num" w:pos="2160"/>
+        </w:tabs>
+        <w:ind w:left="2160" w:hanging="360"/>
+      </w:pPr>
+      <w:rPr>
+        <w:rFonts w:ascii="Wingdings" w:hAnsi="Wingdings" w:hint="default"/>
+        <w:sz w:val="20"/>
+      </w:rPr>
+    </w:lvl>
+    <w:lvl w:ilvl="3" w:tentative="1">
+      <w:start w:val="1"/>
+      <w:numFmt w:val="bullet"/>
+      <w:lvlText w:val=""/>
+      <w:lvlJc w:val="left"/>
+      <w:pPr>
+        <w:tabs>
+          <w:tab w:val="num" w:pos="2880"/>
+        </w:tabs>
+        <w:ind w:left="2880" w:hanging="360"/>
+      </w:pPr>
+      <w:rPr>
+        <w:rFonts w:ascii="Wingdings" w:hAnsi="Wingdings" w:hint="default"/>
+        <w:sz w:val="20"/>
+      </w:rPr>
+    </w:lvl>
+    <w:lvl w:ilvl="4" w:tentative="1">
+      <w:start w:val="1"/>
+      <w:numFmt w:val="bullet"/>
+      <w:lvlText w:val=""/>
+      <w:lvlJc w:val="left"/>
+      <w:pPr>
+        <w:tabs>
+          <w:tab w:val="num" w:pos="3600"/>
+        </w:tabs>
+        <w:ind w:left="3600" w:hanging="360"/>
+      </w:pPr>
+      <w:rPr>
+        <w:rFonts w:ascii="Wingdings" w:hAnsi="Wingdings" w:hint="default"/>
+        <w:sz w:val="20"/>
+      </w:rPr>
+    </w:lvl>
+    <w:lvl w:ilvl="5" w:tentative="1">
+      <w:start w:val="1"/>
+      <w:numFmt w:val="bullet"/>
+      <w:lvlText w:val=""/>
+      <w:lvlJc w:val="left"/>
+      <w:pPr>
+        <w:tabs>
+          <w:tab w:val="num" w:pos="4320"/>
+        </w:tabs>
+        <w:ind w:left="4320" w:hanging="360"/>
+      </w:pPr>
+      <w:rPr>
+        <w:rFonts w:ascii="Wingdings" w:hAnsi="Wingdings" w:hint="default"/>
+        <w:sz w:val="20"/>
+      </w:rPr>
+    </w:lvl>
+    <w:lvl w:ilvl="6" w:tentative="1">
+      <w:start w:val="1"/>
+      <w:numFmt w:val="bullet"/>
+      <w:lvlText w:val=""/>
+      <w:lvlJc w:val="left"/>
+      <w:pPr>
+        <w:tabs>
+          <w:tab w:val="num" w:pos="5040"/>
+        </w:tabs>
+        <w:ind w:left="5040" w:hanging="360"/>
+      </w:pPr>
+      <w:rPr>
+        <w:rFonts w:ascii="Wingdings" w:hAnsi="Wingdings" w:hint="default"/>
+        <w:sz w:val="20"/>
+      </w:rPr>
+    </w:lvl>
+    <w:lvl w:ilvl="7" w:tentative="1">
+      <w:start w:val="1"/>
+      <w:numFmt w:val="bullet"/>
+      <w:lvlText w:val=""/>
+      <w:lvlJc w:val="left"/>
+      <w:pPr>
+        <w:tabs>
+          <w:tab w:val="num" w:pos="5760"/>
+        </w:tabs>
+        <w:ind w:left="5760" w:hanging="360"/>
+      </w:pPr>
+      <w:rPr>
+        <w:rFonts w:ascii="Wingdings" w:hAnsi="Wingdings" w:hint="default"/>
+        <w:sz w:val="20"/>
+      </w:rPr>
+    </w:lvl>
+    <w:lvl w:ilvl="8" w:tentative="1">
+      <w:start w:val="1"/>
+      <w:numFmt w:val="bullet"/>
+      <w:lvlText w:val=""/>
+      <w:lvlJc w:val="left"/>
+      <w:pPr>
+        <w:tabs>
+          <w:tab w:val="num" w:pos="6480"/>
+        </w:tabs>
+        <w:ind w:left="6480" w:hanging="360"/>
+      </w:pPr>
+      <w:rPr>
+        <w:rFonts w:ascii="Wingdings" w:hAnsi="Wingdings" w:hint="default"/>
+        <w:sz w:val="20"/>
+      </w:rPr>
+    </w:lvl>
+  </w:abstractNum>
+  <w:abstractNum w:abstractNumId="27" w15:restartNumberingAfterBreak="0">
     <w:nsid w:val="72086280"/>
     <w:multiLevelType w:val="multilevel"/>
     <w:tmpl w:val="4DBC79AE"/>
@@ -9756,7 +11764,7 @@
       </w:pPr>
     </w:lvl>
   </w:abstractNum>
-  <w:abstractNum w:abstractNumId="23" w15:restartNumberingAfterBreak="0">
+  <w:abstractNum w:abstractNumId="28" w15:restartNumberingAfterBreak="0">
     <w:nsid w:val="799B103C"/>
     <w:multiLevelType w:val="multilevel"/>
     <w:tmpl w:val="23A613A0"/>
@@ -9905,7 +11913,7 @@
       </w:rPr>
     </w:lvl>
   </w:abstractNum>
-  <w:abstractNum w:abstractNumId="24" w15:restartNumberingAfterBreak="0">
+  <w:abstractNum w:abstractNumId="29" w15:restartNumberingAfterBreak="0">
     <w:nsid w:val="7D5B4DED"/>
     <w:multiLevelType w:val="multilevel"/>
     <w:tmpl w:val="758042DA"/>
@@ -10058,76 +12066,91 @@
     <w:abstractNumId w:val="1"/>
   </w:num>
   <w:num w:numId="2" w16cid:durableId="431315551">
-    <w:abstractNumId w:val="24"/>
+    <w:abstractNumId w:val="29"/>
   </w:num>
   <w:num w:numId="3" w16cid:durableId="1261835197">
-    <w:abstractNumId w:val="10"/>
+    <w:abstractNumId w:val="12"/>
   </w:num>
   <w:num w:numId="4" w16cid:durableId="576020663">
-    <w:abstractNumId w:val="23"/>
+    <w:abstractNumId w:val="28"/>
   </w:num>
   <w:num w:numId="5" w16cid:durableId="2081978374">
-    <w:abstractNumId w:val="20"/>
+    <w:abstractNumId w:val="22"/>
   </w:num>
   <w:num w:numId="6" w16cid:durableId="593511808">
-    <w:abstractNumId w:val="17"/>
+    <w:abstractNumId w:val="19"/>
   </w:num>
   <w:num w:numId="7" w16cid:durableId="2110809009">
     <w:abstractNumId w:val="2"/>
   </w:num>
   <w:num w:numId="8" w16cid:durableId="281230396">
-    <w:abstractNumId w:val="16"/>
+    <w:abstractNumId w:val="18"/>
   </w:num>
   <w:num w:numId="9" w16cid:durableId="1997220382">
-    <w:abstractNumId w:val="15"/>
+    <w:abstractNumId w:val="17"/>
   </w:num>
   <w:num w:numId="10" w16cid:durableId="1922173411">
     <w:abstractNumId w:val="0"/>
   </w:num>
   <w:num w:numId="11" w16cid:durableId="1394237143">
-    <w:abstractNumId w:val="22"/>
+    <w:abstractNumId w:val="27"/>
   </w:num>
   <w:num w:numId="12" w16cid:durableId="1896771950">
-    <w:abstractNumId w:val="8"/>
+    <w:abstractNumId w:val="9"/>
   </w:num>
   <w:num w:numId="13" w16cid:durableId="626354605">
+    <w:abstractNumId w:val="24"/>
+  </w:num>
+  <w:num w:numId="14" w16cid:durableId="616450917">
+    <w:abstractNumId w:val="20"/>
+  </w:num>
+  <w:num w:numId="15" w16cid:durableId="177348957">
+    <w:abstractNumId w:val="7"/>
+  </w:num>
+  <w:num w:numId="16" w16cid:durableId="2005743081">
+    <w:abstractNumId w:val="15"/>
+  </w:num>
+  <w:num w:numId="17" w16cid:durableId="393165718">
     <w:abstractNumId w:val="21"/>
   </w:num>
-  <w:num w:numId="14" w16cid:durableId="616450917">
-    <w:abstractNumId w:val="18"/>
-  </w:num>
-  <w:num w:numId="15" w16cid:durableId="177348957">
-    <w:abstractNumId w:val="6"/>
-  </w:num>
-  <w:num w:numId="16" w16cid:durableId="2005743081">
-    <w:abstractNumId w:val="13"/>
-  </w:num>
-  <w:num w:numId="17" w16cid:durableId="393165718">
-    <w:abstractNumId w:val="19"/>
-  </w:num>
   <w:num w:numId="18" w16cid:durableId="1973709430">
-    <w:abstractNumId w:val="9"/>
+    <w:abstractNumId w:val="11"/>
   </w:num>
   <w:num w:numId="19" w16cid:durableId="946885701">
-    <w:abstractNumId w:val="4"/>
+    <w:abstractNumId w:val="5"/>
   </w:num>
   <w:num w:numId="20" w16cid:durableId="575239028">
-    <w:abstractNumId w:val="5"/>
+    <w:abstractNumId w:val="6"/>
   </w:num>
   <w:num w:numId="21" w16cid:durableId="1161389367">
     <w:abstractNumId w:val="3"/>
   </w:num>
   <w:num w:numId="22" w16cid:durableId="2066175265">
+    <w:abstractNumId w:val="16"/>
+  </w:num>
+  <w:num w:numId="23" w16cid:durableId="977877563">
+    <w:abstractNumId w:val="13"/>
+  </w:num>
+  <w:num w:numId="24" w16cid:durableId="1581522678">
+    <w:abstractNumId w:val="8"/>
+  </w:num>
+  <w:num w:numId="25" w16cid:durableId="1017850321">
     <w:abstractNumId w:val="14"/>
   </w:num>
-  <w:num w:numId="23" w16cid:durableId="977877563">
-    <w:abstractNumId w:val="11"/>
+  <w:num w:numId="26" w16cid:durableId="1455439448">
+    <w:abstractNumId w:val="4"/>
   </w:num>
-  <w:num w:numId="24" w16cid:durableId="1581522678">
-    <w:abstractNumId w:val="7"/>
+  <w:num w:numId="27" w16cid:durableId="1486046634">
+    <w:abstractNumId w:val="25"/>
   </w:num>
-  <w:num w:numId="25" w16cid:durableId="1017850321">
-    <w:abstractNumId w:val="12"/>
+  <w:num w:numId="28" w16cid:durableId="909579133">
+    <w:abstractNumId w:val="23"/>
+  </w:num>
+  <w:num w:numId="29" w16cid:durableId="1635063016">
+    <w:abstractNumId w:val="26"/>
+  </w:num>
+  <w:num w:numId="30" w16cid:durableId="292565673">
+    <w:abstractNumId w:val="10"/>
   </w:num>
 </w:numbering>
 </file>

</xml_diff>